<commit_message>
dip schreiben TIA -1h
</commit_message>
<xml_diff>
--- a/Dokumentation/Diplomarbeit_Template.docx
+++ b/Dokumentation/Diplomarbeit_Template.docx
@@ -2438,6 +2438,291 @@
       </w:r>
     </w:p>
     <w:p>
+      <w:r>
+        <w:rPr>
+          <w:noProof/>
+        </w:rPr>
+        <w:drawing>
+          <wp:inline distT="0" distB="0" distL="0" distR="0" wp14:anchorId="5A322C8E" wp14:editId="315014DF">
+            <wp:extent cx="5567362" cy="2824703"/>
+            <wp:effectExtent l="0" t="0" r="0" b="0"/>
+            <wp:docPr id="1032038831" name="Grafik 4"/>
+            <wp:cNvGraphicFramePr>
+              <a:graphicFrameLocks xmlns:a="http://schemas.openxmlformats.org/drawingml/2006/main" noChangeAspect="1"/>
+            </wp:cNvGraphicFramePr>
+            <a:graphic xmlns:a="http://schemas.openxmlformats.org/drawingml/2006/main">
+              <a:graphicData uri="http://schemas.openxmlformats.org/drawingml/2006/picture">
+                <pic:pic xmlns:pic="http://schemas.openxmlformats.org/drawingml/2006/picture">
+                  <pic:nvPicPr>
+                    <pic:cNvPr id="0" name="Picture 4"/>
+                    <pic:cNvPicPr>
+                      <a:picLocks noChangeAspect="1" noChangeArrowheads="1"/>
+                    </pic:cNvPicPr>
+                  </pic:nvPicPr>
+                  <pic:blipFill rotWithShape="1">
+                    <a:blip r:embed="rId15">
+                      <a:extLst>
+                        <a:ext uri="{28A0092B-C50C-407E-A947-70E740481C1C}">
+                          <a14:useLocalDpi xmlns:a14="http://schemas.microsoft.com/office/drawing/2010/main" val="0"/>
+                        </a:ext>
+                      </a:extLst>
+                    </a:blip>
+                    <a:srcRect l="16621" t="26996" r="44097" b="44590"/>
+                    <a:stretch>
+                      <a:fillRect/>
+                    </a:stretch>
+                  </pic:blipFill>
+                  <pic:spPr bwMode="auto">
+                    <a:xfrm>
+                      <a:off x="0" y="0"/>
+                      <a:ext cx="5576618" cy="2829399"/>
+                    </a:xfrm>
+                    <a:prstGeom prst="rect">
+                      <a:avLst/>
+                    </a:prstGeom>
+                    <a:noFill/>
+                    <a:ln>
+                      <a:noFill/>
+                    </a:ln>
+                    <a:extLst>
+                      <a:ext uri="{53640926-AAD7-44D8-BBD7-CCE9431645EC}">
+                        <a14:shadowObscured xmlns:a14="http://schemas.microsoft.com/office/drawing/2010/main"/>
+                      </a:ext>
+                    </a:extLst>
+                  </pic:spPr>
+                </pic:pic>
+              </a:graphicData>
+            </a:graphic>
+          </wp:inline>
+        </w:drawing>
+      </w:r>
+    </w:p>
+    <w:p>
+      <w:r>
+        <w:t xml:space="preserve">Dies ist der Grobe aufbau um eine Variable Drain und Gate spannung als auch eine messung </w:t>
+      </w:r>
+      <w:r>
+        <w:t>des soruce stromes</w:t>
+      </w:r>
+      <w:r>
+        <w:t xml:space="preserve">. Der I_Sorce fliest gegen ein phantom graund am – port des OPV U1 der OPV versucht diesen strom auszugleichen indem er die ausgagngsspannung am RF solange steigert bis über diesen wiederstand I_Source fliest. CF muss aufgund dieser gegebenheit eine geringe leak current haben um nicht die messung zu beeinflussen, witers begrenst er die frequenz der OPV schaltung, denn bei Tranz impedanz wandlern kann es zum schwingen könnem die die grenzfrequenz </w:t>
+      </w:r>
+      <w:r>
+        <w:lastRenderedPageBreak/>
+        <w:t>zu hoch gewählt wird. Zum schwingen kommt es aufgrund von parasietöten kapazitäten aud der Source seite des MOSFET.</w:t>
+      </w:r>
+    </w:p>
+    <w:p>
+      <w:r>
+        <w:t>Die Verstärkung des TIA lässt sich einfach mit den genannten gegebenheiten berechnen.</w:t>
+      </w:r>
+    </w:p>
+    <w:p>
+      <m:oMathPara>
+        <m:oMath>
+          <m:sSub>
+            <m:sSubPr>
+              <m:ctrlPr>
+                <w:rPr>
+                  <w:rFonts w:ascii="Cambria Math" w:hAnsi="Cambria Math"/>
+                  <w:i/>
+                </w:rPr>
+              </m:ctrlPr>
+            </m:sSubPr>
+            <m:e>
+              <m:r>
+                <w:rPr>
+                  <w:rFonts w:ascii="Cambria Math" w:hAnsi="Cambria Math"/>
+                </w:rPr>
+                <m:t>U</m:t>
+              </m:r>
+            </m:e>
+            <m:sub>
+              <m:r>
+                <w:rPr>
+                  <w:rFonts w:ascii="Cambria Math" w:hAnsi="Cambria Math"/>
+                </w:rPr>
+                <m:t>out</m:t>
+              </m:r>
+            </m:sub>
+          </m:sSub>
+          <m:r>
+            <w:rPr>
+              <w:rFonts w:ascii="Cambria Math" w:hAnsi="Cambria Math"/>
+            </w:rPr>
+            <m:t xml:space="preserve">= </m:t>
+          </m:r>
+          <m:sSub>
+            <m:sSubPr>
+              <m:ctrlPr>
+                <w:rPr>
+                  <w:rFonts w:ascii="Cambria Math" w:hAnsi="Cambria Math"/>
+                  <w:i/>
+                </w:rPr>
+              </m:ctrlPr>
+            </m:sSubPr>
+            <m:e>
+              <m:r>
+                <w:rPr>
+                  <w:rFonts w:ascii="Cambria Math" w:hAnsi="Cambria Math"/>
+                </w:rPr>
+                <m:t>R</m:t>
+              </m:r>
+            </m:e>
+            <m:sub>
+              <m:r>
+                <w:rPr>
+                  <w:rFonts w:ascii="Cambria Math" w:hAnsi="Cambria Math"/>
+                </w:rPr>
+                <m:t>F</m:t>
+              </m:r>
+            </m:sub>
+          </m:sSub>
+          <m:r>
+            <w:rPr>
+              <w:rFonts w:ascii="Cambria Math" w:hAnsi="Cambria Math"/>
+            </w:rPr>
+            <m:t>*</m:t>
+          </m:r>
+          <m:sSub>
+            <m:sSubPr>
+              <m:ctrlPr>
+                <w:rPr>
+                  <w:rFonts w:ascii="Cambria Math" w:hAnsi="Cambria Math"/>
+                  <w:i/>
+                </w:rPr>
+              </m:ctrlPr>
+            </m:sSubPr>
+            <m:e>
+              <m:r>
+                <w:rPr>
+                  <w:rFonts w:ascii="Cambria Math" w:hAnsi="Cambria Math"/>
+                </w:rPr>
+                <m:t>I</m:t>
+              </m:r>
+            </m:e>
+            <m:sub>
+              <m:r>
+                <w:rPr>
+                  <w:rFonts w:ascii="Cambria Math" w:hAnsi="Cambria Math"/>
+                </w:rPr>
+                <m:t>Source</m:t>
+              </m:r>
+            </m:sub>
+          </m:sSub>
+          <m:r>
+            <w:rPr>
+              <w:rFonts w:ascii="Cambria Math" w:hAnsi="Cambria Math"/>
+            </w:rPr>
+            <m:t>→</m:t>
+          </m:r>
+          <m:f>
+            <m:fPr>
+              <m:ctrlPr>
+                <w:rPr>
+                  <w:rFonts w:ascii="Cambria Math" w:hAnsi="Cambria Math"/>
+                  <w:i/>
+                </w:rPr>
+              </m:ctrlPr>
+            </m:fPr>
+            <m:num>
+              <m:sSub>
+                <m:sSubPr>
+                  <m:ctrlPr>
+                    <w:rPr>
+                      <w:rFonts w:ascii="Cambria Math" w:hAnsi="Cambria Math"/>
+                      <w:i/>
+                    </w:rPr>
+                  </m:ctrlPr>
+                </m:sSubPr>
+                <m:e>
+                  <m:r>
+                    <w:rPr>
+                      <w:rFonts w:ascii="Cambria Math" w:hAnsi="Cambria Math"/>
+                    </w:rPr>
+                    <m:t>U</m:t>
+                  </m:r>
+                </m:e>
+                <m:sub>
+                  <m:r>
+                    <w:rPr>
+                      <w:rFonts w:ascii="Cambria Math" w:hAnsi="Cambria Math"/>
+                    </w:rPr>
+                    <m:t>out</m:t>
+                  </m:r>
+                </m:sub>
+              </m:sSub>
+            </m:num>
+            <m:den>
+              <m:sSub>
+                <m:sSubPr>
+                  <m:ctrlPr>
+                    <w:rPr>
+                      <w:rFonts w:ascii="Cambria Math" w:hAnsi="Cambria Math"/>
+                      <w:i/>
+                    </w:rPr>
+                  </m:ctrlPr>
+                </m:sSubPr>
+                <m:e>
+                  <m:r>
+                    <w:rPr>
+                      <w:rFonts w:ascii="Cambria Math" w:hAnsi="Cambria Math"/>
+                    </w:rPr>
+                    <m:t>I</m:t>
+                  </m:r>
+                </m:e>
+                <m:sub>
+                  <m:r>
+                    <w:rPr>
+                      <w:rFonts w:ascii="Cambria Math" w:hAnsi="Cambria Math"/>
+                    </w:rPr>
+                    <m:t>Source</m:t>
+                  </m:r>
+                </m:sub>
+              </m:sSub>
+            </m:den>
+          </m:f>
+          <m:r>
+            <w:rPr>
+              <w:rFonts w:ascii="Cambria Math" w:hAnsi="Cambria Math"/>
+            </w:rPr>
+            <m:t>=</m:t>
+          </m:r>
+          <m:sSub>
+            <m:sSubPr>
+              <m:ctrlPr>
+                <w:rPr>
+                  <w:rFonts w:ascii="Cambria Math" w:hAnsi="Cambria Math"/>
+                  <w:i/>
+                </w:rPr>
+              </m:ctrlPr>
+            </m:sSubPr>
+            <m:e>
+              <m:r>
+                <w:rPr>
+                  <w:rFonts w:ascii="Cambria Math" w:hAnsi="Cambria Math"/>
+                </w:rPr>
+                <m:t>R</m:t>
+              </m:r>
+            </m:e>
+            <m:sub>
+              <m:r>
+                <w:rPr>
+                  <w:rFonts w:ascii="Cambria Math" w:hAnsi="Cambria Math"/>
+                </w:rPr>
+                <m:t>F</m:t>
+              </m:r>
+            </m:sub>
+          </m:sSub>
+        </m:oMath>
+      </m:oMathPara>
+    </w:p>
+    <w:p>
+      <w:r>
+        <w:t>Allerdings ist diese schaltung inverteirend, das bedeutet um von einem ADC verarbeitet zu werden sollte ein wieterer invertierender OPV verwendet werden um einen Positiven zusammenhang zwischen Ausgangsspannung und eingangsstrom ensteht. Der nachgeschaltener OPV sollte auch eine bereichs anpassung vornehmen um den eingangsspannungsbereich des ADC zu berücksichtigen.</w:t>
+      </w:r>
+    </w:p>
+    <w:p>
       <w:pPr>
         <w:pStyle w:val="berschrift3"/>
       </w:pPr>
@@ -2445,6 +2730,7 @@
         <w:t>Grenzfrequenz</w:t>
       </w:r>
     </w:p>
+    <w:p/>
     <w:p>
       <w:pPr>
         <w:pStyle w:val="berschrift3"/>
@@ -2700,34 +2986,1195 @@
         </m:oMath>
       </m:oMathPara>
     </w:p>
-    <w:p>
-      <w:pPr>
-        <w:pStyle w:val="berschrift2"/>
-        <w:rPr>
-          <w:rFonts w:eastAsia="TimesNewRomanPSMT" w:cs="TimesNewRomanPSMT"/>
-          <w:b w:val="0"/>
-          <w:sz w:val="26"/>
-          <w:szCs w:val="26"/>
-        </w:rPr>
-      </w:pPr>
-      <w:bookmarkStart w:id="0" w:name="_Toc524250390"/>
-      <w:r>
-        <w:rPr>
-          <w:rFonts w:eastAsia="TimesNewRomanPSMT" w:cs="TimesNewRomanPSMT"/>
-          <w:b w:val="0"/>
-          <w:sz w:val="26"/>
-          <w:szCs w:val="26"/>
-        </w:rPr>
-        <w:t>Messschaltung</w:t>
+    <w:p/>
+    <w:tbl>
+      <w:tblPr>
+        <w:tblW w:w="6226" w:type="dxa"/>
+        <w:jc w:val="center"/>
+        <w:tblCellMar>
+          <w:left w:w="70" w:type="dxa"/>
+          <w:right w:w="70" w:type="dxa"/>
+        </w:tblCellMar>
+        <w:tblLook w:val="04A0" w:firstRow="1" w:lastRow="0" w:firstColumn="1" w:lastColumn="0" w:noHBand="0" w:noVBand="1"/>
+      </w:tblPr>
+      <w:tblGrid>
+        <w:gridCol w:w="1786"/>
+        <w:gridCol w:w="2220"/>
+        <w:gridCol w:w="2220"/>
+      </w:tblGrid>
+      <w:tr>
+        <w:trPr>
+          <w:trHeight w:val="288"/>
+          <w:jc w:val="center"/>
+        </w:trPr>
+        <w:tc>
+          <w:tcPr>
+            <w:tcW w:w="1786" w:type="dxa"/>
+            <w:tcBorders>
+              <w:top w:val="single" w:sz="8" w:space="0" w:color="auto"/>
+              <w:left w:val="single" w:sz="8" w:space="0" w:color="auto"/>
+              <w:bottom w:val="nil"/>
+              <w:right w:val="nil"/>
+            </w:tcBorders>
+            <w:noWrap/>
+            <w:vAlign w:val="bottom"/>
+            <w:hideMark/>
+          </w:tcPr>
+          <w:p>
+            <w:pPr>
+              <w:suppressAutoHyphens w:val="0"/>
+              <w:spacing w:line="240" w:lineRule="auto"/>
+              <w:rPr>
+                <w:rFonts w:ascii="Aptos Narrow" w:hAnsi="Aptos Narrow"/>
+                <w:color w:val="000000"/>
+                <w:sz w:val="22"/>
+                <w:szCs w:val="22"/>
+                <w:lang w:val="de-AT" w:eastAsia="de-AT"/>
+              </w:rPr>
+            </w:pPr>
+            <w:r>
+              <w:rPr>
+                <w:rFonts w:ascii="Aptos Narrow" w:hAnsi="Aptos Narrow"/>
+                <w:color w:val="000000"/>
+                <w:sz w:val="22"/>
+                <w:szCs w:val="22"/>
+                <w:lang w:val="de-AT" w:eastAsia="de-AT"/>
+              </w:rPr>
+              <w:t>Temperature in K</w:t>
+            </w:r>
+          </w:p>
+        </w:tc>
+        <w:tc>
+          <w:tcPr>
+            <w:tcW w:w="2220" w:type="dxa"/>
+            <w:tcBorders>
+              <w:top w:val="single" w:sz="8" w:space="0" w:color="auto"/>
+              <w:left w:val="nil"/>
+              <w:bottom w:val="nil"/>
+              <w:right w:val="nil"/>
+            </w:tcBorders>
+            <w:noWrap/>
+            <w:vAlign w:val="bottom"/>
+            <w:hideMark/>
+          </w:tcPr>
+          <w:p>
+            <w:pPr>
+              <w:suppressAutoHyphens w:val="0"/>
+              <w:spacing w:line="240" w:lineRule="auto"/>
+              <w:jc w:val="right"/>
+              <w:rPr>
+                <w:rFonts w:ascii="Aptos Narrow" w:hAnsi="Aptos Narrow"/>
+                <w:color w:val="000000"/>
+                <w:sz w:val="22"/>
+                <w:szCs w:val="22"/>
+                <w:lang w:val="de-AT" w:eastAsia="de-AT"/>
+              </w:rPr>
+            </w:pPr>
+            <w:r>
+              <w:rPr>
+                <w:rFonts w:ascii="Aptos Narrow" w:hAnsi="Aptos Narrow"/>
+                <w:color w:val="000000"/>
+                <w:sz w:val="22"/>
+                <w:szCs w:val="22"/>
+                <w:lang w:val="de-AT" w:eastAsia="de-AT"/>
+              </w:rPr>
+              <w:t>298,15</w:t>
+            </w:r>
+          </w:p>
+        </w:tc>
+        <w:tc>
+          <w:tcPr>
+            <w:tcW w:w="2220" w:type="dxa"/>
+            <w:tcBorders>
+              <w:top w:val="single" w:sz="8" w:space="0" w:color="auto"/>
+              <w:left w:val="nil"/>
+              <w:bottom w:val="nil"/>
+              <w:right w:val="single" w:sz="8" w:space="0" w:color="auto"/>
+            </w:tcBorders>
+            <w:noWrap/>
+            <w:vAlign w:val="bottom"/>
+            <w:hideMark/>
+          </w:tcPr>
+          <w:p>
+            <w:pPr>
+              <w:suppressAutoHyphens w:val="0"/>
+              <w:spacing w:line="240" w:lineRule="auto"/>
+              <w:rPr>
+                <w:rFonts w:ascii="Aptos Narrow" w:hAnsi="Aptos Narrow"/>
+                <w:color w:val="000000"/>
+                <w:sz w:val="22"/>
+                <w:szCs w:val="22"/>
+                <w:lang w:val="de-AT" w:eastAsia="de-AT"/>
+              </w:rPr>
+            </w:pPr>
+            <w:r>
+              <w:rPr>
+                <w:rFonts w:ascii="Aptos Narrow" w:hAnsi="Aptos Narrow"/>
+                <w:color w:val="000000"/>
+                <w:sz w:val="22"/>
+                <w:szCs w:val="22"/>
+                <w:lang w:val="de-AT" w:eastAsia="de-AT"/>
+              </w:rPr>
+              <w:t> </w:t>
+            </w:r>
+          </w:p>
+        </w:tc>
+      </w:tr>
+      <w:tr>
+        <w:trPr>
+          <w:trHeight w:val="300"/>
+          <w:jc w:val="center"/>
+        </w:trPr>
+        <w:tc>
+          <w:tcPr>
+            <w:tcW w:w="1786" w:type="dxa"/>
+            <w:tcBorders>
+              <w:top w:val="nil"/>
+              <w:left w:val="single" w:sz="8" w:space="0" w:color="auto"/>
+              <w:bottom w:val="nil"/>
+              <w:right w:val="nil"/>
+            </w:tcBorders>
+            <w:noWrap/>
+            <w:vAlign w:val="bottom"/>
+            <w:hideMark/>
+          </w:tcPr>
+          <w:p>
+            <w:pPr>
+              <w:suppressAutoHyphens w:val="0"/>
+              <w:spacing w:line="240" w:lineRule="auto"/>
+              <w:rPr>
+                <w:rFonts w:cs="Arial"/>
+                <w:color w:val="000000"/>
+                <w:lang w:val="de-AT" w:eastAsia="de-AT"/>
+              </w:rPr>
+            </w:pPr>
+            <w:r>
+              <w:rPr>
+                <w:rFonts w:cs="Arial"/>
+                <w:color w:val="000000"/>
+                <w:lang w:eastAsia="de-AT"/>
+              </w:rPr>
+              <w:t xml:space="preserve">Bolzmankonstante </w:t>
+            </w:r>
+          </w:p>
+        </w:tc>
+        <w:tc>
+          <w:tcPr>
+            <w:tcW w:w="2220" w:type="dxa"/>
+            <w:tcBorders>
+              <w:top w:val="nil"/>
+              <w:left w:val="nil"/>
+              <w:bottom w:val="nil"/>
+              <w:right w:val="nil"/>
+            </w:tcBorders>
+            <w:noWrap/>
+            <w:vAlign w:val="bottom"/>
+            <w:hideMark/>
+          </w:tcPr>
+          <w:p>
+            <w:pPr>
+              <w:suppressAutoHyphens w:val="0"/>
+              <w:spacing w:line="240" w:lineRule="auto"/>
+              <w:jc w:val="right"/>
+              <w:rPr>
+                <w:rFonts w:cs="Arial"/>
+                <w:color w:val="000000"/>
+                <w:lang w:val="de-AT" w:eastAsia="de-AT"/>
+              </w:rPr>
+            </w:pPr>
+            <w:r>
+              <w:rPr>
+                <w:rFonts w:cs="Arial"/>
+                <w:color w:val="000000"/>
+                <w:lang w:eastAsia="de-AT"/>
+              </w:rPr>
+              <w:t>1,38065E-23</w:t>
+            </w:r>
+          </w:p>
+        </w:tc>
+        <w:tc>
+          <w:tcPr>
+            <w:tcW w:w="2220" w:type="dxa"/>
+            <w:tcBorders>
+              <w:top w:val="nil"/>
+              <w:left w:val="nil"/>
+              <w:bottom w:val="nil"/>
+              <w:right w:val="single" w:sz="8" w:space="0" w:color="auto"/>
+            </w:tcBorders>
+            <w:noWrap/>
+            <w:vAlign w:val="bottom"/>
+            <w:hideMark/>
+          </w:tcPr>
+          <w:p>
+            <w:pPr>
+              <w:suppressAutoHyphens w:val="0"/>
+              <w:spacing w:line="240" w:lineRule="auto"/>
+              <w:rPr>
+                <w:rFonts w:ascii="Aptos Narrow" w:hAnsi="Aptos Narrow"/>
+                <w:color w:val="000000"/>
+                <w:sz w:val="22"/>
+                <w:szCs w:val="22"/>
+                <w:lang w:val="de-AT" w:eastAsia="de-AT"/>
+              </w:rPr>
+            </w:pPr>
+            <w:r>
+              <w:rPr>
+                <w:rFonts w:ascii="Aptos Narrow" w:hAnsi="Aptos Narrow"/>
+                <w:color w:val="000000"/>
+                <w:sz w:val="22"/>
+                <w:szCs w:val="22"/>
+                <w:lang w:val="de-AT" w:eastAsia="de-AT"/>
+              </w:rPr>
+              <w:t> </w:t>
+            </w:r>
+          </w:p>
+        </w:tc>
+      </w:tr>
+      <w:tr>
+        <w:trPr>
+          <w:trHeight w:val="288"/>
+          <w:jc w:val="center"/>
+        </w:trPr>
+        <w:tc>
+          <w:tcPr>
+            <w:tcW w:w="1786" w:type="dxa"/>
+            <w:tcBorders>
+              <w:top w:val="single" w:sz="8" w:space="0" w:color="auto"/>
+              <w:left w:val="single" w:sz="8" w:space="0" w:color="auto"/>
+              <w:bottom w:val="nil"/>
+              <w:right w:val="single" w:sz="4" w:space="0" w:color="auto"/>
+            </w:tcBorders>
+            <w:noWrap/>
+            <w:vAlign w:val="bottom"/>
+            <w:hideMark/>
+          </w:tcPr>
+          <w:p>
+            <w:pPr>
+              <w:suppressAutoHyphens w:val="0"/>
+              <w:spacing w:line="240" w:lineRule="auto"/>
+              <w:rPr>
+                <w:rFonts w:ascii="Aptos Narrow" w:hAnsi="Aptos Narrow"/>
+                <w:color w:val="000000"/>
+                <w:sz w:val="22"/>
+                <w:szCs w:val="22"/>
+                <w:lang w:val="de-AT" w:eastAsia="de-AT"/>
+              </w:rPr>
+            </w:pPr>
+            <w:r>
+              <w:rPr>
+                <w:rFonts w:ascii="Aptos Narrow" w:hAnsi="Aptos Narrow"/>
+                <w:color w:val="000000"/>
+                <w:sz w:val="22"/>
+                <w:szCs w:val="22"/>
+                <w:lang w:val="de-AT" w:eastAsia="de-AT"/>
+              </w:rPr>
+              <w:t>Resistor in Meg</w:t>
+            </w:r>
+          </w:p>
+        </w:tc>
+        <w:tc>
+          <w:tcPr>
+            <w:tcW w:w="2220" w:type="dxa"/>
+            <w:tcBorders>
+              <w:top w:val="single" w:sz="8" w:space="0" w:color="auto"/>
+              <w:left w:val="nil"/>
+              <w:bottom w:val="nil"/>
+              <w:right w:val="single" w:sz="4" w:space="0" w:color="auto"/>
+            </w:tcBorders>
+            <w:noWrap/>
+            <w:vAlign w:val="bottom"/>
+            <w:hideMark/>
+          </w:tcPr>
+          <w:p>
+            <w:pPr>
+              <w:suppressAutoHyphens w:val="0"/>
+              <w:spacing w:line="240" w:lineRule="auto"/>
+              <w:rPr>
+                <w:rFonts w:ascii="Aptos Narrow" w:hAnsi="Aptos Narrow"/>
+                <w:color w:val="000000"/>
+                <w:sz w:val="22"/>
+                <w:szCs w:val="22"/>
+                <w:lang w:val="de-AT" w:eastAsia="de-AT"/>
+              </w:rPr>
+            </w:pPr>
+            <w:r>
+              <w:rPr>
+                <w:rFonts w:ascii="Aptos Narrow" w:hAnsi="Aptos Narrow"/>
+                <w:color w:val="000000"/>
+                <w:sz w:val="22"/>
+                <w:szCs w:val="22"/>
+                <w:lang w:val="de-AT" w:eastAsia="de-AT"/>
+              </w:rPr>
+              <w:t xml:space="preserve">Thermisches Spannungs </w:t>
+            </w:r>
+          </w:p>
+        </w:tc>
+        <w:tc>
+          <w:tcPr>
+            <w:tcW w:w="2220" w:type="dxa"/>
+            <w:tcBorders>
+              <w:top w:val="single" w:sz="8" w:space="0" w:color="auto"/>
+              <w:left w:val="nil"/>
+              <w:bottom w:val="nil"/>
+              <w:right w:val="single" w:sz="8" w:space="0" w:color="auto"/>
+            </w:tcBorders>
+            <w:noWrap/>
+            <w:vAlign w:val="bottom"/>
+            <w:hideMark/>
+          </w:tcPr>
+          <w:p>
+            <w:pPr>
+              <w:suppressAutoHyphens w:val="0"/>
+              <w:spacing w:line="240" w:lineRule="auto"/>
+              <w:rPr>
+                <w:rFonts w:ascii="Aptos Narrow" w:hAnsi="Aptos Narrow"/>
+                <w:color w:val="000000"/>
+                <w:sz w:val="22"/>
+                <w:szCs w:val="22"/>
+                <w:lang w:val="de-AT" w:eastAsia="de-AT"/>
+              </w:rPr>
+            </w:pPr>
+            <w:r>
+              <w:rPr>
+                <w:rFonts w:ascii="Aptos Narrow" w:hAnsi="Aptos Narrow"/>
+                <w:color w:val="000000"/>
+                <w:sz w:val="22"/>
+                <w:szCs w:val="22"/>
+                <w:lang w:val="de-AT" w:eastAsia="de-AT"/>
+              </w:rPr>
+              <w:t xml:space="preserve">Thermisches Strom </w:t>
+            </w:r>
+          </w:p>
+        </w:tc>
+      </w:tr>
+      <w:tr>
+        <w:trPr>
+          <w:trHeight w:val="300"/>
+          <w:jc w:val="center"/>
+        </w:trPr>
+        <w:tc>
+          <w:tcPr>
+            <w:tcW w:w="1786" w:type="dxa"/>
+            <w:tcBorders>
+              <w:top w:val="nil"/>
+              <w:left w:val="single" w:sz="8" w:space="0" w:color="auto"/>
+              <w:bottom w:val="single" w:sz="8" w:space="0" w:color="auto"/>
+              <w:right w:val="single" w:sz="4" w:space="0" w:color="auto"/>
+            </w:tcBorders>
+            <w:noWrap/>
+            <w:vAlign w:val="bottom"/>
+            <w:hideMark/>
+          </w:tcPr>
+          <w:p>
+            <w:pPr>
+              <w:suppressAutoHyphens w:val="0"/>
+              <w:spacing w:line="240" w:lineRule="auto"/>
+              <w:rPr>
+                <w:rFonts w:ascii="Aptos Narrow" w:hAnsi="Aptos Narrow"/>
+                <w:color w:val="000000"/>
+                <w:sz w:val="22"/>
+                <w:szCs w:val="22"/>
+                <w:lang w:val="de-AT" w:eastAsia="de-AT"/>
+              </w:rPr>
+            </w:pPr>
+            <w:r>
+              <w:rPr>
+                <w:rFonts w:ascii="Aptos Narrow" w:hAnsi="Aptos Narrow"/>
+                <w:color w:val="000000"/>
+                <w:sz w:val="22"/>
+                <w:szCs w:val="22"/>
+                <w:lang w:val="de-AT" w:eastAsia="de-AT"/>
+              </w:rPr>
+              <w:t> </w:t>
+            </w:r>
+          </w:p>
+        </w:tc>
+        <w:tc>
+          <w:tcPr>
+            <w:tcW w:w="2220" w:type="dxa"/>
+            <w:tcBorders>
+              <w:top w:val="nil"/>
+              <w:left w:val="nil"/>
+              <w:bottom w:val="single" w:sz="8" w:space="0" w:color="auto"/>
+              <w:right w:val="single" w:sz="4" w:space="0" w:color="auto"/>
+            </w:tcBorders>
+            <w:noWrap/>
+            <w:vAlign w:val="bottom"/>
+            <w:hideMark/>
+          </w:tcPr>
+          <w:p>
+            <w:pPr>
+              <w:suppressAutoHyphens w:val="0"/>
+              <w:spacing w:line="240" w:lineRule="auto"/>
+              <w:rPr>
+                <w:rFonts w:ascii="Aptos Narrow" w:hAnsi="Aptos Narrow"/>
+                <w:color w:val="000000"/>
+                <w:sz w:val="22"/>
+                <w:szCs w:val="22"/>
+                <w:lang w:val="de-AT" w:eastAsia="de-AT"/>
+              </w:rPr>
+            </w:pPr>
+            <w:r>
+              <w:rPr>
+                <w:rFonts w:ascii="Aptos Narrow" w:hAnsi="Aptos Narrow"/>
+                <w:color w:val="000000"/>
+                <w:sz w:val="22"/>
+                <w:szCs w:val="22"/>
+                <w:lang w:val="de-AT" w:eastAsia="de-AT"/>
+              </w:rPr>
+              <w:t>Rauschen in nV/√Hz</w:t>
+            </w:r>
+          </w:p>
+        </w:tc>
+        <w:tc>
+          <w:tcPr>
+            <w:tcW w:w="2220" w:type="dxa"/>
+            <w:tcBorders>
+              <w:top w:val="nil"/>
+              <w:left w:val="nil"/>
+              <w:bottom w:val="single" w:sz="8" w:space="0" w:color="auto"/>
+              <w:right w:val="single" w:sz="8" w:space="0" w:color="auto"/>
+            </w:tcBorders>
+            <w:noWrap/>
+            <w:vAlign w:val="bottom"/>
+            <w:hideMark/>
+          </w:tcPr>
+          <w:p>
+            <w:pPr>
+              <w:suppressAutoHyphens w:val="0"/>
+              <w:spacing w:line="240" w:lineRule="auto"/>
+              <w:rPr>
+                <w:rFonts w:ascii="Aptos Narrow" w:hAnsi="Aptos Narrow"/>
+                <w:color w:val="000000"/>
+                <w:sz w:val="22"/>
+                <w:szCs w:val="22"/>
+                <w:lang w:val="de-AT" w:eastAsia="de-AT"/>
+              </w:rPr>
+            </w:pPr>
+            <w:r>
+              <w:rPr>
+                <w:rFonts w:ascii="Aptos Narrow" w:hAnsi="Aptos Narrow"/>
+                <w:color w:val="000000"/>
+                <w:sz w:val="22"/>
+                <w:szCs w:val="22"/>
+                <w:lang w:val="de-AT" w:eastAsia="de-AT"/>
+              </w:rPr>
+              <w:t>Rauschen in fA/√Hz</w:t>
+            </w:r>
+          </w:p>
+        </w:tc>
+      </w:tr>
+      <w:tr>
+        <w:trPr>
+          <w:trHeight w:val="288"/>
+          <w:jc w:val="center"/>
+        </w:trPr>
+        <w:tc>
+          <w:tcPr>
+            <w:tcW w:w="1786" w:type="dxa"/>
+            <w:tcBorders>
+              <w:top w:val="nil"/>
+              <w:left w:val="single" w:sz="8" w:space="0" w:color="auto"/>
+              <w:bottom w:val="nil"/>
+              <w:right w:val="single" w:sz="4" w:space="0" w:color="auto"/>
+            </w:tcBorders>
+            <w:noWrap/>
+            <w:vAlign w:val="bottom"/>
+            <w:hideMark/>
+          </w:tcPr>
+          <w:p>
+            <w:pPr>
+              <w:suppressAutoHyphens w:val="0"/>
+              <w:spacing w:line="240" w:lineRule="auto"/>
+              <w:jc w:val="center"/>
+              <w:rPr>
+                <w:rFonts w:ascii="Aptos Narrow" w:hAnsi="Aptos Narrow"/>
+                <w:color w:val="000000"/>
+                <w:sz w:val="22"/>
+                <w:szCs w:val="22"/>
+                <w:lang w:val="de-AT" w:eastAsia="de-AT"/>
+              </w:rPr>
+            </w:pPr>
+            <w:r>
+              <w:rPr>
+                <w:rFonts w:ascii="Aptos Narrow" w:hAnsi="Aptos Narrow"/>
+                <w:color w:val="000000"/>
+                <w:sz w:val="22"/>
+                <w:szCs w:val="22"/>
+                <w:lang w:val="de-AT" w:eastAsia="de-AT"/>
+              </w:rPr>
+              <w:t>0,1</w:t>
+            </w:r>
+          </w:p>
+        </w:tc>
+        <w:tc>
+          <w:tcPr>
+            <w:tcW w:w="2220" w:type="dxa"/>
+            <w:tcBorders>
+              <w:top w:val="nil"/>
+              <w:left w:val="nil"/>
+              <w:bottom w:val="nil"/>
+              <w:right w:val="single" w:sz="4" w:space="0" w:color="auto"/>
+            </w:tcBorders>
+            <w:noWrap/>
+            <w:vAlign w:val="bottom"/>
+            <w:hideMark/>
+          </w:tcPr>
+          <w:p>
+            <w:pPr>
+              <w:suppressAutoHyphens w:val="0"/>
+              <w:spacing w:line="240" w:lineRule="auto"/>
+              <w:jc w:val="center"/>
+              <w:rPr>
+                <w:rFonts w:ascii="Aptos Narrow" w:hAnsi="Aptos Narrow"/>
+                <w:color w:val="000000"/>
+                <w:sz w:val="22"/>
+                <w:szCs w:val="22"/>
+                <w:lang w:val="de-AT" w:eastAsia="de-AT"/>
+              </w:rPr>
+            </w:pPr>
+            <w:r>
+              <w:rPr>
+                <w:rFonts w:ascii="Aptos Narrow" w:hAnsi="Aptos Narrow"/>
+                <w:color w:val="000000"/>
+                <w:sz w:val="22"/>
+                <w:szCs w:val="22"/>
+                <w:lang w:val="de-AT" w:eastAsia="de-AT"/>
+              </w:rPr>
+              <w:t>40,578</w:t>
+            </w:r>
+          </w:p>
+        </w:tc>
+        <w:tc>
+          <w:tcPr>
+            <w:tcW w:w="2220" w:type="dxa"/>
+            <w:tcBorders>
+              <w:top w:val="nil"/>
+              <w:left w:val="nil"/>
+              <w:bottom w:val="nil"/>
+              <w:right w:val="single" w:sz="8" w:space="0" w:color="auto"/>
+            </w:tcBorders>
+            <w:noWrap/>
+            <w:vAlign w:val="bottom"/>
+            <w:hideMark/>
+          </w:tcPr>
+          <w:p>
+            <w:pPr>
+              <w:suppressAutoHyphens w:val="0"/>
+              <w:spacing w:line="240" w:lineRule="auto"/>
+              <w:jc w:val="center"/>
+              <w:rPr>
+                <w:rFonts w:ascii="Aptos Narrow" w:hAnsi="Aptos Narrow"/>
+                <w:color w:val="000000"/>
+                <w:sz w:val="22"/>
+                <w:szCs w:val="22"/>
+                <w:lang w:val="de-AT" w:eastAsia="de-AT"/>
+              </w:rPr>
+            </w:pPr>
+            <w:r>
+              <w:rPr>
+                <w:rFonts w:ascii="Aptos Narrow" w:hAnsi="Aptos Narrow"/>
+                <w:color w:val="000000"/>
+                <w:sz w:val="22"/>
+                <w:szCs w:val="22"/>
+                <w:lang w:val="de-AT" w:eastAsia="de-AT"/>
+              </w:rPr>
+              <w:t>405,779</w:t>
+            </w:r>
+          </w:p>
+        </w:tc>
+      </w:tr>
+      <w:tr>
+        <w:trPr>
+          <w:trHeight w:val="288"/>
+          <w:jc w:val="center"/>
+        </w:trPr>
+        <w:tc>
+          <w:tcPr>
+            <w:tcW w:w="1786" w:type="dxa"/>
+            <w:tcBorders>
+              <w:top w:val="nil"/>
+              <w:left w:val="single" w:sz="8" w:space="0" w:color="auto"/>
+              <w:bottom w:val="nil"/>
+              <w:right w:val="single" w:sz="4" w:space="0" w:color="auto"/>
+            </w:tcBorders>
+            <w:noWrap/>
+            <w:vAlign w:val="bottom"/>
+            <w:hideMark/>
+          </w:tcPr>
+          <w:p>
+            <w:pPr>
+              <w:suppressAutoHyphens w:val="0"/>
+              <w:spacing w:line="240" w:lineRule="auto"/>
+              <w:jc w:val="center"/>
+              <w:rPr>
+                <w:rFonts w:ascii="Aptos Narrow" w:hAnsi="Aptos Narrow"/>
+                <w:color w:val="000000"/>
+                <w:sz w:val="22"/>
+                <w:szCs w:val="22"/>
+                <w:lang w:val="de-AT" w:eastAsia="de-AT"/>
+              </w:rPr>
+            </w:pPr>
+            <w:r>
+              <w:rPr>
+                <w:rFonts w:ascii="Aptos Narrow" w:hAnsi="Aptos Narrow"/>
+                <w:color w:val="000000"/>
+                <w:sz w:val="22"/>
+                <w:szCs w:val="22"/>
+                <w:lang w:val="de-AT" w:eastAsia="de-AT"/>
+              </w:rPr>
+              <w:t>1</w:t>
+            </w:r>
+          </w:p>
+        </w:tc>
+        <w:tc>
+          <w:tcPr>
+            <w:tcW w:w="2220" w:type="dxa"/>
+            <w:tcBorders>
+              <w:top w:val="nil"/>
+              <w:left w:val="nil"/>
+              <w:bottom w:val="nil"/>
+              <w:right w:val="single" w:sz="4" w:space="0" w:color="auto"/>
+            </w:tcBorders>
+            <w:noWrap/>
+            <w:vAlign w:val="bottom"/>
+            <w:hideMark/>
+          </w:tcPr>
+          <w:p>
+            <w:pPr>
+              <w:suppressAutoHyphens w:val="0"/>
+              <w:spacing w:line="240" w:lineRule="auto"/>
+              <w:jc w:val="center"/>
+              <w:rPr>
+                <w:rFonts w:ascii="Aptos Narrow" w:hAnsi="Aptos Narrow"/>
+                <w:color w:val="000000"/>
+                <w:sz w:val="22"/>
+                <w:szCs w:val="22"/>
+                <w:lang w:val="de-AT" w:eastAsia="de-AT"/>
+              </w:rPr>
+            </w:pPr>
+            <w:r>
+              <w:rPr>
+                <w:rFonts w:ascii="Aptos Narrow" w:hAnsi="Aptos Narrow"/>
+                <w:color w:val="000000"/>
+                <w:sz w:val="22"/>
+                <w:szCs w:val="22"/>
+                <w:lang w:val="de-AT" w:eastAsia="de-AT"/>
+              </w:rPr>
+              <w:t>128,318</w:t>
+            </w:r>
+          </w:p>
+        </w:tc>
+        <w:tc>
+          <w:tcPr>
+            <w:tcW w:w="2220" w:type="dxa"/>
+            <w:tcBorders>
+              <w:top w:val="nil"/>
+              <w:left w:val="nil"/>
+              <w:bottom w:val="nil"/>
+              <w:right w:val="single" w:sz="8" w:space="0" w:color="auto"/>
+            </w:tcBorders>
+            <w:noWrap/>
+            <w:vAlign w:val="bottom"/>
+            <w:hideMark/>
+          </w:tcPr>
+          <w:p>
+            <w:pPr>
+              <w:suppressAutoHyphens w:val="0"/>
+              <w:spacing w:line="240" w:lineRule="auto"/>
+              <w:jc w:val="center"/>
+              <w:rPr>
+                <w:rFonts w:ascii="Aptos Narrow" w:hAnsi="Aptos Narrow"/>
+                <w:color w:val="000000"/>
+                <w:sz w:val="22"/>
+                <w:szCs w:val="22"/>
+                <w:lang w:val="de-AT" w:eastAsia="de-AT"/>
+              </w:rPr>
+            </w:pPr>
+            <w:r>
+              <w:rPr>
+                <w:rFonts w:ascii="Aptos Narrow" w:hAnsi="Aptos Narrow"/>
+                <w:color w:val="000000"/>
+                <w:sz w:val="22"/>
+                <w:szCs w:val="22"/>
+                <w:lang w:val="de-AT" w:eastAsia="de-AT"/>
+              </w:rPr>
+              <w:t>128,318</w:t>
+            </w:r>
+          </w:p>
+        </w:tc>
+      </w:tr>
+      <w:tr>
+        <w:trPr>
+          <w:trHeight w:val="288"/>
+          <w:jc w:val="center"/>
+        </w:trPr>
+        <w:tc>
+          <w:tcPr>
+            <w:tcW w:w="1786" w:type="dxa"/>
+            <w:tcBorders>
+              <w:top w:val="nil"/>
+              <w:left w:val="single" w:sz="8" w:space="0" w:color="auto"/>
+              <w:bottom w:val="nil"/>
+              <w:right w:val="single" w:sz="4" w:space="0" w:color="auto"/>
+            </w:tcBorders>
+            <w:noWrap/>
+            <w:vAlign w:val="bottom"/>
+            <w:hideMark/>
+          </w:tcPr>
+          <w:p>
+            <w:pPr>
+              <w:suppressAutoHyphens w:val="0"/>
+              <w:spacing w:line="240" w:lineRule="auto"/>
+              <w:jc w:val="center"/>
+              <w:rPr>
+                <w:rFonts w:ascii="Aptos Narrow" w:hAnsi="Aptos Narrow"/>
+                <w:color w:val="000000"/>
+                <w:sz w:val="22"/>
+                <w:szCs w:val="22"/>
+                <w:lang w:val="de-AT" w:eastAsia="de-AT"/>
+              </w:rPr>
+            </w:pPr>
+            <w:r>
+              <w:rPr>
+                <w:rFonts w:ascii="Aptos Narrow" w:hAnsi="Aptos Narrow"/>
+                <w:color w:val="000000"/>
+                <w:sz w:val="22"/>
+                <w:szCs w:val="22"/>
+                <w:lang w:val="de-AT" w:eastAsia="de-AT"/>
+              </w:rPr>
+              <w:t>10</w:t>
+            </w:r>
+          </w:p>
+        </w:tc>
+        <w:tc>
+          <w:tcPr>
+            <w:tcW w:w="2220" w:type="dxa"/>
+            <w:tcBorders>
+              <w:top w:val="nil"/>
+              <w:left w:val="nil"/>
+              <w:bottom w:val="nil"/>
+              <w:right w:val="single" w:sz="4" w:space="0" w:color="auto"/>
+            </w:tcBorders>
+            <w:noWrap/>
+            <w:vAlign w:val="bottom"/>
+            <w:hideMark/>
+          </w:tcPr>
+          <w:p>
+            <w:pPr>
+              <w:suppressAutoHyphens w:val="0"/>
+              <w:spacing w:line="240" w:lineRule="auto"/>
+              <w:jc w:val="center"/>
+              <w:rPr>
+                <w:rFonts w:ascii="Aptos Narrow" w:hAnsi="Aptos Narrow"/>
+                <w:color w:val="000000"/>
+                <w:sz w:val="22"/>
+                <w:szCs w:val="22"/>
+                <w:lang w:val="de-AT" w:eastAsia="de-AT"/>
+              </w:rPr>
+            </w:pPr>
+            <w:r>
+              <w:rPr>
+                <w:rFonts w:ascii="Aptos Narrow" w:hAnsi="Aptos Narrow"/>
+                <w:color w:val="000000"/>
+                <w:sz w:val="22"/>
+                <w:szCs w:val="22"/>
+                <w:lang w:val="de-AT" w:eastAsia="de-AT"/>
+              </w:rPr>
+              <w:t>405,779</w:t>
+            </w:r>
+          </w:p>
+        </w:tc>
+        <w:tc>
+          <w:tcPr>
+            <w:tcW w:w="2220" w:type="dxa"/>
+            <w:tcBorders>
+              <w:top w:val="nil"/>
+              <w:left w:val="nil"/>
+              <w:bottom w:val="nil"/>
+              <w:right w:val="single" w:sz="8" w:space="0" w:color="auto"/>
+            </w:tcBorders>
+            <w:noWrap/>
+            <w:vAlign w:val="bottom"/>
+            <w:hideMark/>
+          </w:tcPr>
+          <w:p>
+            <w:pPr>
+              <w:suppressAutoHyphens w:val="0"/>
+              <w:spacing w:line="240" w:lineRule="auto"/>
+              <w:jc w:val="center"/>
+              <w:rPr>
+                <w:rFonts w:ascii="Aptos Narrow" w:hAnsi="Aptos Narrow"/>
+                <w:color w:val="000000"/>
+                <w:sz w:val="22"/>
+                <w:szCs w:val="22"/>
+                <w:lang w:val="de-AT" w:eastAsia="de-AT"/>
+              </w:rPr>
+            </w:pPr>
+            <w:r>
+              <w:rPr>
+                <w:rFonts w:ascii="Aptos Narrow" w:hAnsi="Aptos Narrow"/>
+                <w:color w:val="000000"/>
+                <w:sz w:val="22"/>
+                <w:szCs w:val="22"/>
+                <w:lang w:val="de-AT" w:eastAsia="de-AT"/>
+              </w:rPr>
+              <w:t>40,578</w:t>
+            </w:r>
+          </w:p>
+        </w:tc>
+      </w:tr>
+      <w:tr>
+        <w:trPr>
+          <w:trHeight w:val="288"/>
+          <w:jc w:val="center"/>
+        </w:trPr>
+        <w:tc>
+          <w:tcPr>
+            <w:tcW w:w="1786" w:type="dxa"/>
+            <w:tcBorders>
+              <w:top w:val="nil"/>
+              <w:left w:val="single" w:sz="8" w:space="0" w:color="auto"/>
+              <w:bottom w:val="nil"/>
+              <w:right w:val="single" w:sz="4" w:space="0" w:color="auto"/>
+            </w:tcBorders>
+            <w:noWrap/>
+            <w:vAlign w:val="bottom"/>
+            <w:hideMark/>
+          </w:tcPr>
+          <w:p>
+            <w:pPr>
+              <w:suppressAutoHyphens w:val="0"/>
+              <w:spacing w:line="240" w:lineRule="auto"/>
+              <w:jc w:val="center"/>
+              <w:rPr>
+                <w:rFonts w:ascii="Aptos Narrow" w:hAnsi="Aptos Narrow"/>
+                <w:color w:val="000000"/>
+                <w:sz w:val="22"/>
+                <w:szCs w:val="22"/>
+                <w:lang w:val="de-AT" w:eastAsia="de-AT"/>
+              </w:rPr>
+            </w:pPr>
+            <w:r>
+              <w:rPr>
+                <w:rFonts w:ascii="Aptos Narrow" w:hAnsi="Aptos Narrow"/>
+                <w:color w:val="000000"/>
+                <w:sz w:val="22"/>
+                <w:szCs w:val="22"/>
+                <w:lang w:val="de-AT" w:eastAsia="de-AT"/>
+              </w:rPr>
+              <w:t>100</w:t>
+            </w:r>
+          </w:p>
+        </w:tc>
+        <w:tc>
+          <w:tcPr>
+            <w:tcW w:w="2220" w:type="dxa"/>
+            <w:tcBorders>
+              <w:top w:val="nil"/>
+              <w:left w:val="nil"/>
+              <w:bottom w:val="nil"/>
+              <w:right w:val="single" w:sz="4" w:space="0" w:color="auto"/>
+            </w:tcBorders>
+            <w:noWrap/>
+            <w:vAlign w:val="bottom"/>
+            <w:hideMark/>
+          </w:tcPr>
+          <w:p>
+            <w:pPr>
+              <w:suppressAutoHyphens w:val="0"/>
+              <w:spacing w:line="240" w:lineRule="auto"/>
+              <w:jc w:val="center"/>
+              <w:rPr>
+                <w:rFonts w:ascii="Aptos Narrow" w:hAnsi="Aptos Narrow"/>
+                <w:color w:val="000000"/>
+                <w:sz w:val="22"/>
+                <w:szCs w:val="22"/>
+                <w:lang w:val="de-AT" w:eastAsia="de-AT"/>
+              </w:rPr>
+            </w:pPr>
+            <w:r>
+              <w:rPr>
+                <w:rFonts w:ascii="Aptos Narrow" w:hAnsi="Aptos Narrow"/>
+                <w:color w:val="000000"/>
+                <w:sz w:val="22"/>
+                <w:szCs w:val="22"/>
+                <w:lang w:val="de-AT" w:eastAsia="de-AT"/>
+              </w:rPr>
+              <w:t>1283,184</w:t>
+            </w:r>
+          </w:p>
+        </w:tc>
+        <w:tc>
+          <w:tcPr>
+            <w:tcW w:w="2220" w:type="dxa"/>
+            <w:tcBorders>
+              <w:top w:val="nil"/>
+              <w:left w:val="nil"/>
+              <w:bottom w:val="nil"/>
+              <w:right w:val="single" w:sz="8" w:space="0" w:color="auto"/>
+            </w:tcBorders>
+            <w:noWrap/>
+            <w:vAlign w:val="bottom"/>
+            <w:hideMark/>
+          </w:tcPr>
+          <w:p>
+            <w:pPr>
+              <w:suppressAutoHyphens w:val="0"/>
+              <w:spacing w:line="240" w:lineRule="auto"/>
+              <w:jc w:val="center"/>
+              <w:rPr>
+                <w:rFonts w:ascii="Aptos Narrow" w:hAnsi="Aptos Narrow"/>
+                <w:color w:val="000000"/>
+                <w:sz w:val="22"/>
+                <w:szCs w:val="22"/>
+                <w:lang w:val="de-AT" w:eastAsia="de-AT"/>
+              </w:rPr>
+            </w:pPr>
+            <w:r>
+              <w:rPr>
+                <w:rFonts w:ascii="Aptos Narrow" w:hAnsi="Aptos Narrow"/>
+                <w:color w:val="000000"/>
+                <w:sz w:val="22"/>
+                <w:szCs w:val="22"/>
+                <w:lang w:val="de-AT" w:eastAsia="de-AT"/>
+              </w:rPr>
+              <w:t>12,832</w:t>
+            </w:r>
+          </w:p>
+        </w:tc>
+      </w:tr>
+      <w:tr>
+        <w:trPr>
+          <w:trHeight w:val="300"/>
+          <w:jc w:val="center"/>
+        </w:trPr>
+        <w:tc>
+          <w:tcPr>
+            <w:tcW w:w="1786" w:type="dxa"/>
+            <w:tcBorders>
+              <w:top w:val="nil"/>
+              <w:left w:val="single" w:sz="8" w:space="0" w:color="auto"/>
+              <w:bottom w:val="nil"/>
+              <w:right w:val="single" w:sz="4" w:space="0" w:color="auto"/>
+            </w:tcBorders>
+            <w:noWrap/>
+            <w:vAlign w:val="bottom"/>
+            <w:hideMark/>
+          </w:tcPr>
+          <w:p>
+            <w:pPr>
+              <w:suppressAutoHyphens w:val="0"/>
+              <w:spacing w:line="240" w:lineRule="auto"/>
+              <w:jc w:val="center"/>
+              <w:rPr>
+                <w:rFonts w:ascii="Aptos Narrow" w:hAnsi="Aptos Narrow"/>
+                <w:color w:val="000000"/>
+                <w:sz w:val="22"/>
+                <w:szCs w:val="22"/>
+                <w:lang w:val="de-AT" w:eastAsia="de-AT"/>
+              </w:rPr>
+            </w:pPr>
+            <w:r>
+              <w:rPr>
+                <w:rFonts w:ascii="Aptos Narrow" w:hAnsi="Aptos Narrow"/>
+                <w:color w:val="000000"/>
+                <w:sz w:val="22"/>
+                <w:szCs w:val="22"/>
+                <w:lang w:val="de-AT" w:eastAsia="de-AT"/>
+              </w:rPr>
+              <w:t>1000</w:t>
+            </w:r>
+          </w:p>
+        </w:tc>
+        <w:tc>
+          <w:tcPr>
+            <w:tcW w:w="2220" w:type="dxa"/>
+            <w:tcBorders>
+              <w:top w:val="nil"/>
+              <w:left w:val="nil"/>
+              <w:bottom w:val="nil"/>
+              <w:right w:val="single" w:sz="4" w:space="0" w:color="auto"/>
+            </w:tcBorders>
+            <w:noWrap/>
+            <w:vAlign w:val="bottom"/>
+            <w:hideMark/>
+          </w:tcPr>
+          <w:p>
+            <w:pPr>
+              <w:suppressAutoHyphens w:val="0"/>
+              <w:spacing w:line="240" w:lineRule="auto"/>
+              <w:jc w:val="center"/>
+              <w:rPr>
+                <w:rFonts w:ascii="Aptos Narrow" w:hAnsi="Aptos Narrow"/>
+                <w:color w:val="000000"/>
+                <w:sz w:val="22"/>
+                <w:szCs w:val="22"/>
+                <w:lang w:val="de-AT" w:eastAsia="de-AT"/>
+              </w:rPr>
+            </w:pPr>
+            <w:r>
+              <w:rPr>
+                <w:rFonts w:ascii="Aptos Narrow" w:hAnsi="Aptos Narrow"/>
+                <w:color w:val="000000"/>
+                <w:sz w:val="22"/>
+                <w:szCs w:val="22"/>
+                <w:lang w:val="de-AT" w:eastAsia="de-AT"/>
+              </w:rPr>
+              <w:t>4057,785</w:t>
+            </w:r>
+          </w:p>
+        </w:tc>
+        <w:tc>
+          <w:tcPr>
+            <w:tcW w:w="2220" w:type="dxa"/>
+            <w:tcBorders>
+              <w:top w:val="nil"/>
+              <w:left w:val="nil"/>
+              <w:bottom w:val="nil"/>
+              <w:right w:val="single" w:sz="8" w:space="0" w:color="auto"/>
+            </w:tcBorders>
+            <w:noWrap/>
+            <w:vAlign w:val="bottom"/>
+            <w:hideMark/>
+          </w:tcPr>
+          <w:p>
+            <w:pPr>
+              <w:suppressAutoHyphens w:val="0"/>
+              <w:spacing w:line="240" w:lineRule="auto"/>
+              <w:jc w:val="center"/>
+              <w:rPr>
+                <w:rFonts w:ascii="Aptos Narrow" w:hAnsi="Aptos Narrow"/>
+                <w:color w:val="000000"/>
+                <w:sz w:val="22"/>
+                <w:szCs w:val="22"/>
+                <w:lang w:val="de-AT" w:eastAsia="de-AT"/>
+              </w:rPr>
+            </w:pPr>
+            <w:r>
+              <w:rPr>
+                <w:rFonts w:ascii="Aptos Narrow" w:hAnsi="Aptos Narrow"/>
+                <w:color w:val="000000"/>
+                <w:sz w:val="22"/>
+                <w:szCs w:val="22"/>
+                <w:lang w:val="de-AT" w:eastAsia="de-AT"/>
+              </w:rPr>
+              <w:t>4,058</w:t>
+            </w:r>
+          </w:p>
+        </w:tc>
+      </w:tr>
+      <w:tr>
+        <w:trPr>
+          <w:trHeight w:val="300"/>
+          <w:jc w:val="center"/>
+        </w:trPr>
+        <w:tc>
+          <w:tcPr>
+            <w:tcW w:w="1786" w:type="dxa"/>
+            <w:tcBorders>
+              <w:top w:val="nil"/>
+              <w:left w:val="single" w:sz="8" w:space="0" w:color="auto"/>
+              <w:bottom w:val="single" w:sz="8" w:space="0" w:color="auto"/>
+              <w:right w:val="single" w:sz="4" w:space="0" w:color="auto"/>
+            </w:tcBorders>
+            <w:noWrap/>
+            <w:vAlign w:val="bottom"/>
+          </w:tcPr>
+          <w:p>
+            <w:pPr>
+              <w:suppressAutoHyphens w:val="0"/>
+              <w:spacing w:line="240" w:lineRule="auto"/>
+              <w:rPr>
+                <w:rFonts w:ascii="Aptos Narrow" w:hAnsi="Aptos Narrow"/>
+                <w:color w:val="000000"/>
+                <w:sz w:val="22"/>
+                <w:szCs w:val="22"/>
+                <w:lang w:val="de-AT" w:eastAsia="de-AT"/>
+              </w:rPr>
+            </w:pPr>
+          </w:p>
+        </w:tc>
+        <w:tc>
+          <w:tcPr>
+            <w:tcW w:w="2220" w:type="dxa"/>
+            <w:tcBorders>
+              <w:top w:val="nil"/>
+              <w:left w:val="nil"/>
+              <w:bottom w:val="single" w:sz="8" w:space="0" w:color="auto"/>
+              <w:right w:val="single" w:sz="4" w:space="0" w:color="auto"/>
+            </w:tcBorders>
+            <w:noWrap/>
+            <w:vAlign w:val="bottom"/>
+          </w:tcPr>
+          <w:p>
+            <w:pPr>
+              <w:suppressAutoHyphens w:val="0"/>
+              <w:spacing w:line="240" w:lineRule="auto"/>
+              <w:jc w:val="center"/>
+              <w:rPr>
+                <w:rFonts w:ascii="Aptos Narrow" w:hAnsi="Aptos Narrow"/>
+                <w:color w:val="000000"/>
+                <w:sz w:val="22"/>
+                <w:szCs w:val="22"/>
+                <w:lang w:val="de-AT" w:eastAsia="de-AT"/>
+              </w:rPr>
+            </w:pPr>
+          </w:p>
+        </w:tc>
+        <w:tc>
+          <w:tcPr>
+            <w:tcW w:w="2220" w:type="dxa"/>
+            <w:tcBorders>
+              <w:top w:val="nil"/>
+              <w:left w:val="nil"/>
+              <w:bottom w:val="single" w:sz="8" w:space="0" w:color="auto"/>
+              <w:right w:val="single" w:sz="8" w:space="0" w:color="auto"/>
+            </w:tcBorders>
+            <w:noWrap/>
+            <w:vAlign w:val="bottom"/>
+          </w:tcPr>
+          <w:p>
+            <w:pPr>
+              <w:suppressAutoHyphens w:val="0"/>
+              <w:spacing w:line="240" w:lineRule="auto"/>
+              <w:jc w:val="center"/>
+              <w:rPr>
+                <w:rFonts w:ascii="Aptos Narrow" w:hAnsi="Aptos Narrow"/>
+                <w:color w:val="000000"/>
+                <w:sz w:val="22"/>
+                <w:szCs w:val="22"/>
+                <w:lang w:val="de-AT" w:eastAsia="de-AT"/>
+              </w:rPr>
+            </w:pPr>
+          </w:p>
+        </w:tc>
+      </w:tr>
+    </w:tbl>
+    <w:p>
+      <w:bookmarkStart w:id="0" w:name="_Toc524250395"/>
+    </w:p>
+    <w:p>
+      <w:pPr>
+        <w:pStyle w:val="berschrift1"/>
+      </w:pPr>
+    </w:p>
+    <w:p/>
+    <w:p/>
+    <w:p/>
+    <w:p/>
+    <w:p/>
+    <w:p/>
+    <w:p>
+      <w:pPr>
+        <w:pStyle w:val="berschrift1"/>
+      </w:pPr>
+      <w:r>
+        <w:lastRenderedPageBreak/>
+        <w:t>Abschließende Bemerkungen</w:t>
       </w:r>
       <w:bookmarkEnd w:id="0"/>
       <w:r>
-        <w:rPr>
-          <w:rFonts w:eastAsia="TimesNewRomanPSMT" w:cs="TimesNewRomanPSMT"/>
-          <w:b w:val="0"/>
-          <w:sz w:val="26"/>
-          <w:szCs w:val="26"/>
-        </w:rPr>
         <w:t xml:space="preserve"> </w:t>
       </w:r>
     </w:p>
@@ -2743,408 +4190,74 @@
           <w:rFonts w:eastAsia="TimesNewRomanPSMT"/>
           <w:i/>
         </w:rPr>
-        <w:t xml:space="preserve">(Schaltung, </w:t>
+        <w:t>(</w:t>
       </w:r>
       <w:r>
         <w:rPr>
           <w:rFonts w:eastAsia="TimesNewRomanPSMT"/>
           <w:i/>
         </w:rPr>
-        <w:t xml:space="preserve">eingestellte </w:t>
+        <w:t>Besondere Vorkommnisse</w:t>
       </w:r>
       <w:r>
         <w:rPr>
           <w:rFonts w:eastAsia="TimesNewRomanPSMT"/>
           <w:i/>
         </w:rPr>
-        <w:t xml:space="preserve">Messbereiche, BMKZ </w:t>
+        <w:t xml:space="preserve"> </w:t>
       </w:r>
       <w:r>
         <w:rPr>
           <w:rFonts w:eastAsia="TimesNewRomanPSMT"/>
           <w:i/>
         </w:rPr>
-        <w:sym w:font="Wingdings" w:char="F0E0"/>
+        <w:t xml:space="preserve">während der Übung </w:t>
       </w:r>
       <w:r>
         <w:rPr>
           <w:rFonts w:eastAsia="TimesNewRomanPSMT"/>
           <w:i/>
         </w:rPr>
-        <w:t xml:space="preserve"> Zuordnung zu Inventarliste)</w:t>
-      </w:r>
-    </w:p>
-    <w:p>
-      <w:pPr>
-        <w:pStyle w:val="berschrift2"/>
-        <w:rPr>
-          <w:rFonts w:eastAsia="TimesNewRomanPSMT" w:cs="TimesNewRomanPSMT"/>
-          <w:b w:val="0"/>
-          <w:sz w:val="26"/>
-          <w:szCs w:val="26"/>
-        </w:rPr>
-      </w:pPr>
-      <w:bookmarkStart w:id="1" w:name="_Toc524250391"/>
-      <w:r>
-        <w:rPr>
-          <w:rFonts w:eastAsia="TimesNewRomanPSMT" w:cs="TimesNewRomanPSMT"/>
-          <w:b w:val="0"/>
-          <w:sz w:val="26"/>
-          <w:szCs w:val="26"/>
-        </w:rPr>
-        <w:lastRenderedPageBreak/>
-        <w:t>Messvorgang</w:t>
-      </w:r>
-      <w:bookmarkEnd w:id="1"/>
-      <w:r>
-        <w:rPr>
-          <w:rFonts w:eastAsia="TimesNewRomanPSMT" w:cs="TimesNewRomanPSMT"/>
-          <w:b w:val="0"/>
-          <w:sz w:val="26"/>
-          <w:szCs w:val="26"/>
-        </w:rPr>
-        <w:t xml:space="preserve"> </w:t>
-      </w:r>
-    </w:p>
-    <w:p>
-      <w:pPr>
+        <w:t>(z.B.: Feueralarm</w:t>
+      </w:r>
+      <w:r>
         <w:rPr>
           <w:rFonts w:eastAsia="TimesNewRomanPSMT"/>
           <w:i/>
         </w:rPr>
-      </w:pPr>
+        <w:t>, NOT-AUS</w:t>
+      </w:r>
       <w:r>
         <w:rPr>
           <w:rFonts w:eastAsia="TimesNewRomanPSMT"/>
           <w:i/>
         </w:rPr>
-        <w:t>(was ist zu beachten, was/wie wird eingestellt, Einschalt</w:t>
+        <w:t>)</w:t>
       </w:r>
       <w:r>
         <w:rPr>
           <w:rFonts w:eastAsia="TimesNewRomanPSMT"/>
           <w:i/>
         </w:rPr>
-        <w:t>-R</w:t>
+        <w:t>, besondere Erkenntnisse, Verbesserungsvorschläge</w:t>
       </w:r>
       <w:r>
         <w:rPr>
           <w:rFonts w:eastAsia="TimesNewRomanPSMT"/>
           <w:i/>
         </w:rPr>
-        <w:t>eihenfolge, Ausschalt</w:t>
-      </w:r>
-      <w:r>
-        <w:rPr>
-          <w:rFonts w:eastAsia="TimesNewRomanPSMT"/>
-          <w:i/>
-        </w:rPr>
-        <w:t>-R</w:t>
-      </w:r>
-      <w:r>
-        <w:rPr>
-          <w:rFonts w:eastAsia="TimesNewRomanPSMT"/>
-          <w:i/>
-        </w:rPr>
-        <w:t>eihenfolge)</w:t>
-      </w:r>
-    </w:p>
-    <w:p>
-      <w:pPr>
-        <w:pStyle w:val="berschrift2"/>
-        <w:rPr>
-          <w:rFonts w:eastAsia="TimesNewRomanPSMT" w:cs="TimesNewRomanPSMT"/>
-          <w:b w:val="0"/>
-          <w:sz w:val="26"/>
-          <w:szCs w:val="26"/>
-        </w:rPr>
-      </w:pPr>
-      <w:bookmarkStart w:id="2" w:name="_Toc524250392"/>
-      <w:r>
-        <w:rPr>
-          <w:rFonts w:eastAsia="TimesNewRomanPSMT" w:cs="TimesNewRomanPSMT"/>
-          <w:b w:val="0"/>
-          <w:sz w:val="26"/>
-          <w:szCs w:val="26"/>
-        </w:rPr>
-        <w:t>Messtabelle</w:t>
-      </w:r>
-      <w:bookmarkEnd w:id="2"/>
-      <w:r>
-        <w:rPr>
-          <w:rFonts w:eastAsia="TimesNewRomanPSMT" w:cs="TimesNewRomanPSMT"/>
-          <w:b w:val="0"/>
-          <w:sz w:val="26"/>
-          <w:szCs w:val="26"/>
-        </w:rPr>
-        <w:t xml:space="preserve">  </w:t>
-      </w:r>
-    </w:p>
-    <w:p>
-      <w:pPr>
-        <w:rPr>
-          <w:rFonts w:eastAsia="TimesNewRomanPSMT"/>
-          <w:i/>
-        </w:rPr>
-      </w:pPr>
-      <w:r>
-        <w:rPr>
-          <w:rFonts w:eastAsia="TimesNewRomanPSMT"/>
-          <w:i/>
-        </w:rPr>
-        <w:t xml:space="preserve">(Messtabelle, </w:t>
-      </w:r>
-      <w:r>
-        <w:rPr>
-          <w:rFonts w:eastAsia="TimesNewRomanPSMT"/>
-          <w:i/>
-        </w:rPr>
-        <w:t xml:space="preserve">Bezeichnung der </w:t>
-      </w:r>
-      <w:r>
-        <w:rPr>
-          <w:rFonts w:eastAsia="TimesNewRomanPSMT"/>
-          <w:i/>
-        </w:rPr>
-        <w:t>Mess- und Einstellgrößen l</w:t>
-      </w:r>
-      <w:r>
-        <w:rPr>
-          <w:rFonts w:eastAsia="TimesNewRomanPSMT"/>
-          <w:i/>
-        </w:rPr>
-        <w:t>aut</w:t>
-      </w:r>
-      <w:r>
-        <w:rPr>
-          <w:rFonts w:eastAsia="TimesNewRomanPSMT"/>
-          <w:i/>
-        </w:rPr>
-        <w:t xml:space="preserve"> Messschaltung</w:t>
-      </w:r>
-      <w:r>
-        <w:rPr>
-          <w:rFonts w:eastAsia="TimesNewRomanPSMT"/>
-          <w:i/>
-        </w:rPr>
-        <w:t>, Einheiten</w:t>
-      </w:r>
-      <w:r>
-        <w:rPr>
-          <w:rFonts w:eastAsia="TimesNewRomanPSMT"/>
-          <w:i/>
-        </w:rPr>
-        <w:t>, verwendete Formeln, Beispielrechnung mit Einheiten)</w:t>
-      </w:r>
-    </w:p>
-    <w:p>
-      <w:pPr>
-        <w:pStyle w:val="berschrift2"/>
-        <w:rPr>
-          <w:rFonts w:eastAsia="TimesNewRomanPSMT" w:cs="TimesNewRomanPSMT"/>
-          <w:b w:val="0"/>
-          <w:sz w:val="26"/>
-          <w:szCs w:val="26"/>
-        </w:rPr>
-      </w:pPr>
-      <w:bookmarkStart w:id="3" w:name="_Toc524250393"/>
-      <w:r>
-        <w:rPr>
-          <w:rFonts w:eastAsia="TimesNewRomanPSMT" w:cs="TimesNewRomanPSMT"/>
-          <w:b w:val="0"/>
-          <w:sz w:val="26"/>
-          <w:szCs w:val="26"/>
-        </w:rPr>
-        <w:t>Diagramm</w:t>
-      </w:r>
-      <w:bookmarkEnd w:id="3"/>
-      <w:r>
-        <w:rPr>
-          <w:rFonts w:eastAsia="TimesNewRomanPSMT" w:cs="TimesNewRomanPSMT"/>
-          <w:b w:val="0"/>
-          <w:sz w:val="26"/>
-          <w:szCs w:val="26"/>
-        </w:rPr>
-        <w:t xml:space="preserve">  </w:t>
-      </w:r>
-    </w:p>
-    <w:p>
-      <w:pPr>
-        <w:rPr>
-          <w:rFonts w:eastAsia="TimesNewRomanPSMT"/>
-          <w:i/>
-        </w:rPr>
-      </w:pPr>
-      <w:r>
-        <w:rPr>
-          <w:rFonts w:eastAsia="TimesNewRomanPSMT"/>
-          <w:i/>
-        </w:rPr>
-        <w:t>(grafische Auswertung, Kommentare zu Besonderheiten/Abweichungen zur Theorie-Erwartung</w:t>
-      </w:r>
-      <w:r>
-        <w:rPr>
-          <w:rFonts w:eastAsia="TimesNewRomanPSMT"/>
-          <w:i/>
-        </w:rPr>
         <w:t>)</w:t>
       </w:r>
     </w:p>
     <w:p>
       <w:pPr>
-        <w:pStyle w:val="berschrift2"/>
-        <w:rPr>
-          <w:rFonts w:eastAsia="TimesNewRomanPSMT" w:cs="TimesNewRomanPSMT"/>
-          <w:b w:val="0"/>
-          <w:sz w:val="26"/>
-          <w:szCs w:val="26"/>
-        </w:rPr>
-      </w:pPr>
-      <w:bookmarkStart w:id="4" w:name="_Toc524250394"/>
-      <w:r>
-        <w:rPr>
-          <w:rFonts w:eastAsia="TimesNewRomanPSMT" w:cs="TimesNewRomanPSMT"/>
-          <w:b w:val="0"/>
-          <w:sz w:val="26"/>
-          <w:szCs w:val="26"/>
-        </w:rPr>
-        <w:t>Ergebnis</w:t>
-      </w:r>
-      <w:bookmarkEnd w:id="4"/>
-      <w:r>
-        <w:rPr>
-          <w:rFonts w:eastAsia="TimesNewRomanPSMT" w:cs="TimesNewRomanPSMT"/>
-          <w:b w:val="0"/>
-          <w:sz w:val="26"/>
-          <w:szCs w:val="26"/>
-        </w:rPr>
-        <w:t xml:space="preserve">   </w:t>
-      </w:r>
-    </w:p>
-    <w:p>
-      <w:pPr>
-        <w:rPr>
-          <w:rFonts w:eastAsia="TimesNewRomanPSMT"/>
-          <w:i/>
-        </w:rPr>
-      </w:pPr>
-      <w:r>
-        <w:rPr>
-          <w:rFonts w:eastAsia="TimesNewRomanPSMT"/>
-          <w:i/>
-        </w:rPr>
-        <w:t>(</w:t>
-      </w:r>
-      <w:r>
-        <w:rPr>
-          <w:rFonts w:eastAsia="TimesNewRomanPSMT"/>
-          <w:i/>
-        </w:rPr>
-        <w:t>verbales Ergebnis / verbale Erkenntnis aus Übung 1)</w:t>
-      </w:r>
-    </w:p>
-    <w:p>
-      <w:pPr>
-        <w:rPr>
-          <w:rFonts w:eastAsia="TimesNewRomanPSMT" w:cs="TimesNewRomanPSMT"/>
-          <w:sz w:val="26"/>
-          <w:szCs w:val="26"/>
-        </w:rPr>
-      </w:pPr>
-    </w:p>
-    <w:p>
-      <w:pPr>
         <w:pStyle w:val="berschrift1"/>
       </w:pPr>
-      <w:bookmarkStart w:id="5" w:name="_Toc524250395"/>
-      <w:r>
-        <w:t>Abschließende Bemerkungen</w:t>
-      </w:r>
-      <w:bookmarkEnd w:id="5"/>
-      <w:r>
-        <w:t xml:space="preserve"> </w:t>
-      </w:r>
-    </w:p>
-    <w:p>
-      <w:pPr>
-        <w:rPr>
-          <w:rFonts w:eastAsia="TimesNewRomanPSMT"/>
-          <w:i/>
-        </w:rPr>
-      </w:pPr>
-      <w:r>
-        <w:rPr>
-          <w:rFonts w:eastAsia="TimesNewRomanPSMT"/>
-          <w:i/>
-        </w:rPr>
-        <w:t>(</w:t>
-      </w:r>
-      <w:r>
-        <w:rPr>
-          <w:rFonts w:eastAsia="TimesNewRomanPSMT"/>
-          <w:i/>
-        </w:rPr>
-        <w:t>Besondere Vorkommnisse</w:t>
-      </w:r>
-      <w:r>
-        <w:rPr>
-          <w:rFonts w:eastAsia="TimesNewRomanPSMT"/>
-          <w:i/>
-        </w:rPr>
-        <w:t xml:space="preserve"> </w:t>
-      </w:r>
-      <w:r>
-        <w:rPr>
-          <w:rFonts w:eastAsia="TimesNewRomanPSMT"/>
-          <w:i/>
-        </w:rPr>
-        <w:t xml:space="preserve">während der Übung </w:t>
-      </w:r>
-      <w:r>
-        <w:rPr>
-          <w:rFonts w:eastAsia="TimesNewRomanPSMT"/>
-          <w:i/>
-        </w:rPr>
-        <w:t>(z.B.: Feueralarm</w:t>
-      </w:r>
-      <w:r>
-        <w:rPr>
-          <w:rFonts w:eastAsia="TimesNewRomanPSMT"/>
-          <w:i/>
-        </w:rPr>
-        <w:t>, NOT-AUS</w:t>
-      </w:r>
-      <w:r>
-        <w:rPr>
-          <w:rFonts w:eastAsia="TimesNewRomanPSMT"/>
-          <w:i/>
-        </w:rPr>
-        <w:t>)</w:t>
-      </w:r>
-      <w:r>
-        <w:rPr>
-          <w:rFonts w:eastAsia="TimesNewRomanPSMT"/>
-          <w:i/>
-        </w:rPr>
-        <w:t>, besondere Erkenntnisse, Verbesserungsvorschläge</w:t>
-      </w:r>
-      <w:r>
-        <w:rPr>
-          <w:rFonts w:eastAsia="TimesNewRomanPSMT"/>
-          <w:i/>
-        </w:rPr>
-        <w:t>)</w:t>
-      </w:r>
-    </w:p>
-    <w:p>
-      <w:pPr>
-        <w:pStyle w:val="berschrift1"/>
-      </w:pPr>
-      <w:bookmarkStart w:id="6" w:name="_Toc524250396"/>
+      <w:bookmarkStart w:id="1" w:name="_Toc524250396"/>
       <w:r>
         <w:t>Inventarliste</w:t>
       </w:r>
-      <w:bookmarkEnd w:id="6"/>
+      <w:bookmarkEnd w:id="1"/>
       <w:r>
         <w:t xml:space="preserve"> </w:t>
       </w:r>
@@ -4327,6 +5440,7 @@
   <w:style w:type="character" w:default="1" w:styleId="Absatz-Standardschriftart">
     <w:name w:val="Default Paragraph Font"/>
     <w:uiPriority w:val="1"/>
+    <w:semiHidden/>
     <w:unhideWhenUsed/>
   </w:style>
   <w:style w:type="table" w:default="1" w:styleId="NormaleTabelle">

</xml_diff>

<commit_message>
DIP schreiben LDO Versorgung -3h
</commit_message>
<xml_diff>
--- a/Dokumentation/Diplomarbeit_Template.docx
+++ b/Dokumentation/Diplomarbeit_Template.docx
@@ -1426,30 +1426,8 @@
         <w:rPr>
           <w:lang w:val="de-AT"/>
         </w:rPr>
-        <w:t>analog-</w:t>
-      </w:r>
-      <w:proofErr w:type="spellStart"/>
-      <w:r>
-        <w:rPr>
-          <w:lang w:val="de-AT"/>
-        </w:rPr>
-        <w:t>to</w:t>
-      </w:r>
-      <w:proofErr w:type="spellEnd"/>
-      <w:r>
-        <w:rPr>
-          <w:lang w:val="de-AT"/>
-        </w:rPr>
-        <w:t xml:space="preserve">-digital </w:t>
-      </w:r>
-      <w:proofErr w:type="spellStart"/>
-      <w:r>
-        <w:rPr>
-          <w:lang w:val="de-AT"/>
-        </w:rPr>
-        <w:t>coverter</w:t>
-      </w:r>
-      <w:proofErr w:type="spellEnd"/>
+        <w:t>analog-to-digital coverter</w:t>
+      </w:r>
     </w:p>
     <w:p>
       <w:pPr>
@@ -1466,42 +1444,12 @@
         </w:rPr>
         <w:t xml:space="preserve">BTI </w:t>
       </w:r>
-      <w:proofErr w:type="spellStart"/>
       <w:r>
         <w:rPr>
           <w:lang w:val="de-AT"/>
         </w:rPr>
-        <w:t>bias</w:t>
-      </w:r>
-      <w:proofErr w:type="spellEnd"/>
-      <w:r>
-        <w:rPr>
-          <w:lang w:val="de-AT"/>
-        </w:rPr>
-        <w:t xml:space="preserve"> </w:t>
-      </w:r>
-      <w:proofErr w:type="spellStart"/>
-      <w:r>
-        <w:rPr>
-          <w:lang w:val="de-AT"/>
-        </w:rPr>
-        <w:t>temperature</w:t>
-      </w:r>
-      <w:proofErr w:type="spellEnd"/>
-      <w:r>
-        <w:rPr>
-          <w:lang w:val="de-AT"/>
-        </w:rPr>
-        <w:t xml:space="preserve"> </w:t>
-      </w:r>
-      <w:proofErr w:type="spellStart"/>
-      <w:r>
-        <w:rPr>
-          <w:lang w:val="de-AT"/>
-        </w:rPr>
-        <w:t>instability</w:t>
-      </w:r>
-      <w:proofErr w:type="spellEnd"/>
+        <w:t>bias temperature instability</w:t>
+      </w:r>
     </w:p>
     <w:p>
       <w:pPr>
@@ -1522,30 +1470,8 @@
         <w:rPr>
           <w:lang w:val="de-AT"/>
         </w:rPr>
-        <w:t>digital-</w:t>
-      </w:r>
-      <w:proofErr w:type="spellStart"/>
-      <w:r>
-        <w:rPr>
-          <w:lang w:val="de-AT"/>
-        </w:rPr>
-        <w:t>to</w:t>
-      </w:r>
-      <w:proofErr w:type="spellEnd"/>
-      <w:r>
-        <w:rPr>
-          <w:lang w:val="de-AT"/>
-        </w:rPr>
-        <w:t xml:space="preserve">-analog </w:t>
-      </w:r>
-      <w:proofErr w:type="spellStart"/>
-      <w:r>
-        <w:rPr>
-          <w:lang w:val="de-AT"/>
-        </w:rPr>
-        <w:t>coverter</w:t>
-      </w:r>
-      <w:proofErr w:type="spellEnd"/>
+        <w:t>digital-to-analog coverter</w:t>
+      </w:r>
     </w:p>
     <w:p>
       <w:pPr>
@@ -1562,42 +1488,12 @@
         </w:rPr>
         <w:t xml:space="preserve">DUT </w:t>
       </w:r>
-      <w:proofErr w:type="spellStart"/>
       <w:r>
         <w:rPr>
           <w:lang w:val="de-AT"/>
         </w:rPr>
-        <w:t>device</w:t>
-      </w:r>
-      <w:proofErr w:type="spellEnd"/>
-      <w:r>
-        <w:rPr>
-          <w:lang w:val="de-AT"/>
-        </w:rPr>
-        <w:t xml:space="preserve"> </w:t>
-      </w:r>
-      <w:proofErr w:type="spellStart"/>
-      <w:r>
-        <w:rPr>
-          <w:lang w:val="de-AT"/>
-        </w:rPr>
-        <w:t>under</w:t>
-      </w:r>
-      <w:proofErr w:type="spellEnd"/>
-      <w:r>
-        <w:rPr>
-          <w:lang w:val="de-AT"/>
-        </w:rPr>
-        <w:t xml:space="preserve"> </w:t>
-      </w:r>
-      <w:proofErr w:type="spellStart"/>
-      <w:r>
-        <w:rPr>
-          <w:lang w:val="de-AT"/>
-        </w:rPr>
-        <w:t>test</w:t>
-      </w:r>
-      <w:proofErr w:type="spellEnd"/>
+        <w:t>device under test</w:t>
+      </w:r>
     </w:p>
     <w:p>
       <w:pPr>
@@ -1614,28 +1510,12 @@
         </w:rPr>
         <w:t xml:space="preserve">FET </w:t>
       </w:r>
-      <w:proofErr w:type="spellStart"/>
       <w:r>
         <w:rPr>
           <w:lang w:val="de-AT"/>
         </w:rPr>
-        <w:t>field-effect</w:t>
-      </w:r>
-      <w:proofErr w:type="spellEnd"/>
-      <w:r>
-        <w:rPr>
-          <w:lang w:val="de-AT"/>
-        </w:rPr>
-        <w:t xml:space="preserve"> </w:t>
-      </w:r>
-      <w:proofErr w:type="spellStart"/>
-      <w:r>
-        <w:rPr>
-          <w:lang w:val="de-AT"/>
-        </w:rPr>
-        <w:t>transistor</w:t>
-      </w:r>
-      <w:proofErr w:type="spellEnd"/>
+        <w:t>field-effect transistor</w:t>
+      </w:r>
     </w:p>
     <w:p>
       <w:pPr>
@@ -1652,28 +1532,12 @@
         </w:rPr>
         <w:t xml:space="preserve">GIDL </w:t>
       </w:r>
-      <w:proofErr w:type="spellStart"/>
       <w:r>
         <w:rPr>
           <w:lang w:val="de-AT"/>
         </w:rPr>
-        <w:t>gate-induced</w:t>
-      </w:r>
-      <w:proofErr w:type="spellEnd"/>
-      <w:r>
-        <w:rPr>
-          <w:lang w:val="de-AT"/>
-        </w:rPr>
-        <w:t xml:space="preserve"> drain </w:t>
-      </w:r>
-      <w:proofErr w:type="spellStart"/>
-      <w:r>
-        <w:rPr>
-          <w:lang w:val="de-AT"/>
-        </w:rPr>
-        <w:t>leakage</w:t>
-      </w:r>
-      <w:proofErr w:type="spellEnd"/>
+        <w:t>gate-induced drain leakage</w:t>
+      </w:r>
     </w:p>
     <w:p>
       <w:pPr>
@@ -1690,28 +1554,12 @@
         </w:rPr>
         <w:t xml:space="preserve">HC </w:t>
       </w:r>
-      <w:proofErr w:type="spellStart"/>
       <w:r>
         <w:rPr>
           <w:lang w:val="de-AT"/>
         </w:rPr>
-        <w:t>hot</w:t>
-      </w:r>
-      <w:proofErr w:type="spellEnd"/>
-      <w:r>
-        <w:rPr>
-          <w:lang w:val="de-AT"/>
-        </w:rPr>
-        <w:t xml:space="preserve"> </w:t>
-      </w:r>
-      <w:proofErr w:type="spellStart"/>
-      <w:r>
-        <w:rPr>
-          <w:lang w:val="de-AT"/>
-        </w:rPr>
-        <w:t>carrier</w:t>
-      </w:r>
-      <w:proofErr w:type="spellEnd"/>
+        <w:t>hot carrier</w:t>
+      </w:r>
     </w:p>
     <w:p>
       <w:pPr>
@@ -2207,70 +2055,60 @@
           <w:iCs/>
           <w:lang w:val="en-US"/>
         </w:rPr>
-        <w:t xml:space="preserve">voltage to their metal gate terminal modulates the conductivity between the </w:t>
-      </w:r>
-      <w:proofErr w:type="gramStart"/>
-      <w:r>
+        <w:t>voltage to their metal gate terminal modulates the conductivity between the source</w:t>
+      </w:r>
+    </w:p>
+    <w:p>
+      <w:pPr>
+        <w:ind w:left="576"/>
         <w:rPr>
           <w:i/>
           <w:iCs/>
           <w:lang w:val="en-US"/>
         </w:rPr>
-        <w:t>source</w:t>
-      </w:r>
-      <w:proofErr w:type="gramEnd"/>
-    </w:p>
-    <w:p>
-      <w:pPr>
-        <w:ind w:left="576"/>
+      </w:pPr>
+      <w:r>
         <w:rPr>
           <w:i/>
           <w:iCs/>
           <w:lang w:val="en-US"/>
         </w:rPr>
-      </w:pPr>
-      <w:r>
+        <w:t>and drain terminals. This creates a channel at the semiconductor-insulator interface,</w:t>
+      </w:r>
+    </w:p>
+    <w:p>
+      <w:pPr>
+        <w:ind w:left="576"/>
         <w:rPr>
           <w:i/>
           <w:iCs/>
           <w:lang w:val="en-US"/>
         </w:rPr>
-        <w:t>and drain terminals. This creates a channel at the semiconductor-insulator interface,</w:t>
-      </w:r>
-    </w:p>
-    <w:p>
-      <w:pPr>
-        <w:ind w:left="576"/>
+      </w:pPr>
+      <w:r>
         <w:rPr>
           <w:i/>
           <w:iCs/>
           <w:lang w:val="en-US"/>
         </w:rPr>
-      </w:pPr>
-      <w:r>
+        <w:t>allowing for the switching of electronic signals, making them essential to reproduce the</w:t>
+      </w:r>
+    </w:p>
+    <w:p>
+      <w:pPr>
+        <w:ind w:left="576"/>
         <w:rPr>
           <w:i/>
           <w:iCs/>
           <w:lang w:val="en-US"/>
         </w:rPr>
-        <w:t>allowing for the switching of electronic signals, making them essential to reproduce the</w:t>
-      </w:r>
-    </w:p>
-    <w:p>
-      <w:pPr>
-        <w:ind w:left="576"/>
+      </w:pPr>
+      <w:r>
         <w:rPr>
           <w:i/>
           <w:iCs/>
           <w:lang w:val="en-US"/>
         </w:rPr>
-      </w:pPr>
-      <w:r>
-        <w:rPr>
-          <w:i/>
-          <w:iCs/>
-          <w:lang w:val="en-US"/>
-        </w:rPr>
         <w:t>binary logic necessary for logic gates of computer architectures – Quelle 1, Page 1</w:t>
       </w:r>
     </w:p>
@@ -2287,702 +2125,48 @@
           <w:lang w:val="de-AT"/>
         </w:rPr>
       </w:pPr>
-      <w:proofErr w:type="spellStart"/>
       <w:r>
         <w:rPr>
           <w:lang w:val="de-AT"/>
         </w:rPr>
-        <w:t>Heutztage</w:t>
-      </w:r>
-      <w:proofErr w:type="spellEnd"/>
+        <w:t xml:space="preserve">Heutztage sind in der elektronik </w:t>
+      </w:r>
       <w:r>
         <w:rPr>
           <w:lang w:val="de-AT"/>
         </w:rPr>
-        <w:t xml:space="preserve"> sind in der </w:t>
-      </w:r>
-      <w:proofErr w:type="spellStart"/>
+        <w:t xml:space="preserve">werden </w:t>
+      </w:r>
       <w:r>
         <w:rPr>
           <w:lang w:val="de-AT"/>
         </w:rPr>
-        <w:t>elektronik</w:t>
-      </w:r>
-      <w:proofErr w:type="spellEnd"/>
+        <w:t xml:space="preserve">schalter meist mit Feldeffekttransistoren realieseirt, diese sind geeignet für hohe schaltfrequenzne können kleiner hergesetllt und zuferlässiger desingt werdem. </w:t>
+      </w:r>
       <w:r>
         <w:rPr>
           <w:lang w:val="de-AT"/>
         </w:rPr>
-        <w:t xml:space="preserve"> </w:t>
-      </w:r>
-      <w:r>
+        <w:t xml:space="preserve">Diese nutzen das prinzips der elektrischen felder, durch das anlegen einer spannung am Gate des tranisitors wird die breite des leitfähigen kanals zwischen den Drain und Source anschlüssen moduliert. Durch diese gegebenheit sind die Feldefekt transistoren geeignet als elektrischeer schalter verwedet zu werden. </w:t>
+      </w:r>
+    </w:p>
+    <w:p>
+      <w:pPr>
         <w:rPr>
           <w:lang w:val="de-AT"/>
         </w:rPr>
-        <w:t xml:space="preserve">werden </w:t>
-      </w:r>
-      <w:proofErr w:type="spellStart"/>
+      </w:pPr>
       <w:r>
         <w:rPr>
           <w:lang w:val="de-AT"/>
         </w:rPr>
-        <w:t>schalter</w:t>
-      </w:r>
-      <w:proofErr w:type="spellEnd"/>
+        <w:t>Die Bajeren die der entwiklung besserer FETs im wege steht ist die hersstellung und sind parameter wie leistungs aufnahme als auch schaltgeschwindigkeit. Diese parameter sind durhc die herstellung bestimmt und die defekte die bei dieser entsthen. Mosfets werden aus verscheidenen sichten aufgebaut, da dies wie nicht in der tehckink perfekt vor sich geht entstehen defekte zwischen den verscheidenen schichten als auch in den einzelnen schichten.</w:t>
+      </w:r>
       <w:r>
         <w:rPr>
           <w:lang w:val="de-AT"/>
         </w:rPr>
-        <w:t xml:space="preserve"> meist mit Feldeffekttransistoren </w:t>
-      </w:r>
-      <w:proofErr w:type="spellStart"/>
-      <w:r>
-        <w:rPr>
-          <w:lang w:val="de-AT"/>
-        </w:rPr>
-        <w:t>realieseirt</w:t>
-      </w:r>
-      <w:proofErr w:type="spellEnd"/>
-      <w:r>
-        <w:rPr>
-          <w:lang w:val="de-AT"/>
-        </w:rPr>
-        <w:t xml:space="preserve">, diese sind geeignet für hohe </w:t>
-      </w:r>
-      <w:proofErr w:type="spellStart"/>
-      <w:r>
-        <w:rPr>
-          <w:lang w:val="de-AT"/>
-        </w:rPr>
-        <w:t>schaltfrequenzne</w:t>
-      </w:r>
-      <w:proofErr w:type="spellEnd"/>
-      <w:r>
-        <w:rPr>
-          <w:lang w:val="de-AT"/>
-        </w:rPr>
-        <w:t xml:space="preserve"> können kleiner </w:t>
-      </w:r>
-      <w:proofErr w:type="spellStart"/>
-      <w:r>
-        <w:rPr>
-          <w:lang w:val="de-AT"/>
-        </w:rPr>
-        <w:t>hergesetllt</w:t>
-      </w:r>
-      <w:proofErr w:type="spellEnd"/>
-      <w:r>
-        <w:rPr>
-          <w:lang w:val="de-AT"/>
-        </w:rPr>
-        <w:t xml:space="preserve"> und </w:t>
-      </w:r>
-      <w:proofErr w:type="spellStart"/>
-      <w:r>
-        <w:rPr>
-          <w:lang w:val="de-AT"/>
-        </w:rPr>
-        <w:t>zuferlässiger</w:t>
-      </w:r>
-      <w:proofErr w:type="spellEnd"/>
-      <w:r>
-        <w:rPr>
-          <w:lang w:val="de-AT"/>
-        </w:rPr>
-        <w:t xml:space="preserve"> </w:t>
-      </w:r>
-      <w:proofErr w:type="spellStart"/>
-      <w:r>
-        <w:rPr>
-          <w:lang w:val="de-AT"/>
-        </w:rPr>
-        <w:t>desingt</w:t>
-      </w:r>
-      <w:proofErr w:type="spellEnd"/>
-      <w:r>
-        <w:rPr>
-          <w:lang w:val="de-AT"/>
-        </w:rPr>
-        <w:t xml:space="preserve"> </w:t>
-      </w:r>
-      <w:proofErr w:type="spellStart"/>
-      <w:r>
-        <w:rPr>
-          <w:lang w:val="de-AT"/>
-        </w:rPr>
-        <w:t>werdem</w:t>
-      </w:r>
-      <w:proofErr w:type="spellEnd"/>
-      <w:r>
-        <w:rPr>
-          <w:lang w:val="de-AT"/>
-        </w:rPr>
-        <w:t xml:space="preserve">. </w:t>
-      </w:r>
-      <w:r>
-        <w:rPr>
-          <w:lang w:val="de-AT"/>
-        </w:rPr>
-        <w:t xml:space="preserve">Diese nutzen das </w:t>
-      </w:r>
-      <w:proofErr w:type="spellStart"/>
-      <w:r>
-        <w:rPr>
-          <w:lang w:val="de-AT"/>
-        </w:rPr>
-        <w:t>prinzips</w:t>
-      </w:r>
-      <w:proofErr w:type="spellEnd"/>
-      <w:r>
-        <w:rPr>
-          <w:lang w:val="de-AT"/>
-        </w:rPr>
-        <w:t xml:space="preserve"> der elektrischen </w:t>
-      </w:r>
-      <w:proofErr w:type="spellStart"/>
-      <w:r>
-        <w:rPr>
-          <w:lang w:val="de-AT"/>
-        </w:rPr>
-        <w:t>felder</w:t>
-      </w:r>
-      <w:proofErr w:type="spellEnd"/>
-      <w:r>
-        <w:rPr>
-          <w:lang w:val="de-AT"/>
-        </w:rPr>
-        <w:t xml:space="preserve">, durch </w:t>
-      </w:r>
-      <w:proofErr w:type="gramStart"/>
-      <w:r>
-        <w:rPr>
-          <w:lang w:val="de-AT"/>
-        </w:rPr>
-        <w:t xml:space="preserve">das </w:t>
-      </w:r>
-      <w:proofErr w:type="spellStart"/>
-      <w:r>
-        <w:rPr>
-          <w:lang w:val="de-AT"/>
-        </w:rPr>
-        <w:t>anlegen</w:t>
-      </w:r>
-      <w:proofErr w:type="spellEnd"/>
-      <w:proofErr w:type="gramEnd"/>
-      <w:r>
-        <w:rPr>
-          <w:lang w:val="de-AT"/>
-        </w:rPr>
-        <w:t xml:space="preserve"> einer </w:t>
-      </w:r>
-      <w:proofErr w:type="spellStart"/>
-      <w:r>
-        <w:rPr>
-          <w:lang w:val="de-AT"/>
-        </w:rPr>
-        <w:t>spannung</w:t>
-      </w:r>
-      <w:proofErr w:type="spellEnd"/>
-      <w:r>
-        <w:rPr>
-          <w:lang w:val="de-AT"/>
-        </w:rPr>
-        <w:t xml:space="preserve"> am Gate des </w:t>
-      </w:r>
-      <w:proofErr w:type="spellStart"/>
-      <w:r>
-        <w:rPr>
-          <w:lang w:val="de-AT"/>
-        </w:rPr>
-        <w:t>tranisitors</w:t>
-      </w:r>
-      <w:proofErr w:type="spellEnd"/>
-      <w:r>
-        <w:rPr>
-          <w:lang w:val="de-AT"/>
-        </w:rPr>
-        <w:t xml:space="preserve"> wird die breite des leitfähigen </w:t>
-      </w:r>
-      <w:proofErr w:type="spellStart"/>
-      <w:r>
-        <w:rPr>
-          <w:lang w:val="de-AT"/>
-        </w:rPr>
-        <w:t>kanals</w:t>
-      </w:r>
-      <w:proofErr w:type="spellEnd"/>
-      <w:r>
-        <w:rPr>
-          <w:lang w:val="de-AT"/>
-        </w:rPr>
-        <w:t xml:space="preserve"> zwischen den Drain und Source </w:t>
-      </w:r>
-      <w:proofErr w:type="spellStart"/>
-      <w:r>
-        <w:rPr>
-          <w:lang w:val="de-AT"/>
-        </w:rPr>
-        <w:t>anschlüssen</w:t>
-      </w:r>
-      <w:proofErr w:type="spellEnd"/>
-      <w:r>
-        <w:rPr>
-          <w:lang w:val="de-AT"/>
-        </w:rPr>
-        <w:t xml:space="preserve"> moduliert. Durch diese </w:t>
-      </w:r>
-      <w:proofErr w:type="spellStart"/>
-      <w:r>
-        <w:rPr>
-          <w:lang w:val="de-AT"/>
-        </w:rPr>
-        <w:t>gegebenheit</w:t>
-      </w:r>
-      <w:proofErr w:type="spellEnd"/>
-      <w:r>
-        <w:rPr>
-          <w:lang w:val="de-AT"/>
-        </w:rPr>
-        <w:t xml:space="preserve"> sind die </w:t>
-      </w:r>
-      <w:proofErr w:type="spellStart"/>
-      <w:r>
-        <w:rPr>
-          <w:lang w:val="de-AT"/>
-        </w:rPr>
-        <w:t>Feldefekt</w:t>
-      </w:r>
-      <w:proofErr w:type="spellEnd"/>
-      <w:r>
-        <w:rPr>
-          <w:lang w:val="de-AT"/>
-        </w:rPr>
-        <w:t xml:space="preserve"> </w:t>
-      </w:r>
-      <w:proofErr w:type="spellStart"/>
-      <w:r>
-        <w:rPr>
-          <w:lang w:val="de-AT"/>
-        </w:rPr>
-        <w:t>transistoren</w:t>
-      </w:r>
-      <w:proofErr w:type="spellEnd"/>
-      <w:r>
-        <w:rPr>
-          <w:lang w:val="de-AT"/>
-        </w:rPr>
-        <w:t xml:space="preserve"> geeignet als </w:t>
-      </w:r>
-      <w:proofErr w:type="spellStart"/>
-      <w:r>
-        <w:rPr>
-          <w:lang w:val="de-AT"/>
-        </w:rPr>
-        <w:t>elektrischeer</w:t>
-      </w:r>
-      <w:proofErr w:type="spellEnd"/>
-      <w:r>
-        <w:rPr>
-          <w:lang w:val="de-AT"/>
-        </w:rPr>
-        <w:t xml:space="preserve"> </w:t>
-      </w:r>
-      <w:proofErr w:type="spellStart"/>
-      <w:r>
-        <w:rPr>
-          <w:lang w:val="de-AT"/>
-        </w:rPr>
-        <w:t>schalter</w:t>
-      </w:r>
-      <w:proofErr w:type="spellEnd"/>
-      <w:r>
-        <w:rPr>
-          <w:lang w:val="de-AT"/>
-        </w:rPr>
-        <w:t xml:space="preserve"> </w:t>
-      </w:r>
-      <w:proofErr w:type="spellStart"/>
-      <w:r>
-        <w:rPr>
-          <w:lang w:val="de-AT"/>
-        </w:rPr>
-        <w:t>verwedet</w:t>
-      </w:r>
-      <w:proofErr w:type="spellEnd"/>
-      <w:r>
-        <w:rPr>
-          <w:lang w:val="de-AT"/>
-        </w:rPr>
-        <w:t xml:space="preserve"> zu werden. </w:t>
-      </w:r>
-    </w:p>
-    <w:p>
-      <w:pPr>
-        <w:rPr>
-          <w:lang w:val="de-AT"/>
-        </w:rPr>
-      </w:pPr>
-      <w:r>
-        <w:rPr>
-          <w:lang w:val="de-AT"/>
-        </w:rPr>
-        <w:t xml:space="preserve">Die </w:t>
-      </w:r>
-      <w:proofErr w:type="spellStart"/>
-      <w:r>
-        <w:rPr>
-          <w:lang w:val="de-AT"/>
-        </w:rPr>
-        <w:t>Bajeren</w:t>
-      </w:r>
-      <w:proofErr w:type="spellEnd"/>
-      <w:r>
-        <w:rPr>
-          <w:lang w:val="de-AT"/>
-        </w:rPr>
-        <w:t xml:space="preserve"> die der </w:t>
-      </w:r>
-      <w:proofErr w:type="spellStart"/>
-      <w:r>
-        <w:rPr>
-          <w:lang w:val="de-AT"/>
-        </w:rPr>
-        <w:t>entwiklung</w:t>
-      </w:r>
-      <w:proofErr w:type="spellEnd"/>
-      <w:r>
-        <w:rPr>
-          <w:lang w:val="de-AT"/>
-        </w:rPr>
-        <w:t xml:space="preserve"> besserer FETs im </w:t>
-      </w:r>
-      <w:proofErr w:type="spellStart"/>
-      <w:r>
-        <w:rPr>
-          <w:lang w:val="de-AT"/>
-        </w:rPr>
-        <w:t>wege</w:t>
-      </w:r>
-      <w:proofErr w:type="spellEnd"/>
-      <w:r>
-        <w:rPr>
-          <w:lang w:val="de-AT"/>
-        </w:rPr>
-        <w:t xml:space="preserve"> steht ist die </w:t>
-      </w:r>
-      <w:proofErr w:type="spellStart"/>
-      <w:r>
-        <w:rPr>
-          <w:lang w:val="de-AT"/>
-        </w:rPr>
-        <w:t>hersstellung</w:t>
-      </w:r>
-      <w:proofErr w:type="spellEnd"/>
-      <w:r>
-        <w:rPr>
-          <w:lang w:val="de-AT"/>
-        </w:rPr>
-        <w:t xml:space="preserve"> und sind </w:t>
-      </w:r>
-      <w:proofErr w:type="spellStart"/>
-      <w:r>
-        <w:rPr>
-          <w:lang w:val="de-AT"/>
-        </w:rPr>
-        <w:t>parameter</w:t>
-      </w:r>
-      <w:proofErr w:type="spellEnd"/>
-      <w:r>
-        <w:rPr>
-          <w:lang w:val="de-AT"/>
-        </w:rPr>
-        <w:t xml:space="preserve"> wie </w:t>
-      </w:r>
-      <w:proofErr w:type="spellStart"/>
-      <w:r>
-        <w:rPr>
-          <w:lang w:val="de-AT"/>
-        </w:rPr>
-        <w:t>leistungs</w:t>
-      </w:r>
-      <w:proofErr w:type="spellEnd"/>
-      <w:r>
-        <w:rPr>
-          <w:lang w:val="de-AT"/>
-        </w:rPr>
-        <w:t xml:space="preserve"> aufnahme als auch </w:t>
-      </w:r>
-      <w:proofErr w:type="spellStart"/>
-      <w:r>
-        <w:rPr>
-          <w:lang w:val="de-AT"/>
-        </w:rPr>
-        <w:t>schaltgeschwindigkeit</w:t>
-      </w:r>
-      <w:proofErr w:type="spellEnd"/>
-      <w:r>
-        <w:rPr>
-          <w:lang w:val="de-AT"/>
-        </w:rPr>
-        <w:t xml:space="preserve">. Diese </w:t>
-      </w:r>
-      <w:proofErr w:type="spellStart"/>
-      <w:r>
-        <w:rPr>
-          <w:lang w:val="de-AT"/>
-        </w:rPr>
-        <w:t>parameter</w:t>
-      </w:r>
-      <w:proofErr w:type="spellEnd"/>
-      <w:r>
-        <w:rPr>
-          <w:lang w:val="de-AT"/>
-        </w:rPr>
-        <w:t xml:space="preserve"> sind </w:t>
-      </w:r>
-      <w:proofErr w:type="spellStart"/>
-      <w:r>
-        <w:rPr>
-          <w:lang w:val="de-AT"/>
-        </w:rPr>
-        <w:t>durhc</w:t>
-      </w:r>
-      <w:proofErr w:type="spellEnd"/>
-      <w:r>
-        <w:rPr>
-          <w:lang w:val="de-AT"/>
-        </w:rPr>
-        <w:t xml:space="preserve"> die </w:t>
-      </w:r>
-      <w:proofErr w:type="spellStart"/>
-      <w:r>
-        <w:rPr>
-          <w:lang w:val="de-AT"/>
-        </w:rPr>
-        <w:t>herstellung</w:t>
-      </w:r>
-      <w:proofErr w:type="spellEnd"/>
-      <w:r>
-        <w:rPr>
-          <w:lang w:val="de-AT"/>
-        </w:rPr>
-        <w:t xml:space="preserve"> bestimmt und die defekte die bei dieser </w:t>
-      </w:r>
-      <w:proofErr w:type="spellStart"/>
-      <w:r>
-        <w:rPr>
-          <w:lang w:val="de-AT"/>
-        </w:rPr>
-        <w:t>entsthen</w:t>
-      </w:r>
-      <w:proofErr w:type="spellEnd"/>
-      <w:r>
-        <w:rPr>
-          <w:lang w:val="de-AT"/>
-        </w:rPr>
-        <w:t xml:space="preserve">. </w:t>
-      </w:r>
-      <w:proofErr w:type="spellStart"/>
-      <w:r>
-        <w:rPr>
-          <w:lang w:val="de-AT"/>
-        </w:rPr>
-        <w:t>Mosfets</w:t>
-      </w:r>
-      <w:proofErr w:type="spellEnd"/>
-      <w:r>
-        <w:rPr>
-          <w:lang w:val="de-AT"/>
-        </w:rPr>
-        <w:t xml:space="preserve"> werden aus </w:t>
-      </w:r>
-      <w:proofErr w:type="spellStart"/>
-      <w:r>
-        <w:rPr>
-          <w:lang w:val="de-AT"/>
-        </w:rPr>
-        <w:t>verscheidenen</w:t>
-      </w:r>
-      <w:proofErr w:type="spellEnd"/>
-      <w:r>
-        <w:rPr>
-          <w:lang w:val="de-AT"/>
-        </w:rPr>
-        <w:t xml:space="preserve"> sichten aufgebaut, da dies wie nicht in der </w:t>
-      </w:r>
-      <w:proofErr w:type="spellStart"/>
-      <w:r>
-        <w:rPr>
-          <w:lang w:val="de-AT"/>
-        </w:rPr>
-        <w:t>tehckink</w:t>
-      </w:r>
-      <w:proofErr w:type="spellEnd"/>
-      <w:r>
-        <w:rPr>
-          <w:lang w:val="de-AT"/>
-        </w:rPr>
-        <w:t xml:space="preserve"> perfekt vor sich geht entstehen defekte zwischen den </w:t>
-      </w:r>
-      <w:proofErr w:type="spellStart"/>
-      <w:r>
-        <w:rPr>
-          <w:lang w:val="de-AT"/>
-        </w:rPr>
-        <w:t>verscheidenen</w:t>
-      </w:r>
-      <w:proofErr w:type="spellEnd"/>
-      <w:r>
-        <w:rPr>
-          <w:lang w:val="de-AT"/>
-        </w:rPr>
-        <w:t xml:space="preserve"> schichten als auch in den einzelnen schichten.</w:t>
-      </w:r>
-      <w:r>
-        <w:rPr>
-          <w:lang w:val="de-AT"/>
-        </w:rPr>
-        <w:t xml:space="preserve"> Diese defekte in der </w:t>
-      </w:r>
-      <w:proofErr w:type="spellStart"/>
-      <w:r>
-        <w:rPr>
-          <w:lang w:val="de-AT"/>
-        </w:rPr>
-        <w:t>silitium</w:t>
-      </w:r>
-      <w:proofErr w:type="spellEnd"/>
-      <w:r>
-        <w:rPr>
-          <w:lang w:val="de-AT"/>
-        </w:rPr>
-        <w:t xml:space="preserve"> </w:t>
-      </w:r>
-      <w:proofErr w:type="spellStart"/>
-      <w:r>
-        <w:rPr>
-          <w:lang w:val="de-AT"/>
-        </w:rPr>
-        <w:t>kristall</w:t>
-      </w:r>
-      <w:proofErr w:type="spellEnd"/>
-      <w:r>
-        <w:rPr>
-          <w:lang w:val="de-AT"/>
-        </w:rPr>
-        <w:t xml:space="preserve"> </w:t>
-      </w:r>
-      <w:proofErr w:type="spellStart"/>
-      <w:r>
-        <w:rPr>
-          <w:lang w:val="de-AT"/>
-        </w:rPr>
-        <w:t>struktur</w:t>
-      </w:r>
-      <w:proofErr w:type="spellEnd"/>
-      <w:r>
-        <w:rPr>
-          <w:lang w:val="de-AT"/>
-        </w:rPr>
-        <w:t xml:space="preserve"> können die </w:t>
-      </w:r>
-      <w:proofErr w:type="spellStart"/>
-      <w:r>
-        <w:rPr>
-          <w:lang w:val="de-AT"/>
-        </w:rPr>
-        <w:t>eigenschaften</w:t>
-      </w:r>
-      <w:proofErr w:type="spellEnd"/>
-      <w:r>
-        <w:rPr>
-          <w:lang w:val="de-AT"/>
-        </w:rPr>
-        <w:t xml:space="preserve"> der </w:t>
-      </w:r>
-      <w:proofErr w:type="spellStart"/>
-      <w:r>
-        <w:rPr>
-          <w:lang w:val="de-AT"/>
-        </w:rPr>
-        <w:t>halbleiter</w:t>
-      </w:r>
-      <w:proofErr w:type="spellEnd"/>
-      <w:r>
-        <w:rPr>
-          <w:lang w:val="de-AT"/>
-        </w:rPr>
-        <w:t xml:space="preserve"> </w:t>
-      </w:r>
-      <w:proofErr w:type="spellStart"/>
-      <w:r>
-        <w:rPr>
-          <w:lang w:val="de-AT"/>
-        </w:rPr>
-        <w:t>veerändern</w:t>
-      </w:r>
-      <w:proofErr w:type="spellEnd"/>
-      <w:r>
-        <w:rPr>
-          <w:lang w:val="de-AT"/>
-        </w:rPr>
-        <w:t xml:space="preserve">, das elektrische </w:t>
-      </w:r>
-      <w:proofErr w:type="spellStart"/>
-      <w:r>
-        <w:rPr>
-          <w:lang w:val="de-AT"/>
-        </w:rPr>
-        <w:t>feld</w:t>
-      </w:r>
-      <w:proofErr w:type="spellEnd"/>
-      <w:r>
-        <w:rPr>
-          <w:lang w:val="de-AT"/>
-        </w:rPr>
-        <w:t xml:space="preserve"> des </w:t>
-      </w:r>
-      <w:proofErr w:type="spellStart"/>
-      <w:r>
-        <w:rPr>
-          <w:lang w:val="de-AT"/>
-        </w:rPr>
-        <w:t>matall</w:t>
-      </w:r>
-      <w:proofErr w:type="spellEnd"/>
-      <w:r>
-        <w:rPr>
-          <w:lang w:val="de-AT"/>
-        </w:rPr>
-        <w:t xml:space="preserve"> </w:t>
-      </w:r>
-      <w:proofErr w:type="spellStart"/>
-      <w:r>
-        <w:rPr>
-          <w:lang w:val="de-AT"/>
-        </w:rPr>
-        <w:t>gates</w:t>
-      </w:r>
-      <w:proofErr w:type="spellEnd"/>
-      <w:r>
-        <w:rPr>
-          <w:lang w:val="de-AT"/>
-        </w:rPr>
-        <w:t xml:space="preserve">, indem defekte </w:t>
-      </w:r>
-      <w:proofErr w:type="spellStart"/>
-      <w:r>
-        <w:rPr>
-          <w:lang w:val="de-AT"/>
-        </w:rPr>
-        <w:t>ladungsträger</w:t>
-      </w:r>
-      <w:proofErr w:type="spellEnd"/>
-      <w:r>
-        <w:rPr>
-          <w:lang w:val="de-AT"/>
-        </w:rPr>
-        <w:t xml:space="preserve"> aufnehmen können als auch abgeben können. Durch das aufnehmen kann sich </w:t>
+        <w:t xml:space="preserve"> Diese defekte in der silitium kristall struktur können die eigenschaften der halbleiter veerändern, das elektrische feld des matall gates, indem defekte ladungsträger aufnehmen können als auch abgeben können. Durch das aufnehmen kann sich </w:t>
       </w:r>
     </w:p>
     <w:p>
@@ -3037,197 +2221,41 @@
         </w:rPr>
         <w:t xml:space="preserve">Parameter eines FET können durch </w:t>
       </w:r>
-      <w:proofErr w:type="spellStart"/>
       <w:r>
         <w:rPr>
           <w:rFonts w:eastAsia="TimesNewRomanPSMT"/>
         </w:rPr>
-        <w:t>alterung</w:t>
-      </w:r>
-      <w:proofErr w:type="spellEnd"/>
+        <w:t>alterung ändern, durch dasändern kann in exctrenem alterung auch zu vollem versgen des bauteiles kommen z.b. Durchbruch des Gate isulators</w:t>
+      </w:r>
       <w:r>
         <w:rPr>
           <w:rFonts w:eastAsia="TimesNewRomanPSMT"/>
         </w:rPr>
-        <w:t xml:space="preserve"> ändern, durch </w:t>
-      </w:r>
-      <w:proofErr w:type="spellStart"/>
+        <w:t xml:space="preserve">, nicht vostendiges leitend werden durch verschiebung der </w:t>
+      </w:r>
       <w:r>
         <w:rPr>
           <w:rFonts w:eastAsia="TimesNewRomanPSMT"/>
         </w:rPr>
-        <w:t>dasändern</w:t>
-      </w:r>
-      <w:proofErr w:type="spellEnd"/>
+        <w:t xml:space="preserve">VTH. Die relevanten Parameter der Angepeilten messungen ist die </w:t>
+      </w:r>
       <w:r>
         <w:rPr>
           <w:rFonts w:eastAsia="TimesNewRomanPSMT"/>
         </w:rPr>
-        <w:t xml:space="preserve"> kann in </w:t>
-      </w:r>
-      <w:proofErr w:type="spellStart"/>
+        <w:t xml:space="preserve">IDVG, </w:t>
+      </w:r>
       <w:r>
         <w:rPr>
           <w:rFonts w:eastAsia="TimesNewRomanPSMT"/>
         </w:rPr>
-        <w:t>exctrenem</w:t>
-      </w:r>
-      <w:proofErr w:type="spellEnd"/>
+        <w:t>VTH</w:t>
+      </w:r>
       <w:r>
         <w:rPr>
           <w:rFonts w:eastAsia="TimesNewRomanPSMT"/>
         </w:rPr>
-        <w:t xml:space="preserve"> </w:t>
-      </w:r>
-      <w:proofErr w:type="spellStart"/>
-      <w:r>
-        <w:rPr>
-          <w:rFonts w:eastAsia="TimesNewRomanPSMT"/>
-        </w:rPr>
-        <w:t>alterung</w:t>
-      </w:r>
-      <w:proofErr w:type="spellEnd"/>
-      <w:r>
-        <w:rPr>
-          <w:rFonts w:eastAsia="TimesNewRomanPSMT"/>
-        </w:rPr>
-        <w:t xml:space="preserve"> auch zu vollem </w:t>
-      </w:r>
-      <w:proofErr w:type="spellStart"/>
-      <w:r>
-        <w:rPr>
-          <w:rFonts w:eastAsia="TimesNewRomanPSMT"/>
-        </w:rPr>
-        <w:t>versgen</w:t>
-      </w:r>
-      <w:proofErr w:type="spellEnd"/>
-      <w:r>
-        <w:rPr>
-          <w:rFonts w:eastAsia="TimesNewRomanPSMT"/>
-        </w:rPr>
-        <w:t xml:space="preserve"> des </w:t>
-      </w:r>
-      <w:proofErr w:type="spellStart"/>
-      <w:r>
-        <w:rPr>
-          <w:rFonts w:eastAsia="TimesNewRomanPSMT"/>
-        </w:rPr>
-        <w:t>bauteiles</w:t>
-      </w:r>
-      <w:proofErr w:type="spellEnd"/>
-      <w:r>
-        <w:rPr>
-          <w:rFonts w:eastAsia="TimesNewRomanPSMT"/>
-        </w:rPr>
-        <w:t xml:space="preserve"> kommen </w:t>
-      </w:r>
-      <w:proofErr w:type="spellStart"/>
-      <w:r>
-        <w:rPr>
-          <w:rFonts w:eastAsia="TimesNewRomanPSMT"/>
-        </w:rPr>
-        <w:t>z.b.</w:t>
-      </w:r>
-      <w:proofErr w:type="spellEnd"/>
-      <w:r>
-        <w:rPr>
-          <w:rFonts w:eastAsia="TimesNewRomanPSMT"/>
-        </w:rPr>
-        <w:t xml:space="preserve"> Durchbruch des Gate </w:t>
-      </w:r>
-      <w:proofErr w:type="spellStart"/>
-      <w:r>
-        <w:rPr>
-          <w:rFonts w:eastAsia="TimesNewRomanPSMT"/>
-        </w:rPr>
-        <w:t>isulators</w:t>
-      </w:r>
-      <w:proofErr w:type="spellEnd"/>
-      <w:r>
-        <w:rPr>
-          <w:rFonts w:eastAsia="TimesNewRomanPSMT"/>
-        </w:rPr>
-        <w:t xml:space="preserve">, nicht </w:t>
-      </w:r>
-      <w:proofErr w:type="spellStart"/>
-      <w:r>
-        <w:rPr>
-          <w:rFonts w:eastAsia="TimesNewRomanPSMT"/>
-        </w:rPr>
-        <w:t>vostendiges</w:t>
-      </w:r>
-      <w:proofErr w:type="spellEnd"/>
-      <w:r>
-        <w:rPr>
-          <w:rFonts w:eastAsia="TimesNewRomanPSMT"/>
-        </w:rPr>
-        <w:t xml:space="preserve"> leitend werden durch </w:t>
-      </w:r>
-      <w:proofErr w:type="spellStart"/>
-      <w:r>
-        <w:rPr>
-          <w:rFonts w:eastAsia="TimesNewRomanPSMT"/>
-        </w:rPr>
-        <w:t>verschiebung</w:t>
-      </w:r>
-      <w:proofErr w:type="spellEnd"/>
-      <w:r>
-        <w:rPr>
-          <w:rFonts w:eastAsia="TimesNewRomanPSMT"/>
-        </w:rPr>
-        <w:t xml:space="preserve"> der </w:t>
-      </w:r>
-      <w:r>
-        <w:rPr>
-          <w:rFonts w:eastAsia="TimesNewRomanPSMT"/>
-        </w:rPr>
-        <w:t xml:space="preserve">VTH. Die relevanten Parameter der Angepeilten </w:t>
-      </w:r>
-      <w:proofErr w:type="spellStart"/>
-      <w:r>
-        <w:rPr>
-          <w:rFonts w:eastAsia="TimesNewRomanPSMT"/>
-        </w:rPr>
-        <w:t>messungen</w:t>
-      </w:r>
-      <w:proofErr w:type="spellEnd"/>
-      <w:r>
-        <w:rPr>
-          <w:rFonts w:eastAsia="TimesNewRomanPSMT"/>
-        </w:rPr>
-        <w:t xml:space="preserve"> ist die </w:t>
-      </w:r>
-      <w:r>
-        <w:rPr>
-          <w:rFonts w:eastAsia="TimesNewRomanPSMT"/>
-        </w:rPr>
-        <w:t xml:space="preserve">IDVG, </w:t>
-      </w:r>
-      <w:r>
-        <w:rPr>
-          <w:rFonts w:eastAsia="TimesNewRomanPSMT"/>
-        </w:rPr>
-        <w:t>VTH</w:t>
-      </w:r>
-      <w:r>
-        <w:rPr>
-          <w:rFonts w:eastAsia="TimesNewRomanPSMT"/>
-        </w:rPr>
-        <w:t xml:space="preserve">, RDS, das RTN und deren </w:t>
-      </w:r>
-      <w:proofErr w:type="spellStart"/>
-      <w:r>
-        <w:rPr>
-          <w:rFonts w:eastAsia="TimesNewRomanPSMT"/>
-        </w:rPr>
-        <w:t>verschiebung</w:t>
-      </w:r>
-      <w:proofErr w:type="spellEnd"/>
-      <w:r>
-        <w:rPr>
-          <w:rFonts w:eastAsia="TimesNewRomanPSMT"/>
-        </w:rPr>
-        <w:t xml:space="preserve"> bei einem MSM verfahren.</w:t>
+        <w:t>, RDS, das RTN und deren verschiebung bei einem MSM verfahren.</w:t>
       </w:r>
     </w:p>
     <w:p>
@@ -3251,106 +2279,24 @@
       </w:r>
     </w:p>
     <w:p>
-      <w:proofErr w:type="gramStart"/>
-      <w:r>
-        <w:t>Das bestimmen</w:t>
-      </w:r>
-      <w:proofErr w:type="gramEnd"/>
-      <w:r>
-        <w:t xml:space="preserve"> der genannten </w:t>
-      </w:r>
-      <w:proofErr w:type="spellStart"/>
-      <w:r>
-        <w:t>parameter</w:t>
-      </w:r>
-      <w:proofErr w:type="spellEnd"/>
-      <w:r>
-        <w:t xml:space="preserve"> ist </w:t>
-      </w:r>
-      <w:r>
-        <w:t xml:space="preserve">möglich über </w:t>
-      </w:r>
-      <w:proofErr w:type="gramStart"/>
-      <w:r>
-        <w:t xml:space="preserve">das </w:t>
-      </w:r>
-      <w:proofErr w:type="spellStart"/>
-      <w:r>
-        <w:t>einstellen</w:t>
-      </w:r>
-      <w:proofErr w:type="spellEnd"/>
-      <w:proofErr w:type="gramEnd"/>
-      <w:r>
-        <w:t xml:space="preserve"> </w:t>
-      </w:r>
-      <w:r>
-        <w:t xml:space="preserve">der Drain und Gate </w:t>
-      </w:r>
-      <w:proofErr w:type="spellStart"/>
-      <w:r>
-        <w:t>spannung</w:t>
-      </w:r>
-      <w:proofErr w:type="spellEnd"/>
-      <w:r>
-        <w:t xml:space="preserve"> und </w:t>
-      </w:r>
-      <w:proofErr w:type="gramStart"/>
-      <w:r>
-        <w:t>dem messen</w:t>
-      </w:r>
-      <w:proofErr w:type="gramEnd"/>
-      <w:r>
-        <w:t xml:space="preserve"> des resultierenden Drain Source Stromes.</w:t>
-      </w:r>
-    </w:p>
-    <w:p>
-      <w:r>
-        <w:t xml:space="preserve">Eine IDVG kann erstellt </w:t>
-      </w:r>
-      <w:proofErr w:type="gramStart"/>
-      <w:r>
-        <w:t>werden</w:t>
-      </w:r>
-      <w:proofErr w:type="gramEnd"/>
-      <w:r>
-        <w:t xml:space="preserve"> indem eine fixe Drain </w:t>
-      </w:r>
-      <w:proofErr w:type="spellStart"/>
-      <w:r>
-        <w:t>spannung</w:t>
-      </w:r>
-      <w:proofErr w:type="spellEnd"/>
-      <w:r>
-        <w:t xml:space="preserve"> am DUT angelegt wird und die </w:t>
-      </w:r>
-      <w:proofErr w:type="spellStart"/>
-      <w:r>
-        <w:t>gate</w:t>
-      </w:r>
-      <w:proofErr w:type="spellEnd"/>
-      <w:r>
-        <w:t xml:space="preserve"> </w:t>
-      </w:r>
-      <w:proofErr w:type="spellStart"/>
-      <w:r>
-        <w:t>spannung</w:t>
-      </w:r>
-      <w:proofErr w:type="spellEnd"/>
-      <w:r>
-        <w:t xml:space="preserve"> variiert wird und der Drain Source Current aufgezeichnet wird.</w:t>
-      </w:r>
-    </w:p>
-    <w:p>
-      <w:r>
-        <w:t xml:space="preserve">Die VTH kann bestimmt werden durch die </w:t>
-      </w:r>
-      <w:proofErr w:type="spellStart"/>
-      <w:r>
-        <w:t>analyse</w:t>
-      </w:r>
-      <w:proofErr w:type="spellEnd"/>
-      <w:r>
-        <w:t xml:space="preserve"> einer IDVG. </w:t>
+      <w:r>
+        <w:t xml:space="preserve">Das bestimmen der genannten parameter ist </w:t>
+      </w:r>
+      <w:r>
+        <w:t xml:space="preserve">möglich über das einstellen </w:t>
+      </w:r>
+      <w:r>
+        <w:t>der Drain und Gate spannung und dem messen des resultierenden Drain Source Stromes.</w:t>
+      </w:r>
+    </w:p>
+    <w:p>
+      <w:r>
+        <w:t>Eine IDVG kann erstellt werden indem eine fixe Drain spannung am DUT angelegt wird und die gate spannung variiert wird und der Drain Source Current aufgezeichnet wird.</w:t>
+      </w:r>
+    </w:p>
+    <w:p>
+      <w:r>
+        <w:t xml:space="preserve">Die VTH kann bestimmt werden durch die analyse einer IDVG. </w:t>
       </w:r>
     </w:p>
     <w:p>
@@ -3358,249 +2304,21 @@
         <w:t xml:space="preserve">Der RDS kann </w:t>
       </w:r>
       <w:r>
-        <w:t xml:space="preserve">durch die </w:t>
-      </w:r>
-      <w:proofErr w:type="spellStart"/>
-      <w:r>
-        <w:t>steigung</w:t>
-      </w:r>
-      <w:proofErr w:type="spellEnd"/>
-      <w:r>
-        <w:t xml:space="preserve"> der </w:t>
-      </w:r>
-      <w:proofErr w:type="spellStart"/>
-      <w:r>
-        <w:t>kennlienen</w:t>
-      </w:r>
-      <w:proofErr w:type="spellEnd"/>
-      <w:r>
-        <w:t xml:space="preserve"> in einem </w:t>
-      </w:r>
-      <w:proofErr w:type="spellStart"/>
-      <w:r>
-        <w:t>Ausgagngskannlienen</w:t>
-      </w:r>
-      <w:proofErr w:type="spellEnd"/>
-      <w:r>
-        <w:t xml:space="preserve"> </w:t>
-      </w:r>
-      <w:proofErr w:type="spellStart"/>
-      <w:r>
-        <w:t>feld</w:t>
-      </w:r>
-      <w:proofErr w:type="spellEnd"/>
-      <w:r>
-        <w:t xml:space="preserve"> bestimmt werden.</w:t>
+        <w:t>durch die steigung der kennlienen in einem Ausgagngskannlienen feld bestimmt werden.</w:t>
       </w:r>
     </w:p>
     <w:p>
       <w:r>
         <w:lastRenderedPageBreak/>
-        <w:t xml:space="preserve">Ein </w:t>
-      </w:r>
-      <w:proofErr w:type="spellStart"/>
-      <w:r>
-        <w:t>Ausgangskannlinenfeld</w:t>
-      </w:r>
-      <w:proofErr w:type="spellEnd"/>
-      <w:r>
-        <w:t xml:space="preserve"> kann erstellt werden durch </w:t>
-      </w:r>
-      <w:proofErr w:type="gramStart"/>
-      <w:r>
-        <w:t xml:space="preserve">das </w:t>
-      </w:r>
-      <w:proofErr w:type="spellStart"/>
-      <w:r>
-        <w:t>anlegen</w:t>
-      </w:r>
-      <w:proofErr w:type="spellEnd"/>
-      <w:proofErr w:type="gramEnd"/>
-      <w:r>
-        <w:t xml:space="preserve"> einer bestimmten Gate </w:t>
-      </w:r>
-      <w:proofErr w:type="spellStart"/>
-      <w:r>
-        <w:t>spannung</w:t>
-      </w:r>
-      <w:proofErr w:type="spellEnd"/>
-      <w:r>
-        <w:t xml:space="preserve"> und </w:t>
-      </w:r>
-      <w:proofErr w:type="gramStart"/>
-      <w:r>
-        <w:t>dem variieren</w:t>
-      </w:r>
-      <w:proofErr w:type="gramEnd"/>
-      <w:r>
-        <w:t xml:space="preserve"> der Drain </w:t>
-      </w:r>
-      <w:proofErr w:type="spellStart"/>
-      <w:r>
-        <w:t>spannung</w:t>
-      </w:r>
-      <w:proofErr w:type="spellEnd"/>
-      <w:r>
-        <w:t xml:space="preserve"> und der </w:t>
-      </w:r>
-      <w:proofErr w:type="spellStart"/>
-      <w:r>
-        <w:t>aufzeichung</w:t>
-      </w:r>
-      <w:proofErr w:type="spellEnd"/>
-      <w:r>
-        <w:t xml:space="preserve"> des</w:t>
-      </w:r>
-      <w:r>
-        <w:t xml:space="preserve"> Drain Source </w:t>
-      </w:r>
-      <w:proofErr w:type="spellStart"/>
-      <w:r>
-        <w:t>Currents</w:t>
-      </w:r>
-      <w:proofErr w:type="spellEnd"/>
-      <w:r>
-        <w:t xml:space="preserve">. </w:t>
-      </w:r>
-    </w:p>
-    <w:p>
-      <w:r>
-        <w:t xml:space="preserve">RTN kann analysiert werden durch </w:t>
-      </w:r>
-      <w:proofErr w:type="gramStart"/>
-      <w:r>
-        <w:t xml:space="preserve">das </w:t>
-      </w:r>
-      <w:proofErr w:type="spellStart"/>
-      <w:r>
-        <w:t>anlegen</w:t>
-      </w:r>
-      <w:proofErr w:type="spellEnd"/>
-      <w:proofErr w:type="gramEnd"/>
-      <w:r>
-        <w:t xml:space="preserve"> einer Gate </w:t>
-      </w:r>
-      <w:proofErr w:type="spellStart"/>
-      <w:r>
-        <w:t>spannung</w:t>
-      </w:r>
-      <w:proofErr w:type="spellEnd"/>
-      <w:r>
-        <w:t xml:space="preserve"> biss ein gewünschter drain source </w:t>
-      </w:r>
-      <w:proofErr w:type="spellStart"/>
-      <w:r>
-        <w:t>current</w:t>
-      </w:r>
-      <w:proofErr w:type="spellEnd"/>
-      <w:r>
-        <w:t xml:space="preserve"> erreicht ist, dieser wird über die </w:t>
-      </w:r>
-      <w:proofErr w:type="spellStart"/>
-      <w:r>
-        <w:t>gesamnmte</w:t>
-      </w:r>
-      <w:proofErr w:type="spellEnd"/>
-      <w:r>
-        <w:t xml:space="preserve"> </w:t>
-      </w:r>
-      <w:proofErr w:type="spellStart"/>
-      <w:r>
-        <w:t>messung</w:t>
-      </w:r>
-      <w:proofErr w:type="spellEnd"/>
-      <w:r>
-        <w:t xml:space="preserve"> fix gehalten. Bei dieser </w:t>
-      </w:r>
-      <w:proofErr w:type="spellStart"/>
-      <w:r>
-        <w:t>messung</w:t>
-      </w:r>
-      <w:proofErr w:type="spellEnd"/>
-      <w:r>
-        <w:t xml:space="preserve"> sind </w:t>
-      </w:r>
-      <w:proofErr w:type="spellStart"/>
-      <w:r>
-        <w:t>absulute</w:t>
-      </w:r>
-      <w:proofErr w:type="spellEnd"/>
-      <w:r>
-        <w:t xml:space="preserve"> source </w:t>
-      </w:r>
-      <w:proofErr w:type="spellStart"/>
-      <w:r>
-        <w:t>current</w:t>
-      </w:r>
-      <w:proofErr w:type="spellEnd"/>
-      <w:r>
-        <w:t xml:space="preserve"> werte nicht im </w:t>
-      </w:r>
-      <w:proofErr w:type="spellStart"/>
-      <w:r>
-        <w:t>haupt</w:t>
-      </w:r>
-      <w:proofErr w:type="spellEnd"/>
-      <w:r>
-        <w:t xml:space="preserve"> </w:t>
-      </w:r>
-      <w:proofErr w:type="spellStart"/>
-      <w:proofErr w:type="gramStart"/>
-      <w:r>
-        <w:t>fokus</w:t>
-      </w:r>
-      <w:proofErr w:type="spellEnd"/>
-      <w:proofErr w:type="gramEnd"/>
-      <w:r>
-        <w:t xml:space="preserve"> sondern der </w:t>
-      </w:r>
-      <w:proofErr w:type="spellStart"/>
-      <w:r>
-        <w:t>unterschied</w:t>
-      </w:r>
-      <w:proofErr w:type="spellEnd"/>
-      <w:r>
-        <w:t xml:space="preserve"> zwischen den </w:t>
-      </w:r>
-      <w:proofErr w:type="spellStart"/>
-      <w:r>
-        <w:t>strom</w:t>
-      </w:r>
-      <w:proofErr w:type="spellEnd"/>
-      <w:r>
-        <w:t xml:space="preserve"> </w:t>
-      </w:r>
-      <w:proofErr w:type="spellStart"/>
-      <w:r>
-        <w:t>nivos</w:t>
-      </w:r>
-      <w:proofErr w:type="spellEnd"/>
-      <w:r>
-        <w:t xml:space="preserve"> des </w:t>
-      </w:r>
-      <w:proofErr w:type="spellStart"/>
-      <w:r>
-        <w:t>stromes</w:t>
-      </w:r>
-      <w:proofErr w:type="spellEnd"/>
-      <w:r>
-        <w:t xml:space="preserve"> bei einem absorbierten als auch </w:t>
-      </w:r>
-      <w:proofErr w:type="spellStart"/>
-      <w:r>
-        <w:t>emitierten</w:t>
-      </w:r>
-      <w:proofErr w:type="spellEnd"/>
-      <w:r>
-        <w:t xml:space="preserve"> </w:t>
-      </w:r>
-      <w:proofErr w:type="spellStart"/>
-      <w:r>
-        <w:t>lkadungsrträger</w:t>
-      </w:r>
-      <w:proofErr w:type="spellEnd"/>
-      <w:r>
-        <w:t>.</w:t>
+        <w:t>Ein Ausgangskannlinenfeld kann erstellt werden durch das anlegen einer bestimmten Gate spannung und dem variieren der Drain spannung und der aufzeichung des</w:t>
+      </w:r>
+      <w:r>
+        <w:t xml:space="preserve"> Drain Source Currents. </w:t>
+      </w:r>
+    </w:p>
+    <w:p>
+      <w:r>
+        <w:t>RTN kann analysiert werden durch das anlegen einer Gate spannung biss ein gewünschter drain source current erreicht ist, dieser wird über die gesamnmte messung fix gehalten. Bei dieser messung sind absulute source current werte nicht im haupt fokus sondern der unterschied zwischen den strom nivos des stromes bei einem absorbierten als auch emitierten lkadungsrträger.</w:t>
       </w:r>
     </w:p>
     <w:p/>
@@ -3613,415 +2331,19 @@
       </w:r>
     </w:p>
     <w:p>
-      <w:proofErr w:type="gramStart"/>
-      <w:r>
-        <w:t>Das messen</w:t>
-      </w:r>
-      <w:proofErr w:type="gramEnd"/>
-      <w:r>
-        <w:t xml:space="preserve"> des drain Source Current würde auf mehrere weisen funktionieren</w:t>
-      </w:r>
-      <w:r>
-        <w:t xml:space="preserve">, mithilfe von </w:t>
-      </w:r>
-      <w:proofErr w:type="spellStart"/>
-      <w:r>
-        <w:t>jall</w:t>
-      </w:r>
-      <w:proofErr w:type="spellEnd"/>
-      <w:r>
-        <w:t xml:space="preserve"> </w:t>
-      </w:r>
-      <w:proofErr w:type="spellStart"/>
-      <w:r>
-        <w:t>sensoren</w:t>
-      </w:r>
-      <w:proofErr w:type="spellEnd"/>
-      <w:r>
-        <w:t xml:space="preserve">, einer OPV </w:t>
-      </w:r>
-      <w:proofErr w:type="spellStart"/>
-      <w:r>
-        <w:t>Intehratorschaltung</w:t>
-      </w:r>
-      <w:proofErr w:type="spellEnd"/>
-      <w:r>
-        <w:t xml:space="preserve">, einem schalt </w:t>
-      </w:r>
-      <w:proofErr w:type="gramStart"/>
-      <w:r>
-        <w:t>wiederstand</w:t>
-      </w:r>
-      <w:proofErr w:type="gramEnd"/>
-      <w:r>
-        <w:t xml:space="preserve"> und den </w:t>
-      </w:r>
-      <w:proofErr w:type="spellStart"/>
-      <w:r>
-        <w:t>spannungsabfall</w:t>
-      </w:r>
-      <w:proofErr w:type="spellEnd"/>
-      <w:r>
-        <w:t xml:space="preserve"> </w:t>
-      </w:r>
-      <w:proofErr w:type="spellStart"/>
-      <w:r>
-        <w:t>andiesem</w:t>
-      </w:r>
-      <w:proofErr w:type="spellEnd"/>
-      <w:r>
-        <w:t xml:space="preserve"> allerdings bieten diese </w:t>
-      </w:r>
-      <w:proofErr w:type="spellStart"/>
-      <w:r>
-        <w:t>möglichzeiten</w:t>
-      </w:r>
-      <w:proofErr w:type="spellEnd"/>
-      <w:r>
-        <w:t xml:space="preserve"> </w:t>
-      </w:r>
-      <w:proofErr w:type="spellStart"/>
-      <w:proofErr w:type="gramStart"/>
-      <w:r>
-        <w:t>nachteile</w:t>
-      </w:r>
-      <w:proofErr w:type="spellEnd"/>
-      <w:proofErr w:type="gramEnd"/>
-      <w:r>
-        <w:t xml:space="preserve"> wenn es entweder </w:t>
-      </w:r>
-      <w:proofErr w:type="spellStart"/>
-      <w:r>
-        <w:t>un</w:t>
-      </w:r>
-      <w:proofErr w:type="spellEnd"/>
-      <w:r>
-        <w:t xml:space="preserve"> den </w:t>
-      </w:r>
-      <w:proofErr w:type="spellStart"/>
-      <w:r>
-        <w:t>nano</w:t>
-      </w:r>
-      <w:proofErr w:type="spellEnd"/>
-      <w:r>
-        <w:t xml:space="preserve"> </w:t>
-      </w:r>
-      <w:proofErr w:type="spellStart"/>
-      <w:r>
-        <w:t>Ampereberichcj</w:t>
-      </w:r>
-      <w:proofErr w:type="spellEnd"/>
-      <w:r>
-        <w:t xml:space="preserve"> </w:t>
-      </w:r>
-      <w:proofErr w:type="spellStart"/>
-      <w:r>
-        <w:t>hejt</w:t>
-      </w:r>
-      <w:proofErr w:type="spellEnd"/>
-      <w:r>
-        <w:t xml:space="preserve"> oder in der sample </w:t>
-      </w:r>
-      <w:proofErr w:type="spellStart"/>
-      <w:r>
-        <w:t>grequenz</w:t>
-      </w:r>
-      <w:proofErr w:type="spellEnd"/>
-      <w:r>
-        <w:t xml:space="preserve">. Ein </w:t>
-      </w:r>
-      <w:proofErr w:type="spellStart"/>
-      <w:r>
-        <w:t>hallsensor</w:t>
-      </w:r>
-      <w:proofErr w:type="spellEnd"/>
-      <w:r>
-        <w:t xml:space="preserve"> bietet nicht die nötige </w:t>
-      </w:r>
-      <w:proofErr w:type="spellStart"/>
-      <w:r>
-        <w:t>auflösing</w:t>
-      </w:r>
-      <w:proofErr w:type="spellEnd"/>
-      <w:r>
-        <w:t xml:space="preserve"> bei </w:t>
-      </w:r>
-      <w:proofErr w:type="spellStart"/>
-      <w:proofErr w:type="gramStart"/>
-      <w:r>
-        <w:t>nano</w:t>
-      </w:r>
-      <w:proofErr w:type="spellEnd"/>
-      <w:r>
-        <w:t xml:space="preserve"> Ampere</w:t>
-      </w:r>
-      <w:proofErr w:type="gramEnd"/>
-      <w:r>
-        <w:t xml:space="preserve"> und kann </w:t>
-      </w:r>
-      <w:proofErr w:type="spellStart"/>
-      <w:r>
-        <w:t>zustag</w:t>
-      </w:r>
-      <w:proofErr w:type="spellEnd"/>
-      <w:r>
-        <w:t xml:space="preserve"> von </w:t>
-      </w:r>
-      <w:proofErr w:type="spellStart"/>
-      <w:r>
-        <w:t>aiseren</w:t>
-      </w:r>
-      <w:proofErr w:type="spellEnd"/>
-      <w:r>
-        <w:t xml:space="preserve"> </w:t>
-      </w:r>
-      <w:proofErr w:type="spellStart"/>
-      <w:r>
-        <w:t>einflussen</w:t>
-      </w:r>
-      <w:proofErr w:type="spellEnd"/>
-      <w:r>
-        <w:t xml:space="preserve"> beeinflusst werden. ein OPV </w:t>
-      </w:r>
-      <w:proofErr w:type="spellStart"/>
-      <w:r>
-        <w:t>intehrator</w:t>
-      </w:r>
-      <w:proofErr w:type="spellEnd"/>
-      <w:r>
-        <w:t xml:space="preserve"> </w:t>
-      </w:r>
-      <w:proofErr w:type="spellStart"/>
-      <w:r>
-        <w:t>schaltkeis</w:t>
-      </w:r>
-      <w:proofErr w:type="spellEnd"/>
-      <w:r>
-        <w:t xml:space="preserve"> bietet die nötige </w:t>
-      </w:r>
-      <w:proofErr w:type="spellStart"/>
-      <w:r>
-        <w:t>auflösung</w:t>
-      </w:r>
-      <w:proofErr w:type="spellEnd"/>
-      <w:r>
-        <w:t xml:space="preserve"> in </w:t>
-      </w:r>
-      <w:proofErr w:type="spellStart"/>
-      <w:r>
-        <w:t>nA</w:t>
-      </w:r>
-      <w:proofErr w:type="spellEnd"/>
-      <w:r>
-        <w:t xml:space="preserve"> </w:t>
-      </w:r>
-      <w:proofErr w:type="spellStart"/>
-      <w:r>
-        <w:t>bereich</w:t>
-      </w:r>
-      <w:proofErr w:type="spellEnd"/>
-      <w:r>
-        <w:t xml:space="preserve"> doch biestet nicht eine </w:t>
-      </w:r>
-      <w:proofErr w:type="spellStart"/>
-      <w:r>
-        <w:t>braicjbare</w:t>
-      </w:r>
-      <w:proofErr w:type="spellEnd"/>
-      <w:r>
-        <w:t xml:space="preserve"> sample </w:t>
-      </w:r>
-      <w:proofErr w:type="spellStart"/>
-      <w:r>
-        <w:t>frequenz</w:t>
-      </w:r>
-      <w:proofErr w:type="spellEnd"/>
-      <w:r>
-        <w:t xml:space="preserve">. Bei einem Schant </w:t>
-      </w:r>
-      <w:proofErr w:type="gramStart"/>
-      <w:r>
-        <w:t>wiederstand</w:t>
-      </w:r>
-      <w:proofErr w:type="gramEnd"/>
-      <w:r>
-        <w:t xml:space="preserve"> wird der </w:t>
-      </w:r>
-      <w:proofErr w:type="spellStart"/>
-      <w:r>
-        <w:t>spannungs</w:t>
-      </w:r>
-      <w:proofErr w:type="spellEnd"/>
-      <w:r>
-        <w:t xml:space="preserve"> </w:t>
-      </w:r>
-      <w:proofErr w:type="spellStart"/>
-      <w:r>
-        <w:t>abfall</w:t>
-      </w:r>
-      <w:proofErr w:type="spellEnd"/>
-      <w:r>
-        <w:t xml:space="preserve"> gemessen dich dieser verschiebt je nach source </w:t>
-      </w:r>
-      <w:proofErr w:type="spellStart"/>
-      <w:r>
-        <w:t>current</w:t>
-      </w:r>
-      <w:proofErr w:type="spellEnd"/>
-      <w:r>
-        <w:t xml:space="preserve"> die Drain source </w:t>
-      </w:r>
-      <w:proofErr w:type="spellStart"/>
-      <w:r>
-        <w:t>soannung</w:t>
-      </w:r>
-      <w:proofErr w:type="spellEnd"/>
-      <w:r>
-        <w:t xml:space="preserve"> dieses musste </w:t>
-      </w:r>
-      <w:proofErr w:type="spellStart"/>
-      <w:r>
-        <w:t>kommpensiert</w:t>
-      </w:r>
-      <w:proofErr w:type="spellEnd"/>
-      <w:r>
-        <w:t xml:space="preserve"> </w:t>
-      </w:r>
-      <w:proofErr w:type="gramStart"/>
-      <w:r>
-        <w:t>werden</w:t>
-      </w:r>
-      <w:proofErr w:type="gramEnd"/>
-      <w:r>
-        <w:t xml:space="preserve"> denn dies w</w:t>
-      </w:r>
-      <w:r>
-        <w:t xml:space="preserve">ürde wie eine </w:t>
-      </w:r>
-      <w:proofErr w:type="spellStart"/>
-      <w:r>
-        <w:t>strom</w:t>
-      </w:r>
-      <w:proofErr w:type="spellEnd"/>
-      <w:r>
-        <w:t xml:space="preserve"> </w:t>
-      </w:r>
-      <w:proofErr w:type="spellStart"/>
-      <w:r>
-        <w:t>gegenkoppplung</w:t>
-      </w:r>
-      <w:proofErr w:type="spellEnd"/>
-      <w:r>
-        <w:t xml:space="preserve"> wirken. </w:t>
-      </w:r>
-    </w:p>
-    <w:p>
-      <w:r>
-        <w:t xml:space="preserve">Eine </w:t>
-      </w:r>
-      <w:proofErr w:type="spellStart"/>
-      <w:r>
-        <w:t>schaltunf</w:t>
-      </w:r>
-      <w:proofErr w:type="spellEnd"/>
-      <w:r>
-        <w:t xml:space="preserve"> die </w:t>
-      </w:r>
-      <w:proofErr w:type="spellStart"/>
-      <w:r>
-        <w:t>offt</w:t>
-      </w:r>
-      <w:proofErr w:type="spellEnd"/>
-      <w:r>
-        <w:t xml:space="preserve"> für </w:t>
-      </w:r>
-      <w:proofErr w:type="spellStart"/>
-      <w:r>
-        <w:t>nano</w:t>
-      </w:r>
-      <w:proofErr w:type="spellEnd"/>
-      <w:r>
-        <w:t xml:space="preserve"> </w:t>
-      </w:r>
-      <w:proofErr w:type="spellStart"/>
-      <w:r>
-        <w:t>amperströme</w:t>
-      </w:r>
-      <w:proofErr w:type="spellEnd"/>
-      <w:r>
-        <w:t xml:space="preserve"> verwendet wird, </w:t>
-      </w:r>
-      <w:proofErr w:type="spellStart"/>
-      <w:r>
-        <w:t>im</w:t>
-      </w:r>
-      <w:proofErr w:type="spellEnd"/>
-      <w:r>
-        <w:t xml:space="preserve"> </w:t>
-      </w:r>
-      <w:proofErr w:type="spellStart"/>
-      <w:r>
-        <w:t>bezug</w:t>
-      </w:r>
-      <w:proofErr w:type="spellEnd"/>
-      <w:r>
-        <w:t xml:space="preserve"> auf </w:t>
-      </w:r>
-      <w:proofErr w:type="gramStart"/>
-      <w:r>
-        <w:t>das verstärken</w:t>
-      </w:r>
-      <w:proofErr w:type="gramEnd"/>
-      <w:r>
-        <w:t xml:space="preserve"> von </w:t>
-      </w:r>
-      <w:proofErr w:type="spellStart"/>
-      <w:r>
-        <w:t>photodioden</w:t>
-      </w:r>
-      <w:proofErr w:type="spellEnd"/>
-      <w:r>
-        <w:t xml:space="preserve">, ein </w:t>
-      </w:r>
-      <w:proofErr w:type="spellStart"/>
-      <w:r>
-        <w:t>Tranzimpedanz</w:t>
-      </w:r>
-      <w:proofErr w:type="spellEnd"/>
-      <w:r>
-        <w:t xml:space="preserve"> </w:t>
-      </w:r>
-      <w:proofErr w:type="spellStart"/>
-      <w:r>
-        <w:t>wadler</w:t>
-      </w:r>
-      <w:proofErr w:type="spellEnd"/>
-      <w:r>
-        <w:t xml:space="preserve">. Dieser misst den </w:t>
-      </w:r>
-      <w:proofErr w:type="spellStart"/>
-      <w:r>
-        <w:t>spannungsabfall</w:t>
-      </w:r>
-      <w:proofErr w:type="spellEnd"/>
-      <w:r>
-        <w:t xml:space="preserve"> über </w:t>
-      </w:r>
-      <w:proofErr w:type="spellStart"/>
-      <w:r>
-        <w:t>einenhohen</w:t>
-      </w:r>
-      <w:proofErr w:type="spellEnd"/>
-      <w:r>
-        <w:t xml:space="preserve"> </w:t>
-      </w:r>
-      <w:proofErr w:type="spellStart"/>
-      <w:r>
-        <w:t>feadbackwiederstand</w:t>
-      </w:r>
-      <w:proofErr w:type="spellEnd"/>
-      <w:r>
-        <w:t>.</w:t>
+      <w:r>
+        <w:t>Das messen des drain Source Current würde auf mehrere weisen funktionieren</w:t>
+      </w:r>
+      <w:r>
+        <w:t>, mithilfe von jall sensoren, einer OPV Intehratorschaltung, einem schalt wiederstand und den spannungsabfall andiesem allerdings bieten diese möglichzeiten nachteile wenn es entweder un den nano Ampereberichcj hejt oder in der sample grequenz. Ein hallsensor bietet nicht die nötige auflösing bei nano Ampere und kann zustag von aiseren einflussen beeinflusst werden. ein OPV intehrator schaltkeis bietet die nötige auflösung in nA bereich doch biestet nicht eine braicjbare sample frequenz. Bei einem Schant wiederstand wird der spannungs abfall gemessen dich dieser verschiebt je nach source current die Drain source soannung dieses musste kommpensiert werden denn dies w</w:t>
+      </w:r>
+      <w:r>
+        <w:t xml:space="preserve">ürde wie eine strom gegenkoppplung wirken. </w:t>
+      </w:r>
+    </w:p>
+    <w:p>
+      <w:r>
+        <w:t>Eine schaltunf die offt für nano amperströme verwendet wird, im bezug auf das verstärken von photodioden, ein Tranzimpedanz wadler. Dieser misst den spannungsabfall über einenhohen feadbackwiederstand.</w:t>
       </w:r>
     </w:p>
     <w:p>
@@ -4112,95 +2434,7 @@
     </w:p>
     <w:p>
       <w:r>
-        <w:t xml:space="preserve">Diese Schaltung bietet unter den richtigen </w:t>
-      </w:r>
-      <w:proofErr w:type="spellStart"/>
-      <w:r>
-        <w:t>bedingungen</w:t>
-      </w:r>
-      <w:proofErr w:type="spellEnd"/>
-      <w:r>
-        <w:t xml:space="preserve"> eine hohe samplerate, bis zu </w:t>
-      </w:r>
-      <w:proofErr w:type="spellStart"/>
-      <w:r>
-        <w:t>mehrerren</w:t>
-      </w:r>
-      <w:proofErr w:type="spellEnd"/>
-      <w:r>
-        <w:t xml:space="preserve"> kHz. Eines der größeren </w:t>
-      </w:r>
-      <w:proofErr w:type="spellStart"/>
-      <w:r>
-        <w:t>probleme</w:t>
-      </w:r>
-      <w:proofErr w:type="spellEnd"/>
-      <w:r>
-        <w:t xml:space="preserve"> ist </w:t>
-      </w:r>
-      <w:proofErr w:type="spellStart"/>
-      <w:r>
-        <w:t>unterandeerem</w:t>
-      </w:r>
-      <w:proofErr w:type="spellEnd"/>
-      <w:r>
-        <w:t xml:space="preserve"> die Granz als auch </w:t>
-      </w:r>
-      <w:proofErr w:type="spellStart"/>
-      <w:r>
-        <w:t>polefrquenzen</w:t>
-      </w:r>
-      <w:proofErr w:type="spellEnd"/>
-      <w:r>
-        <w:t xml:space="preserve"> und </w:t>
-      </w:r>
-      <w:proofErr w:type="gramStart"/>
-      <w:r>
-        <w:t>das thermische rauschen</w:t>
-      </w:r>
-      <w:proofErr w:type="gramEnd"/>
-      <w:r>
-        <w:t xml:space="preserve"> des </w:t>
-      </w:r>
-      <w:proofErr w:type="spellStart"/>
-      <w:r>
-        <w:t>Feadback</w:t>
-      </w:r>
-      <w:proofErr w:type="spellEnd"/>
-      <w:r>
-        <w:t xml:space="preserve"> </w:t>
-      </w:r>
-      <w:proofErr w:type="spellStart"/>
-      <w:r>
-        <w:t>wiederstandes</w:t>
-      </w:r>
-      <w:proofErr w:type="spellEnd"/>
-      <w:r>
-        <w:t xml:space="preserve"> </w:t>
-      </w:r>
-      <w:proofErr w:type="spellStart"/>
-      <w:r>
-        <w:t>begrenst</w:t>
-      </w:r>
-      <w:proofErr w:type="spellEnd"/>
-      <w:r>
-        <w:t xml:space="preserve"> die </w:t>
-      </w:r>
-      <w:proofErr w:type="spellStart"/>
-      <w:r>
-        <w:t>auflösung</w:t>
-      </w:r>
-      <w:proofErr w:type="spellEnd"/>
-      <w:r>
-        <w:t xml:space="preserve"> der </w:t>
-      </w:r>
-      <w:proofErr w:type="spellStart"/>
-      <w:r>
-        <w:t>schaltung</w:t>
-      </w:r>
-      <w:proofErr w:type="spellEnd"/>
-      <w:r>
-        <w:t>.</w:t>
+        <w:t>Diese Schaltung bietet unter den richtigen bedingungen eine hohe samplerate, bis zu mehrerren kHz. Eines der größeren probleme ist unterandeerem die Granz als auch polefrquenzen und das thermische rauschen des Feadback wiederstandes begrenst die auflösung der schaltung.</w:t>
       </w:r>
     </w:p>
     <w:p>
@@ -4265,283 +2499,22 @@
     </w:p>
     <w:p>
       <w:r>
-        <w:t xml:space="preserve">Dies ist der Grobe </w:t>
-      </w:r>
-      <w:proofErr w:type="spellStart"/>
-      <w:r>
-        <w:t>aufbau</w:t>
-      </w:r>
-      <w:proofErr w:type="spellEnd"/>
-      <w:r>
-        <w:t xml:space="preserve"> um eine Variable Drain und Gate </w:t>
-      </w:r>
-      <w:proofErr w:type="spellStart"/>
-      <w:r>
-        <w:t>spannung</w:t>
-      </w:r>
-      <w:proofErr w:type="spellEnd"/>
-      <w:r>
-        <w:t xml:space="preserve"> als auch eine </w:t>
-      </w:r>
-      <w:proofErr w:type="spellStart"/>
-      <w:r>
-        <w:t>messung</w:t>
-      </w:r>
-      <w:proofErr w:type="spellEnd"/>
-      <w:r>
-        <w:t xml:space="preserve"> </w:t>
-      </w:r>
-      <w:r>
-        <w:t xml:space="preserve">des </w:t>
-      </w:r>
-      <w:proofErr w:type="spellStart"/>
-      <w:r>
-        <w:t>soruce</w:t>
-      </w:r>
-      <w:proofErr w:type="spellEnd"/>
-      <w:r>
-        <w:t xml:space="preserve"> </w:t>
-      </w:r>
-      <w:proofErr w:type="spellStart"/>
-      <w:r>
-        <w:t>stromes</w:t>
-      </w:r>
-      <w:proofErr w:type="spellEnd"/>
-      <w:r>
-        <w:t xml:space="preserve">. Der </w:t>
-      </w:r>
-      <w:proofErr w:type="spellStart"/>
-      <w:r>
-        <w:t>I_Sorce</w:t>
-      </w:r>
-      <w:proofErr w:type="spellEnd"/>
-      <w:r>
-        <w:t xml:space="preserve"> fliest gegen ein </w:t>
-      </w:r>
-      <w:proofErr w:type="spellStart"/>
-      <w:r>
-        <w:t>phantom</w:t>
-      </w:r>
-      <w:proofErr w:type="spellEnd"/>
-      <w:r>
-        <w:t xml:space="preserve"> </w:t>
-      </w:r>
-      <w:proofErr w:type="spellStart"/>
-      <w:r>
-        <w:t>graund</w:t>
-      </w:r>
-      <w:proofErr w:type="spellEnd"/>
-      <w:r>
-        <w:t xml:space="preserve"> am – </w:t>
-      </w:r>
-      <w:proofErr w:type="spellStart"/>
-      <w:r>
-        <w:t>port</w:t>
-      </w:r>
-      <w:proofErr w:type="spellEnd"/>
-      <w:r>
-        <w:t xml:space="preserve"> des OPV U1 der OPV versucht diesen </w:t>
-      </w:r>
-      <w:proofErr w:type="spellStart"/>
-      <w:r>
-        <w:t>strom</w:t>
-      </w:r>
-      <w:proofErr w:type="spellEnd"/>
-      <w:r>
-        <w:t xml:space="preserve"> auszugleichen indem er die </w:t>
-      </w:r>
-      <w:proofErr w:type="spellStart"/>
-      <w:r>
-        <w:t>ausgagngsspannung</w:t>
-      </w:r>
-      <w:proofErr w:type="spellEnd"/>
-      <w:r>
-        <w:t xml:space="preserve"> am RF </w:t>
-      </w:r>
-      <w:proofErr w:type="gramStart"/>
-      <w:r>
-        <w:t>solange</w:t>
-      </w:r>
-      <w:proofErr w:type="gramEnd"/>
-      <w:r>
-        <w:t xml:space="preserve"> steigert bis über diesen </w:t>
-      </w:r>
-      <w:proofErr w:type="gramStart"/>
-      <w:r>
-        <w:t>wiederstand</w:t>
-      </w:r>
-      <w:proofErr w:type="gramEnd"/>
-      <w:r>
-        <w:t xml:space="preserve"> </w:t>
-      </w:r>
-      <w:proofErr w:type="spellStart"/>
-      <w:r>
-        <w:t>I_Source</w:t>
-      </w:r>
-      <w:proofErr w:type="spellEnd"/>
-      <w:r>
-        <w:t xml:space="preserve"> fliest. CF muss </w:t>
-      </w:r>
-      <w:proofErr w:type="spellStart"/>
-      <w:r>
-        <w:t>aufgund</w:t>
-      </w:r>
-      <w:proofErr w:type="spellEnd"/>
-      <w:r>
-        <w:t xml:space="preserve"> dieser </w:t>
-      </w:r>
-      <w:proofErr w:type="spellStart"/>
-      <w:r>
-        <w:t>gegebenheit</w:t>
-      </w:r>
-      <w:proofErr w:type="spellEnd"/>
-      <w:r>
-        <w:t xml:space="preserve"> eine geringe leak </w:t>
-      </w:r>
-      <w:proofErr w:type="spellStart"/>
-      <w:r>
-        <w:t>current</w:t>
-      </w:r>
-      <w:proofErr w:type="spellEnd"/>
-      <w:r>
-        <w:t xml:space="preserve"> </w:t>
-      </w:r>
-      <w:proofErr w:type="gramStart"/>
-      <w:r>
-        <w:t>haben</w:t>
-      </w:r>
-      <w:proofErr w:type="gramEnd"/>
-      <w:r>
-        <w:t xml:space="preserve"> um nicht die </w:t>
-      </w:r>
-      <w:proofErr w:type="spellStart"/>
-      <w:r>
-        <w:t>messung</w:t>
-      </w:r>
-      <w:proofErr w:type="spellEnd"/>
-      <w:r>
-        <w:t xml:space="preserve"> zu beeinflussen, </w:t>
-      </w:r>
-      <w:proofErr w:type="spellStart"/>
-      <w:r>
-        <w:t>witers</w:t>
-      </w:r>
-      <w:proofErr w:type="spellEnd"/>
-      <w:r>
-        <w:t xml:space="preserve"> </w:t>
-      </w:r>
-      <w:proofErr w:type="spellStart"/>
-      <w:r>
-        <w:t>begrenst</w:t>
-      </w:r>
-      <w:proofErr w:type="spellEnd"/>
-      <w:r>
-        <w:t xml:space="preserve"> er die </w:t>
-      </w:r>
-      <w:proofErr w:type="spellStart"/>
-      <w:r>
-        <w:t>frequenz</w:t>
-      </w:r>
-      <w:proofErr w:type="spellEnd"/>
-      <w:r>
-        <w:t xml:space="preserve"> der OPV </w:t>
-      </w:r>
-      <w:proofErr w:type="spellStart"/>
-      <w:r>
-        <w:t>schaltung</w:t>
-      </w:r>
-      <w:proofErr w:type="spellEnd"/>
-      <w:r>
-        <w:t xml:space="preserve">, denn bei </w:t>
-      </w:r>
-      <w:proofErr w:type="spellStart"/>
-      <w:r>
-        <w:t>Tranz</w:t>
-      </w:r>
-      <w:proofErr w:type="spellEnd"/>
-      <w:r>
-        <w:t xml:space="preserve"> </w:t>
-      </w:r>
-      <w:proofErr w:type="spellStart"/>
-      <w:r>
-        <w:t>impedanz</w:t>
-      </w:r>
-      <w:proofErr w:type="spellEnd"/>
-      <w:r>
-        <w:t xml:space="preserve"> </w:t>
-      </w:r>
-      <w:proofErr w:type="spellStart"/>
-      <w:r>
-        <w:t>wandlern</w:t>
-      </w:r>
-      <w:proofErr w:type="spellEnd"/>
-      <w:r>
-        <w:t xml:space="preserve"> kann es zum schwingen </w:t>
-      </w:r>
-      <w:proofErr w:type="spellStart"/>
-      <w:r>
-        <w:t>könnem</w:t>
-      </w:r>
-      <w:proofErr w:type="spellEnd"/>
-      <w:r>
-        <w:t xml:space="preserve"> die die </w:t>
-      </w:r>
-      <w:proofErr w:type="spellStart"/>
-      <w:r>
-        <w:t>grenzfrequenz</w:t>
-      </w:r>
-      <w:proofErr w:type="spellEnd"/>
-      <w:r>
-        <w:t xml:space="preserve"> </w:t>
+        <w:t xml:space="preserve">Dies ist der Grobe aufbau um eine Variable Drain und Gate spannung als auch eine messung </w:t>
+      </w:r>
+      <w:r>
+        <w:t>des soruce stromes</w:t>
+      </w:r>
+      <w:r>
+        <w:t xml:space="preserve">. Der I_Sorce fliest gegen ein phantom graund am – port des OPV U1 der OPV versucht diesen strom auszugleichen indem er die ausgagngsspannung am RF solange steigert bis über diesen wiederstand I_Source fliest. CF muss aufgund dieser gegebenheit eine geringe leak current haben um nicht die messung zu beeinflussen, witers begrenst er die frequenz der OPV schaltung, denn bei Tranz impedanz wandlern kann es zum schwingen könnem die die grenzfrequenz </w:t>
       </w:r>
       <w:r>
         <w:lastRenderedPageBreak/>
-        <w:t xml:space="preserve">zu hoch gewählt wird. </w:t>
-      </w:r>
-      <w:proofErr w:type="gramStart"/>
-      <w:r>
-        <w:t>Zum schwingen</w:t>
-      </w:r>
-      <w:proofErr w:type="gramEnd"/>
-      <w:r>
-        <w:t xml:space="preserve"> kommt es aufgrund von parasietöten </w:t>
-      </w:r>
-      <w:proofErr w:type="spellStart"/>
-      <w:r>
-        <w:t>kapazitäten</w:t>
-      </w:r>
-      <w:proofErr w:type="spellEnd"/>
-      <w:r>
-        <w:t xml:space="preserve"> </w:t>
-      </w:r>
-      <w:proofErr w:type="spellStart"/>
-      <w:r>
-        <w:t>aud</w:t>
-      </w:r>
-      <w:proofErr w:type="spellEnd"/>
-      <w:r>
-        <w:t xml:space="preserve"> der Source </w:t>
-      </w:r>
-      <w:proofErr w:type="spellStart"/>
-      <w:r>
-        <w:t>seite</w:t>
-      </w:r>
-      <w:proofErr w:type="spellEnd"/>
-      <w:r>
-        <w:t xml:space="preserve"> des MOSFET.</w:t>
-      </w:r>
-    </w:p>
-    <w:p>
-      <w:r>
-        <w:t xml:space="preserve">Die Verstärkung des TIA lässt sich einfach mit den genannten </w:t>
-      </w:r>
-      <w:proofErr w:type="spellStart"/>
-      <w:r>
-        <w:t>gegebenheiten</w:t>
-      </w:r>
-      <w:proofErr w:type="spellEnd"/>
-      <w:r>
-        <w:t xml:space="preserve"> berechnen.</w:t>
+        <w:t>zu hoch gewählt wird. Zum schwingen kommt es aufgrund von parasietöten kapazitäten aud der Source seite des MOSFET.</w:t>
+      </w:r>
+    </w:p>
+    <w:p>
+      <w:r>
+        <w:t>Die Verstärkung des TIA lässt sich einfach mit den genannten gegebenheiten berechnen.</w:t>
       </w:r>
     </w:p>
     <w:p>
@@ -4746,103 +2719,132 @@
     </w:p>
     <w:p>
       <w:r>
-        <w:t xml:space="preserve">Allerdings ist diese </w:t>
-      </w:r>
-      <w:proofErr w:type="spellStart"/>
-      <w:r>
-        <w:t>schaltung</w:t>
-      </w:r>
-      <w:proofErr w:type="spellEnd"/>
+        <w:t>Allerdings ist diese schaltung inverteirend, das bedeutet um von einem ADC verarbeitet zu werden sollte ein wieterer invertierender OPV verwendet werden um einen Positiven zusammenhang zwischen Ausgangsspannung und eingangsstrom ensteht. Der nachgeschaltener OPV sollte auch eine bereichs anpassung vornehmen um den eingangsspannungsbereich des ADC zu berücksichtigen.</w:t>
+      </w:r>
+    </w:p>
+    <w:p>
+      <w:pPr>
+        <w:pStyle w:val="berschrift3"/>
+      </w:pPr>
+      <w:r>
+        <w:t>Grenzfrequenz</w:t>
+      </w:r>
+    </w:p>
+    <w:p>
+      <w:r>
+        <w:t>Der Cf wurde mittels einem erstellen python programm berechnet.</w:t>
+      </w:r>
+    </w:p>
+    <w:p>
+      <w:r>
+        <w:drawing>
+          <wp:inline distT="0" distB="0" distL="0" distR="0" wp14:anchorId="4B0E9541" wp14:editId="5ECB0158">
+            <wp:extent cx="2505045" cy="1600200"/>
+            <wp:effectExtent l="0" t="0" r="0" b="0"/>
+            <wp:docPr id="2110047094" name="Grafik 1"/>
+            <wp:cNvGraphicFramePr>
+              <a:graphicFrameLocks xmlns:a="http://schemas.openxmlformats.org/drawingml/2006/main" noChangeAspect="1"/>
+            </wp:cNvGraphicFramePr>
+            <a:graphic xmlns:a="http://schemas.openxmlformats.org/drawingml/2006/main">
+              <a:graphicData uri="http://schemas.openxmlformats.org/drawingml/2006/picture">
+                <pic:pic xmlns:pic="http://schemas.openxmlformats.org/drawingml/2006/picture">
+                  <pic:nvPicPr>
+                    <pic:cNvPr id="2110047094" name=""/>
+                    <pic:cNvPicPr/>
+                  </pic:nvPicPr>
+                  <pic:blipFill rotWithShape="1">
+                    <a:blip r:embed="rId16"/>
+                    <a:srcRect t="30748" r="71720"/>
+                    <a:stretch>
+                      <a:fillRect/>
+                    </a:stretch>
+                  </pic:blipFill>
+                  <pic:spPr bwMode="auto">
+                    <a:xfrm>
+                      <a:off x="0" y="0"/>
+                      <a:ext cx="2514962" cy="1606535"/>
+                    </a:xfrm>
+                    <a:prstGeom prst="rect">
+                      <a:avLst/>
+                    </a:prstGeom>
+                    <a:ln>
+                      <a:noFill/>
+                    </a:ln>
+                    <a:extLst>
+                      <a:ext uri="{53640926-AAD7-44D8-BBD7-CCE9431645EC}">
+                        <a14:shadowObscured xmlns:a14="http://schemas.microsoft.com/office/drawing/2010/main"/>
+                      </a:ext>
+                    </a:extLst>
+                  </pic:spPr>
+                </pic:pic>
+              </a:graphicData>
+            </a:graphic>
+          </wp:inline>
+        </w:drawing>
+      </w:r>
       <w:r>
         <w:t xml:space="preserve"> </w:t>
       </w:r>
-      <w:proofErr w:type="spellStart"/>
-      <w:r>
-        <w:t>inverteirend</w:t>
-      </w:r>
-      <w:proofErr w:type="spellEnd"/>
-      <w:r>
-        <w:t xml:space="preserve">, das </w:t>
-      </w:r>
-      <w:proofErr w:type="gramStart"/>
-      <w:r>
-        <w:t>bedeutet</w:t>
-      </w:r>
-      <w:proofErr w:type="gramEnd"/>
-      <w:r>
-        <w:t xml:space="preserve"> um von einem ADC verarbeitet zu werden sollte ein </w:t>
-      </w:r>
-      <w:proofErr w:type="spellStart"/>
-      <w:r>
-        <w:t>wieterer</w:t>
-      </w:r>
-      <w:proofErr w:type="spellEnd"/>
-      <w:r>
-        <w:t xml:space="preserve"> invertierender OPV verwendet werden um einen Positiven </w:t>
-      </w:r>
-      <w:proofErr w:type="spellStart"/>
-      <w:r>
-        <w:t>zusammenhang</w:t>
-      </w:r>
-      <w:proofErr w:type="spellEnd"/>
-      <w:r>
-        <w:t xml:space="preserve"> zwischen Ausgangsspannung und </w:t>
-      </w:r>
-      <w:proofErr w:type="spellStart"/>
-      <w:r>
-        <w:t>eingangsstrom</w:t>
-      </w:r>
-      <w:proofErr w:type="spellEnd"/>
-      <w:r>
-        <w:t xml:space="preserve"> </w:t>
-      </w:r>
-      <w:proofErr w:type="spellStart"/>
-      <w:r>
-        <w:t>ensteht</w:t>
-      </w:r>
-      <w:proofErr w:type="spellEnd"/>
-      <w:r>
-        <w:t xml:space="preserve">. Der </w:t>
-      </w:r>
-      <w:proofErr w:type="spellStart"/>
-      <w:r>
-        <w:t>nachgeschaltener</w:t>
-      </w:r>
-      <w:proofErr w:type="spellEnd"/>
-      <w:r>
-        <w:t xml:space="preserve"> OPV sollte auch eine </w:t>
-      </w:r>
-      <w:proofErr w:type="spellStart"/>
-      <w:r>
-        <w:t>bereichs</w:t>
-      </w:r>
-      <w:proofErr w:type="spellEnd"/>
-      <w:r>
-        <w:t xml:space="preserve"> </w:t>
-      </w:r>
-      <w:proofErr w:type="spellStart"/>
-      <w:r>
-        <w:t>anpassung</w:t>
-      </w:r>
-      <w:proofErr w:type="spellEnd"/>
-      <w:r>
-        <w:t xml:space="preserve"> </w:t>
-      </w:r>
-      <w:proofErr w:type="gramStart"/>
-      <w:r>
-        <w:t>vornehmen</w:t>
-      </w:r>
-      <w:proofErr w:type="gramEnd"/>
-      <w:r>
-        <w:t xml:space="preserve"> um den </w:t>
-      </w:r>
-      <w:proofErr w:type="spellStart"/>
-      <w:r>
-        <w:t>eingangsspannungsbereich</w:t>
-      </w:r>
-      <w:proofErr w:type="spellEnd"/>
-      <w:r>
-        <w:t xml:space="preserve"> des ADC zu berücksichtigen.</w:t>
+    </w:p>
+    <w:p>
+      <w:r>
+        <w:t>In diesem Programm konnte durch Iteratiefes ausprobieren ein wert für CF gefunden bei diesem die bandbreite der schaltung noch hochgenug ist um nicht zufiel signal wegzuschneiden, aber auch die stabilität der schaltung gegeben ist</w:t>
+      </w:r>
+      <w:r>
+        <w:t>.</w:t>
+      </w:r>
+    </w:p>
+    <w:p>
+      <w:r>
+        <w:drawing>
+          <wp:inline distT="0" distB="0" distL="0" distR="0" wp14:anchorId="35DB711F" wp14:editId="3B77536C">
+            <wp:extent cx="5937874" cy="2300288"/>
+            <wp:effectExtent l="0" t="0" r="6350" b="5080"/>
+            <wp:docPr id="2038984719" name="Grafik 1"/>
+            <wp:cNvGraphicFramePr>
+              <a:graphicFrameLocks xmlns:a="http://schemas.openxmlformats.org/drawingml/2006/main" noChangeAspect="1"/>
+            </wp:cNvGraphicFramePr>
+            <a:graphic xmlns:a="http://schemas.openxmlformats.org/drawingml/2006/main">
+              <a:graphicData uri="http://schemas.openxmlformats.org/drawingml/2006/picture">
+                <pic:pic xmlns:pic="http://schemas.openxmlformats.org/drawingml/2006/picture">
+                  <pic:nvPicPr>
+                    <pic:cNvPr id="2038984719" name=""/>
+                    <pic:cNvPicPr/>
+                  </pic:nvPicPr>
+                  <pic:blipFill rotWithShape="1">
+                    <a:blip r:embed="rId16"/>
+                    <a:srcRect l="32663"/>
+                    <a:stretch>
+                      <a:fillRect/>
+                    </a:stretch>
+                  </pic:blipFill>
+                  <pic:spPr bwMode="auto">
+                    <a:xfrm>
+                      <a:off x="0" y="0"/>
+                      <a:ext cx="5968119" cy="2312005"/>
+                    </a:xfrm>
+                    <a:prstGeom prst="rect">
+                      <a:avLst/>
+                    </a:prstGeom>
+                    <a:ln>
+                      <a:noFill/>
+                    </a:ln>
+                    <a:extLst>
+                      <a:ext uri="{53640926-AAD7-44D8-BBD7-CCE9431645EC}">
+                        <a14:shadowObscured xmlns:a14="http://schemas.microsoft.com/office/drawing/2010/main"/>
+                      </a:ext>
+                    </a:extLst>
+                  </pic:spPr>
+                </pic:pic>
+              </a:graphicData>
+            </a:graphic>
+          </wp:inline>
+        </w:drawing>
+      </w:r>
+    </w:p>
+    <w:p>
+      <w:r>
+        <w:t>Von dem TU Wien Kontakt wurde auch empfolen die schaltung aufzubauen und die stabilität prüfen wenn diese nicht gegeben ist einen gröseren kondensator verwenden.</w:t>
       </w:r>
     </w:p>
     <w:p>
@@ -4850,61 +2852,12 @@
         <w:pStyle w:val="berschrift3"/>
       </w:pPr>
       <w:r>
-        <w:t>Grenzfrequenz</w:t>
-      </w:r>
-    </w:p>
-    <w:p/>
-    <w:p>
-      <w:pPr>
-        <w:pStyle w:val="berschrift3"/>
-      </w:pPr>
-      <w:r>
         <w:t>Thermisches Rauschen</w:t>
       </w:r>
     </w:p>
     <w:p>
       <w:r>
-        <w:t xml:space="preserve">Dieses Rauschen </w:t>
-      </w:r>
-      <w:proofErr w:type="spellStart"/>
-      <w:r>
-        <w:t>ensteht</w:t>
-      </w:r>
-      <w:proofErr w:type="spellEnd"/>
-      <w:r>
-        <w:t xml:space="preserve"> durch die </w:t>
-      </w:r>
-      <w:proofErr w:type="spellStart"/>
-      <w:r>
-        <w:t>inenntemperatur</w:t>
-      </w:r>
-      <w:proofErr w:type="spellEnd"/>
-      <w:r>
-        <w:t xml:space="preserve"> eines </w:t>
-      </w:r>
-      <w:proofErr w:type="spellStart"/>
-      <w:r>
-        <w:t>leiters</w:t>
-      </w:r>
-      <w:proofErr w:type="spellEnd"/>
-      <w:r>
-        <w:t xml:space="preserve"> und damit die </w:t>
-      </w:r>
-      <w:proofErr w:type="spellStart"/>
-      <w:r>
-        <w:t>bewegung</w:t>
-      </w:r>
-      <w:proofErr w:type="spellEnd"/>
-      <w:r>
-        <w:t xml:space="preserve"> von </w:t>
-      </w:r>
-      <w:proofErr w:type="spellStart"/>
-      <w:r>
-        <w:t>ladungsträgern</w:t>
-      </w:r>
-      <w:proofErr w:type="spellEnd"/>
-      <w:r>
-        <w:t xml:space="preserve"> in einem Leiter.</w:t>
+        <w:t>Dieses Rauschen ensteht durch die inenntemperatur eines leiters und damit die bewegung von ladungsträgern in einem Leiter.</w:t>
       </w:r>
     </w:p>
     <w:p>
@@ -4998,15 +2951,7 @@
         </w:rPr>
       </w:pPr>
       <w:r>
-        <w:t xml:space="preserve">k </w:t>
-      </w:r>
-      <w:proofErr w:type="spellStart"/>
-      <w:r>
-        <w:t>Bolzmankonstante</w:t>
-      </w:r>
-      <w:proofErr w:type="spellEnd"/>
-      <w:r>
-        <w:t xml:space="preserve"> = </w:t>
+        <w:t xml:space="preserve">k Bolzmankonstante = </w:t>
       </w:r>
       <w:r>
         <w:t>1.380649×10</w:t>
@@ -5043,50 +2988,14 @@
     </w:p>
     <w:p>
       <w:r>
-        <w:t xml:space="preserve">R der </w:t>
-      </w:r>
-      <w:proofErr w:type="spellStart"/>
-      <w:r>
-        <w:t>wert</w:t>
-      </w:r>
-      <w:proofErr w:type="spellEnd"/>
-      <w:r>
-        <w:t xml:space="preserve"> des </w:t>
-      </w:r>
-      <w:proofErr w:type="gramStart"/>
-      <w:r>
-        <w:t>Wiederstands</w:t>
-      </w:r>
-      <w:proofErr w:type="gramEnd"/>
+        <w:t>R der wert des Wiederstands</w:t>
+      </w:r>
     </w:p>
     <w:p/>
     <w:p>
       <w:r>
-        <w:t xml:space="preserve">Diese Formel bedeutet das ein wärmerer als auch </w:t>
-      </w:r>
-      <w:proofErr w:type="spellStart"/>
-      <w:r>
-        <w:t>grösererwiederstand</w:t>
-      </w:r>
-      <w:proofErr w:type="spellEnd"/>
-      <w:r>
-        <w:t xml:space="preserve"> mehr </w:t>
-      </w:r>
-      <w:proofErr w:type="spellStart"/>
-      <w:r>
-        <w:t>rasuchen</w:t>
-      </w:r>
-      <w:proofErr w:type="spellEnd"/>
-      <w:r>
-        <w:t xml:space="preserve">. Dies kann umgerechnet werden von </w:t>
-      </w:r>
-      <w:proofErr w:type="spellStart"/>
-      <w:r>
-        <w:t>Spannungsrasuchen</w:t>
-      </w:r>
-      <w:proofErr w:type="spellEnd"/>
-      <w:r>
-        <w:t xml:space="preserve"> zu Stromrauschen.</w:t>
+        <w:lastRenderedPageBreak/>
+        <w:t>Diese Formel bedeutet das ein wärmerer als auch grösererwiederstand mehr rasuchen. Dies kann umgerechnet werden von Spannungsrasuchen zu Stromrauschen.</w:t>
       </w:r>
     </w:p>
     <w:p/>
@@ -5240,7 +3149,6 @@
                 <w:lang w:val="de-AT" w:eastAsia="de-AT"/>
               </w:rPr>
             </w:pPr>
-            <w:proofErr w:type="spellStart"/>
             <w:r>
               <w:rPr>
                 <w:rFonts w:ascii="Aptos Narrow" w:hAnsi="Aptos Narrow"/>
@@ -5249,18 +3157,7 @@
                 <w:szCs w:val="22"/>
                 <w:lang w:val="de-AT" w:eastAsia="de-AT"/>
               </w:rPr>
-              <w:t>Temperature</w:t>
-            </w:r>
-            <w:proofErr w:type="spellEnd"/>
-            <w:r>
-              <w:rPr>
-                <w:rFonts w:ascii="Aptos Narrow" w:hAnsi="Aptos Narrow"/>
-                <w:color w:val="000000"/>
-                <w:sz w:val="22"/>
-                <w:szCs w:val="22"/>
-                <w:lang w:val="de-AT" w:eastAsia="de-AT"/>
-              </w:rPr>
-              <w:t xml:space="preserve"> in K</w:t>
+              <w:t>Temperature in K</w:t>
             </w:r>
           </w:p>
         </w:tc>
@@ -5368,23 +3265,13 @@
                 <w:lang w:val="de-AT" w:eastAsia="de-AT"/>
               </w:rPr>
             </w:pPr>
-            <w:proofErr w:type="spellStart"/>
             <w:r>
               <w:rPr>
                 <w:rFonts w:cs="Arial"/>
                 <w:color w:val="000000"/>
                 <w:lang w:eastAsia="de-AT"/>
               </w:rPr>
-              <w:t>Bolzmankonstante</w:t>
-            </w:r>
-            <w:proofErr w:type="spellEnd"/>
-            <w:r>
-              <w:rPr>
-                <w:rFonts w:cs="Arial"/>
-                <w:color w:val="000000"/>
-                <w:lang w:eastAsia="de-AT"/>
-              </w:rPr>
-              <w:t xml:space="preserve"> </w:t>
+              <w:t xml:space="preserve">Bolzmankonstante </w:t>
             </w:r>
           </w:p>
         </w:tc>
@@ -5490,7 +3377,6 @@
                 <w:lang w:val="de-AT" w:eastAsia="de-AT"/>
               </w:rPr>
             </w:pPr>
-            <w:proofErr w:type="spellStart"/>
             <w:r>
               <w:rPr>
                 <w:rFonts w:ascii="Aptos Narrow" w:hAnsi="Aptos Narrow"/>
@@ -5499,18 +3385,7 @@
                 <w:szCs w:val="22"/>
                 <w:lang w:val="de-AT" w:eastAsia="de-AT"/>
               </w:rPr>
-              <w:t>Resistor</w:t>
-            </w:r>
-            <w:proofErr w:type="spellEnd"/>
-            <w:r>
-              <w:rPr>
-                <w:rFonts w:ascii="Aptos Narrow" w:hAnsi="Aptos Narrow"/>
-                <w:color w:val="000000"/>
-                <w:sz w:val="22"/>
-                <w:szCs w:val="22"/>
-                <w:lang w:val="de-AT" w:eastAsia="de-AT"/>
-              </w:rPr>
-              <w:t xml:space="preserve"> in Meg</w:t>
+              <w:t>Resistor in Meg</w:t>
             </w:r>
           </w:p>
         </w:tc>
@@ -5547,29 +3422,7 @@
                 <w:szCs w:val="22"/>
                 <w:lang w:val="de-AT" w:eastAsia="de-AT"/>
               </w:rPr>
-              <w:t xml:space="preserve">Thermisches </w:t>
-            </w:r>
-            <w:proofErr w:type="spellStart"/>
-            <w:r>
-              <w:rPr>
-                <w:rFonts w:ascii="Aptos Narrow" w:hAnsi="Aptos Narrow"/>
-                <w:color w:val="000000"/>
-                <w:sz w:val="22"/>
-                <w:szCs w:val="22"/>
-                <w:lang w:val="de-AT" w:eastAsia="de-AT"/>
-              </w:rPr>
-              <w:t>Spannungs</w:t>
-            </w:r>
-            <w:proofErr w:type="spellEnd"/>
-            <w:r>
-              <w:rPr>
-                <w:rFonts w:ascii="Aptos Narrow" w:hAnsi="Aptos Narrow"/>
-                <w:color w:val="000000"/>
-                <w:sz w:val="22"/>
-                <w:szCs w:val="22"/>
-                <w:lang w:val="de-AT" w:eastAsia="de-AT"/>
-              </w:rPr>
-              <w:t xml:space="preserve"> </w:t>
+              <w:t xml:space="preserve">Thermisches Spannungs </w:t>
             </w:r>
           </w:p>
         </w:tc>
@@ -5598,7 +3451,6 @@
                 <w:lang w:val="de-AT" w:eastAsia="de-AT"/>
               </w:rPr>
             </w:pPr>
-            <w:proofErr w:type="gramStart"/>
             <w:r>
               <w:rPr>
                 <w:rFonts w:ascii="Aptos Narrow" w:hAnsi="Aptos Narrow"/>
@@ -5607,18 +3459,7 @@
                 <w:szCs w:val="22"/>
                 <w:lang w:val="de-AT" w:eastAsia="de-AT"/>
               </w:rPr>
-              <w:t>Thermisches Strom</w:t>
-            </w:r>
-            <w:proofErr w:type="gramEnd"/>
-            <w:r>
-              <w:rPr>
-                <w:rFonts w:ascii="Aptos Narrow" w:hAnsi="Aptos Narrow"/>
-                <w:color w:val="000000"/>
-                <w:sz w:val="22"/>
-                <w:szCs w:val="22"/>
-                <w:lang w:val="de-AT" w:eastAsia="de-AT"/>
-              </w:rPr>
-              <w:t xml:space="preserve"> </w:t>
+              <w:t xml:space="preserve">Thermisches Strom </w:t>
             </w:r>
           </w:p>
         </w:tc>
@@ -5698,29 +3539,7 @@
                 <w:szCs w:val="22"/>
                 <w:lang w:val="de-AT" w:eastAsia="de-AT"/>
               </w:rPr>
-              <w:t xml:space="preserve">Rauschen in </w:t>
-            </w:r>
-            <w:proofErr w:type="spellStart"/>
-            <w:r>
-              <w:rPr>
-                <w:rFonts w:ascii="Aptos Narrow" w:hAnsi="Aptos Narrow"/>
-                <w:color w:val="000000"/>
-                <w:sz w:val="22"/>
-                <w:szCs w:val="22"/>
-                <w:lang w:val="de-AT" w:eastAsia="de-AT"/>
-              </w:rPr>
-              <w:t>nV</w:t>
-            </w:r>
-            <w:proofErr w:type="spellEnd"/>
-            <w:r>
-              <w:rPr>
-                <w:rFonts w:ascii="Aptos Narrow" w:hAnsi="Aptos Narrow"/>
-                <w:color w:val="000000"/>
-                <w:sz w:val="22"/>
-                <w:szCs w:val="22"/>
-                <w:lang w:val="de-AT" w:eastAsia="de-AT"/>
-              </w:rPr>
-              <w:t>/√Hz</w:t>
+              <w:t>Rauschen in nV/√Hz</w:t>
             </w:r>
           </w:p>
         </w:tc>
@@ -5757,29 +3576,7 @@
                 <w:szCs w:val="22"/>
                 <w:lang w:val="de-AT" w:eastAsia="de-AT"/>
               </w:rPr>
-              <w:t xml:space="preserve">Rauschen in </w:t>
-            </w:r>
-            <w:proofErr w:type="spellStart"/>
-            <w:r>
-              <w:rPr>
-                <w:rFonts w:ascii="Aptos Narrow" w:hAnsi="Aptos Narrow"/>
-                <w:color w:val="000000"/>
-                <w:sz w:val="22"/>
-                <w:szCs w:val="22"/>
-                <w:lang w:val="de-AT" w:eastAsia="de-AT"/>
-              </w:rPr>
-              <w:t>fA</w:t>
-            </w:r>
-            <w:proofErr w:type="spellEnd"/>
-            <w:r>
-              <w:rPr>
-                <w:rFonts w:ascii="Aptos Narrow" w:hAnsi="Aptos Narrow"/>
-                <w:color w:val="000000"/>
-                <w:sz w:val="22"/>
-                <w:szCs w:val="22"/>
-                <w:lang w:val="de-AT" w:eastAsia="de-AT"/>
-              </w:rPr>
-              <w:t>/√Hz</w:t>
+              <w:t>Rauschen in fA/√Hz</w:t>
             </w:r>
           </w:p>
         </w:tc>
@@ -6155,7 +3952,6 @@
             <w:tcBorders>
               <w:top w:val="nil"/>
               <w:left w:val="single" w:sz="8" w:space="0" w:color="auto"/>
-              <w:bottom w:val="nil"/>
               <w:right w:val="single" w:sz="4" w:space="0" w:color="auto"/>
             </w:tcBorders>
             <w:noWrap/>
@@ -6193,7 +3989,6 @@
             <w:tcBorders>
               <w:top w:val="nil"/>
               <w:left w:val="nil"/>
-              <w:bottom w:val="nil"/>
               <w:right w:val="single" w:sz="4" w:space="0" w:color="auto"/>
             </w:tcBorders>
             <w:noWrap/>
@@ -6231,7 +4026,6 @@
             <w:tcBorders>
               <w:top w:val="nil"/>
               <w:left w:val="nil"/>
-              <w:bottom w:val="nil"/>
               <w:right w:val="single" w:sz="8" w:space="0" w:color="auto"/>
             </w:tcBorders>
             <w:noWrap/>
@@ -6275,7 +4069,7 @@
             <w:tcBorders>
               <w:top w:val="nil"/>
               <w:left w:val="single" w:sz="8" w:space="0" w:color="auto"/>
-              <w:bottom w:val="nil"/>
+              <w:bottom w:val="single" w:sz="4" w:space="0" w:color="auto"/>
               <w:right w:val="single" w:sz="4" w:space="0" w:color="auto"/>
             </w:tcBorders>
             <w:noWrap/>
@@ -6313,7 +4107,7 @@
             <w:tcBorders>
               <w:top w:val="nil"/>
               <w:left w:val="nil"/>
-              <w:bottom w:val="nil"/>
+              <w:bottom w:val="single" w:sz="4" w:space="0" w:color="auto"/>
               <w:right w:val="single" w:sz="4" w:space="0" w:color="auto"/>
             </w:tcBorders>
             <w:noWrap/>
@@ -6351,7 +4145,7 @@
             <w:tcBorders>
               <w:top w:val="nil"/>
               <w:left w:val="nil"/>
-              <w:bottom w:val="nil"/>
+              <w:bottom w:val="single" w:sz="4" w:space="0" w:color="auto"/>
               <w:right w:val="single" w:sz="8" w:space="0" w:color="auto"/>
             </w:tcBorders>
             <w:noWrap/>
@@ -6384,92 +4178,6 @@
           </w:p>
         </w:tc>
       </w:tr>
-      <w:tr>
-        <w:trPr>
-          <w:trHeight w:val="300"/>
-          <w:jc w:val="center"/>
-        </w:trPr>
-        <w:tc>
-          <w:tcPr>
-            <w:tcW w:w="1786" w:type="dxa"/>
-            <w:tcBorders>
-              <w:top w:val="nil"/>
-              <w:left w:val="single" w:sz="8" w:space="0" w:color="auto"/>
-              <w:bottom w:val="single" w:sz="8" w:space="0" w:color="auto"/>
-              <w:right w:val="single" w:sz="4" w:space="0" w:color="auto"/>
-            </w:tcBorders>
-            <w:noWrap/>
-            <w:vAlign w:val="bottom"/>
-          </w:tcPr>
-          <w:p>
-            <w:pPr>
-              <w:suppressAutoHyphens w:val="0"/>
-              <w:spacing w:line="240" w:lineRule="auto"/>
-              <w:rPr>
-                <w:rFonts w:ascii="Aptos Narrow" w:hAnsi="Aptos Narrow"/>
-                <w:color w:val="000000"/>
-                <w:sz w:val="22"/>
-                <w:szCs w:val="22"/>
-                <w:lang w:val="de-AT" w:eastAsia="de-AT"/>
-              </w:rPr>
-            </w:pPr>
-          </w:p>
-        </w:tc>
-        <w:tc>
-          <w:tcPr>
-            <w:tcW w:w="2220" w:type="dxa"/>
-            <w:tcBorders>
-              <w:top w:val="nil"/>
-              <w:left w:val="nil"/>
-              <w:bottom w:val="single" w:sz="8" w:space="0" w:color="auto"/>
-              <w:right w:val="single" w:sz="4" w:space="0" w:color="auto"/>
-            </w:tcBorders>
-            <w:noWrap/>
-            <w:vAlign w:val="bottom"/>
-          </w:tcPr>
-          <w:p>
-            <w:pPr>
-              <w:suppressAutoHyphens w:val="0"/>
-              <w:spacing w:line="240" w:lineRule="auto"/>
-              <w:jc w:val="center"/>
-              <w:rPr>
-                <w:rFonts w:ascii="Aptos Narrow" w:hAnsi="Aptos Narrow"/>
-                <w:color w:val="000000"/>
-                <w:sz w:val="22"/>
-                <w:szCs w:val="22"/>
-                <w:lang w:val="de-AT" w:eastAsia="de-AT"/>
-              </w:rPr>
-            </w:pPr>
-          </w:p>
-        </w:tc>
-        <w:tc>
-          <w:tcPr>
-            <w:tcW w:w="2220" w:type="dxa"/>
-            <w:tcBorders>
-              <w:top w:val="nil"/>
-              <w:left w:val="nil"/>
-              <w:bottom w:val="single" w:sz="8" w:space="0" w:color="auto"/>
-              <w:right w:val="single" w:sz="8" w:space="0" w:color="auto"/>
-            </w:tcBorders>
-            <w:noWrap/>
-            <w:vAlign w:val="bottom"/>
-          </w:tcPr>
-          <w:p>
-            <w:pPr>
-              <w:suppressAutoHyphens w:val="0"/>
-              <w:spacing w:line="240" w:lineRule="auto"/>
-              <w:jc w:val="center"/>
-              <w:rPr>
-                <w:rFonts w:ascii="Aptos Narrow" w:hAnsi="Aptos Narrow"/>
-                <w:color w:val="000000"/>
-                <w:sz w:val="22"/>
-                <w:szCs w:val="22"/>
-                <w:lang w:val="de-AT" w:eastAsia="de-AT"/>
-              </w:rPr>
-            </w:pPr>
-          </w:p>
-        </w:tc>
-      </w:tr>
     </w:tbl>
     <w:p>
       <w:bookmarkStart w:id="0" w:name="_Toc524250395"/>
@@ -6489,17 +4197,323 @@
       </w:r>
     </w:p>
     <w:p/>
+    <w:p>
+      <w:r>
+        <w:t xml:space="preserve">Es werden 2 Variablen spannungsquellen gebraucht vür die Gate als auch Darain spannung, da sloche meist mit DACs realiesiert werden, wird entweder ein DAC imt min 2 Channeln oder 2 DAC verwendet, es wird eher die erste variabte verwendet werden. da zumindest der Drain Anschluss stromliefern muss also belastet wird muss nach dem DAC ausgang ein Buffer eingebaut werden doch da es ein guter ansatz ist wird das bei beiden anschlüssen eingeplant. Diese buffer werden gleich mit einem Tiefpass fileter geplant da bei einem DAC ausgang zu hochfrequenzten störungen kommen kann. </w:t>
+      </w:r>
+    </w:p>
+    <w:p>
+      <w:r>
+        <w:t>Für die DAC Buffer müssen OPVs verwendet werden welche möglichst einen zero Offset haben um die eingestellte spannung nicht zu verfälschen, weiters müssen diese möglichst rasucharm sein um verälschen zu minimieren.</w:t>
+      </w:r>
+      <w:r>
+        <w:t xml:space="preserve"> Aus diesen Kreterien wurde der OPA189 ausgesucht.</w:t>
+      </w:r>
+    </w:p>
+    <w:p>
+      <w:r>
+        <w:t>Für die digitaliesierung des TIA muss ein ADC vberwendet werden da hohe samplerate gebraucht werden wird ein SAR ADC verwednet welcher eine Sample rate von bis zu 1MSps. Um eine einfache daten verarbeitung mit und da ADCs mit einer höheren bit zahl mit einem  höheren preis kommen wird ein 16 bit SAR ADC verwendet, nämlich der ADS8681, dieser wurde ausgesucht aufgrund seiner SPI schnitschtelle seiner hohen samplerate und der einstellbaraen eingangs range.</w:t>
+      </w:r>
+    </w:p>
+    <w:p>
+      <w:pPr>
+        <w:tabs>
+          <w:tab w:val="left" w:pos="1095"/>
+        </w:tabs>
+      </w:pPr>
+      <w:r>
+        <w:t xml:space="preserve">Der OPV des TIA muss einen sehr geringen bias strom auf seinen + und – eingangs ports haben in einer grösenordnung die mindesetens um den faktor 10^3 kleiner ist als die zumessene größe, da messungen bis unter 1nA möglich sein sollen </w:t>
+      </w:r>
+      <w:r>
+        <w:t>darf der bias current maximal 1pA betragen.</w:t>
+      </w:r>
+    </w:p>
+    <w:p>
+      <w:pPr>
+        <w:tabs>
+          <w:tab w:val="left" w:pos="1095"/>
+        </w:tabs>
+      </w:pPr>
+      <w:r>
+        <w:t>Weiters wäre eine geringe offset spannung des OPV sinvoll, doch dieser kann durch mehr punkt kallibrierung weggerechnet werden. Ein von der TU empfolener OPV für diese aufgabe ist der OPA928 doch dieser ist schwer zu implementirern, deswegen wurde auf ein älteres modell zurückgegriffen dem LMC6001</w:t>
+      </w:r>
+      <w:r>
+        <w:t>.</w:t>
+      </w:r>
+    </w:p>
+    <w:p>
+      <w:pPr>
+        <w:tabs>
+          <w:tab w:val="left" w:pos="1095"/>
+        </w:tabs>
+      </w:pPr>
+    </w:p>
+    <w:p>
+      <w:pPr>
+        <w:pStyle w:val="berschrift2"/>
+      </w:pPr>
+      <w:r>
+        <w:t>Spannungsversorgung</w:t>
+      </w:r>
+    </w:p>
+    <w:p>
+      <w:r>
+        <w:t>Für die OPVs wurde eine Bipolare Versorgung von +-8V gewählt. Um diese zu bekommen werden 2 LODs verwendet, einer für die Positive versorgung und einer für die negative. Es werden LDOs verwendet da diese keinen Rippel erzeugen und viel rausch ärmer sind als DCDC wandler. Weiters dämpfen LDOs meist mit hohem faktor den rippel der versorgung zu unterdrücken</w:t>
+      </w:r>
+      <w:r>
+        <w:t xml:space="preserve">, auch das genannt </w:t>
+      </w:r>
+      <w:r>
+        <w:lastRenderedPageBreak/>
+        <w:t>PSRR Power Supply Rejektion Ratio. Ein wichtiger Faktor für die OPV versorgung ist das sie langzeit stabiel ist und auch geringes eigenrauschen hat.</w:t>
+      </w:r>
+      <w:r>
+        <w:t xml:space="preserve"> Die beiden Ic welche häufig für diesen zweg verwendet werden sind die </w:t>
+      </w:r>
+      <w:r>
+        <w:t>LT3094</w:t>
+      </w:r>
+      <w:r>
+        <w:t xml:space="preserve"> für die negative spannungsversorgung und der </w:t>
+      </w:r>
+      <w:r>
+        <w:t>LT3042</w:t>
+      </w:r>
+      <w:r>
+        <w:t xml:space="preserve"> für die positive Versorgung</w:t>
+      </w:r>
+      <w:r>
+        <w:t>, diese beiten die möglichkeit mittels eimen Widerstand die ausgangsspannung einzustellen</w:t>
+      </w:r>
+      <w:r>
+        <w:t>.</w:t>
+      </w:r>
+    </w:p>
     <w:p/>
+    <w:p>
+      <w:r>
+        <w:t xml:space="preserve">Das gesammte Digital System ist auf eine Versorgung von 3,3V ausgelegt, und um diese zu verfügung zustellen wird auch ein LDO verwendet, da eine digitalversorgung keine low noise oder high accrucysy bracuht kann ein „Wald und Wiesen“ LDO verwendet werden. In diesem fall wird der </w:t>
+      </w:r>
+      <w:r>
+        <w:t>TLV76733</w:t>
+      </w:r>
+      <w:r>
+        <w:t xml:space="preserve"> verwendet.</w:t>
+      </w:r>
+    </w:p>
+    <w:p>
+      <w:pPr>
+        <w:pStyle w:val="berschrift3"/>
+      </w:pPr>
+      <w:r>
+        <w:t>LT3042</w:t>
+      </w:r>
+    </w:p>
+    <w:p>
+      <w:r>
+        <w:drawing>
+          <wp:inline distT="0" distB="0" distL="0" distR="0" wp14:anchorId="5B6DDBF1" wp14:editId="327E7AED">
+            <wp:extent cx="5759450" cy="2851150"/>
+            <wp:effectExtent l="0" t="0" r="0" b="6350"/>
+            <wp:docPr id="869667927" name="Grafik 1"/>
+            <wp:cNvGraphicFramePr>
+              <a:graphicFrameLocks xmlns:a="http://schemas.openxmlformats.org/drawingml/2006/main" noChangeAspect="1"/>
+            </wp:cNvGraphicFramePr>
+            <a:graphic xmlns:a="http://schemas.openxmlformats.org/drawingml/2006/main">
+              <a:graphicData uri="http://schemas.openxmlformats.org/drawingml/2006/picture">
+                <pic:pic xmlns:pic="http://schemas.openxmlformats.org/drawingml/2006/picture">
+                  <pic:nvPicPr>
+                    <pic:cNvPr id="869667927" name=""/>
+                    <pic:cNvPicPr/>
+                  </pic:nvPicPr>
+                  <pic:blipFill>
+                    <a:blip r:embed="rId17"/>
+                    <a:stretch>
+                      <a:fillRect/>
+                    </a:stretch>
+                  </pic:blipFill>
+                  <pic:spPr>
+                    <a:xfrm>
+                      <a:off x="0" y="0"/>
+                      <a:ext cx="5759450" cy="2851150"/>
+                    </a:xfrm>
+                    <a:prstGeom prst="rect">
+                      <a:avLst/>
+                    </a:prstGeom>
+                  </pic:spPr>
+                </pic:pic>
+              </a:graphicData>
+            </a:graphic>
+          </wp:inline>
+        </w:drawing>
+      </w:r>
+    </w:p>
+    <w:p>
+      <w:r>
+        <w:t>Mittels des SET Widerstand in dieser grafik 33.2k wird die ausgangsspannung gesetzt.</w:t>
+      </w:r>
+      <w:r>
+        <w:t xml:space="preserve"> </w:t>
+      </w:r>
+    </w:p>
+    <w:p>
+      <w:r>
+        <w:drawing>
+          <wp:inline distT="0" distB="0" distL="0" distR="0" wp14:anchorId="1F3310D5" wp14:editId="05198BEE">
+            <wp:extent cx="3429000" cy="1226614"/>
+            <wp:effectExtent l="0" t="0" r="0" b="0"/>
+            <wp:docPr id="1545897080" name="Grafik 1"/>
+            <wp:cNvGraphicFramePr>
+              <a:graphicFrameLocks xmlns:a="http://schemas.openxmlformats.org/drawingml/2006/main" noChangeAspect="1"/>
+            </wp:cNvGraphicFramePr>
+            <a:graphic xmlns:a="http://schemas.openxmlformats.org/drawingml/2006/main">
+              <a:graphicData uri="http://schemas.openxmlformats.org/drawingml/2006/picture">
+                <pic:pic xmlns:pic="http://schemas.openxmlformats.org/drawingml/2006/picture">
+                  <pic:nvPicPr>
+                    <pic:cNvPr id="1545897080" name=""/>
+                    <pic:cNvPicPr/>
+                  </pic:nvPicPr>
+                  <pic:blipFill rotWithShape="1">
+                    <a:blip r:embed="rId18"/>
+                    <a:srcRect t="2038"/>
+                    <a:stretch>
+                      <a:fillRect/>
+                    </a:stretch>
+                  </pic:blipFill>
+                  <pic:spPr bwMode="auto">
+                    <a:xfrm>
+                      <a:off x="0" y="0"/>
+                      <a:ext cx="3455292" cy="1236019"/>
+                    </a:xfrm>
+                    <a:prstGeom prst="rect">
+                      <a:avLst/>
+                    </a:prstGeom>
+                    <a:ln>
+                      <a:noFill/>
+                    </a:ln>
+                    <a:extLst>
+                      <a:ext uri="{53640926-AAD7-44D8-BBD7-CCE9431645EC}">
+                        <a14:shadowObscured xmlns:a14="http://schemas.microsoft.com/office/drawing/2010/main"/>
+                      </a:ext>
+                    </a:extLst>
+                  </pic:spPr>
+                </pic:pic>
+              </a:graphicData>
+            </a:graphic>
+          </wp:inline>
+        </w:drawing>
+      </w:r>
+    </w:p>
+    <w:p>
+      <w:r>
+        <w:t>Mittels des ILIM Wiederstand kann eine Strombegränzung eingestellt werden, wenn diese funktion nicht gebrascuht wird kann dieser Pinn auf 0V gelegt werden.</w:t>
+      </w:r>
+    </w:p>
+    <w:p>
+      <w:r>
+        <w:t xml:space="preserve">Der Spannungsteiler der mit dem PIN PGFB verbunden ist stellt die Power Good </w:t>
+      </w:r>
+      <w:r>
+        <w:t>spannung ein, wenn die spannung am PGFB pin über 0,3V steigt wird der PIN PG Auf 0V gezogen mittels einem Open Collectoe ausgangs</w:t>
+      </w:r>
+      <w:r>
+        <w:t>, wenn die PGFB und PG funktion nicht gebracuht wird kann PGFB auf 0V gelegt werden kann und PG Floating gelassen wird</w:t>
+      </w:r>
+      <w:r>
+        <w:t>.</w:t>
+      </w:r>
+    </w:p>
+    <w:p>
+      <w:r>
+        <w:t>Die selben eigenschaften gelten für LT3094.</w:t>
+      </w:r>
+    </w:p>
     <w:p/>
+    <w:p>
+      <w:r>
+        <w:t>Da der DAC und der ADC eine 5V „Analog“ versorgung brauchen wird aufgrund der guten eigenschaften und um das Development zu erleichtern auch ein LT3042 verwendet.</w:t>
+      </w:r>
+    </w:p>
     <w:p/>
-    <w:p/>
-    <w:p/>
+    <w:p>
+      <w:pPr>
+        <w:pStyle w:val="berschrift3"/>
+      </w:pPr>
+      <w:r>
+        <w:lastRenderedPageBreak/>
+        <w:t>TLV76733</w:t>
+      </w:r>
+    </w:p>
+    <w:p>
+      <w:r>
+        <w:rPr>
+          <w:noProof/>
+        </w:rPr>
+        <w:drawing>
+          <wp:inline distT="0" distB="0" distL="0" distR="0" wp14:anchorId="367A160F" wp14:editId="076DCC4F">
+            <wp:extent cx="5455199" cy="1681162"/>
+            <wp:effectExtent l="0" t="0" r="0" b="0"/>
+            <wp:docPr id="138422142" name="Grafik 1"/>
+            <wp:cNvGraphicFramePr>
+              <a:graphicFrameLocks xmlns:a="http://schemas.openxmlformats.org/drawingml/2006/main" noChangeAspect="1"/>
+            </wp:cNvGraphicFramePr>
+            <a:graphic xmlns:a="http://schemas.openxmlformats.org/drawingml/2006/main">
+              <a:graphicData uri="http://schemas.openxmlformats.org/drawingml/2006/picture">
+                <pic:pic xmlns:pic="http://schemas.openxmlformats.org/drawingml/2006/picture">
+                  <pic:nvPicPr>
+                    <pic:cNvPr id="0" name="Picture 1"/>
+                    <pic:cNvPicPr>
+                      <a:picLocks noChangeAspect="1" noChangeArrowheads="1"/>
+                    </pic:cNvPicPr>
+                  </pic:nvPicPr>
+                  <pic:blipFill rotWithShape="1">
+                    <a:blip r:embed="rId19">
+                      <a:extLst>
+                        <a:ext uri="{28A0092B-C50C-407E-A947-70E740481C1C}">
+                          <a14:useLocalDpi xmlns:a14="http://schemas.microsoft.com/office/drawing/2010/main" val="0"/>
+                        </a:ext>
+                      </a:extLst>
+                    </a:blip>
+                    <a:srcRect l="24725" t="45976" r="35820" b="36690"/>
+                    <a:stretch>
+                      <a:fillRect/>
+                    </a:stretch>
+                  </pic:blipFill>
+                  <pic:spPr bwMode="auto">
+                    <a:xfrm>
+                      <a:off x="0" y="0"/>
+                      <a:ext cx="5472991" cy="1686645"/>
+                    </a:xfrm>
+                    <a:prstGeom prst="rect">
+                      <a:avLst/>
+                    </a:prstGeom>
+                    <a:noFill/>
+                    <a:ln>
+                      <a:noFill/>
+                    </a:ln>
+                    <a:extLst>
+                      <a:ext uri="{53640926-AAD7-44D8-BBD7-CCE9431645EC}">
+                        <a14:shadowObscured xmlns:a14="http://schemas.microsoft.com/office/drawing/2010/main"/>
+                      </a:ext>
+                    </a:extLst>
+                  </pic:spPr>
+                </pic:pic>
+              </a:graphicData>
+            </a:graphic>
+          </wp:inline>
+        </w:drawing>
+      </w:r>
+    </w:p>
+    <w:p>
+      <w:r>
+        <w:t>Mit dem EN PIN kann die 3,3V Output angeschalten werden.</w:t>
+      </w:r>
+    </w:p>
     <w:p>
       <w:pPr>
         <w:pStyle w:val="berschrift1"/>
       </w:pPr>
       <w:r>
-        <w:lastRenderedPageBreak/>
         <w:t>Abschließende Bemerkungen</w:t>
       </w:r>
       <w:bookmarkEnd w:id="0"/>
@@ -6645,24 +4659,15 @@
           <w:rFonts w:eastAsia="TimesNewRomanPSMT"/>
           <w:i/>
         </w:rPr>
-        <w:t>ie BMKZ der verwendeten Geräte müssen mit den BMKZ in den Messschaltungen übereinstimmen</w:t>
-      </w:r>
-      <w:proofErr w:type="gramStart"/>
+        <w:t>ie BMKZ der verwendeten Geräte müssen mit den BMKZ in den Messschaltungen übereinstimmen!</w:t>
+      </w:r>
       <w:r>
         <w:rPr>
           <w:rFonts w:eastAsia="TimesNewRomanPSMT"/>
           <w:i/>
         </w:rPr>
-        <w:t>!</w:t>
-      </w:r>
-      <w:r>
-        <w:rPr>
-          <w:rFonts w:eastAsia="TimesNewRomanPSMT"/>
-          <w:i/>
-        </w:rPr>
         <w:t xml:space="preserve"> )</w:t>
       </w:r>
-      <w:proofErr w:type="gramEnd"/>
     </w:p>
     <w:p>
       <w:pPr>
@@ -7016,7 +5021,6 @@
       </w:rPr>
       <w:t xml:space="preserve">Messung und Analyse von </w:t>
     </w:r>
-    <w:proofErr w:type="spellStart"/>
     <w:r>
       <w:rPr>
         <w:i/>
@@ -7035,7 +5039,6 @@
       </w:rPr>
       <w:t>ttranistoren</w:t>
     </w:r>
-    <w:proofErr w:type="spellEnd"/>
   </w:p>
 </w:hdr>
 </file>

</xml_diff>